<commit_message>
T-0054: review fixes - the auto-replan path past a BLOCK, the in-flight stops, one table row per coming example (#454)
The guide now says how maxAutoReplans (off by default) lets autopilot
reject an out-of-rounds BLOCK round for a successor plan (never accepting
the BLOCK; auto-replan-cap stops it), and lists the --runner stops
in-flight and handover-elsewhere and the clear-inflight yes-only action.
The suite matches each coming example to one table row whose Ticket cell
names every id and whose Phrase cell is exactly the backticked phrase; new
must-fail case must_fail_coming_row_removed (removing the "A goal across
several tickets" row passed before). Guide rebuilt; build.py --check 0.

Claude-Session: https://claude.ai/code/session_01QLY3kk7DCXpucXGu3wSniW
</commit_message>
<xml_diff>
--- a/docs/guides/crew/crew-autopilot.docx
+++ b/docs/guides/crew/crew-autopilot.docx
@@ -2777,7 +2777,7 @@
       </w:r>
       <w:r>
         <w:rPr/>
-        <w:t>: review findings with any BLOCK, or a round the ledger's guarded accept refuses. A BLOCK is never accepted by autopilot, at any setting.</w:t>
+        <w:t>: review findings with any BLOCK, or a round the ledger's guarded accept refuses. A BLOCK is never accepted by autopilot, at any setting. The one way past a BLOCK without you is a new plan, and it is off by default: see "Review" below.</w:t>
       </w:r>
     </w:p>
     <w:p>
@@ -2927,17 +2927,251 @@
       </w:r>
       <w:r>
         <w:rPr/>
+        <w:t xml:space="preserve">, plus, when it runs with </w:t>
+      </w:r>
+      <w:r>
+        <w:rPr>
+          <w:rStyle w:val="SourceText"/>
+        </w:rPr>
+        <w:t>--runner</w:t>
+      </w:r>
+      <w:r>
+        <w:rPr/>
+        <w:t xml:space="preserve">, </w:t>
+      </w:r>
+      <w:r>
+        <w:rPr>
+          <w:rStyle w:val="SourceText"/>
+        </w:rPr>
+        <w:t>in-flight</w:t>
+      </w:r>
+      <w:r>
+        <w:rPr/>
+        <w:t xml:space="preserve"> (another runner holds the ticket here, or its marker is stale or unreadable) and </w:t>
+      </w:r>
+      <w:r>
+        <w:rPr>
+          <w:rStyle w:val="SourceText"/>
+        </w:rPr>
+        <w:t>handover-elsewhere</w:t>
+      </w:r>
+      <w:r>
+        <w:rPr/>
+        <w:t xml:space="preserve"> (a live holder drives it from another worktree). </w:t>
+      </w:r>
+      <w:r>
+        <w:rPr>
+          <w:rStyle w:val="SourceText"/>
+        </w:rPr>
+        <w:t>crew_autopilot.py stops --root .</w:t>
+      </w:r>
+      <w:r>
+        <w:rPr/>
+        <w:t xml:space="preserve"> lists them from the code.</w:t>
+      </w:r>
+    </w:p>
+    <w:p>
+      <w:pPr>
+        <w:pStyle w:val="BodyText"/>
+        <w:bidi w:val="0"/>
+        <w:jc w:val="left"/>
+        <w:rPr/>
+      </w:pPr>
+      <w:r>
+        <w:rPr>
+          <w:rStyle w:val="Strong"/>
+        </w:rPr>
+        <w:t>Never without an explicit yes.</w:t>
+      </w:r>
+      <w:r>
+        <w:rPr/>
+        <w:t xml:space="preserve"> Offboarding a role (</w:t>
+      </w:r>
+      <w:r>
+        <w:rPr>
+          <w:rStyle w:val="SourceText"/>
+        </w:rPr>
+        <w:t>offboard-role</w:t>
+      </w:r>
+      <w:r>
+        <w:rPr/>
+        <w:t>), deleting a code map or diagram (</w:t>
+      </w:r>
+      <w:r>
+        <w:rPr>
+          <w:rStyle w:val="SourceText"/>
+        </w:rPr>
+        <w:t>delete-map</w:t>
+      </w:r>
+      <w:r>
+        <w:rPr/>
+        <w:t>), rewriting the repository's crew metrics file (</w:t>
+      </w:r>
+      <w:r>
+        <w:rPr>
+          <w:rStyle w:val="SourceText"/>
+        </w:rPr>
+        <w:t>rewrite-metrics</w:t>
+      </w:r>
+      <w:r>
+        <w:rPr/>
+        <w:t>), and any force-push, branch delete, history rewrite or removal of a tracked file (</w:t>
+      </w:r>
+      <w:r>
+        <w:rPr>
+          <w:rStyle w:val="SourceText"/>
+        </w:rPr>
+        <w:t>git-destruction</w:t>
+      </w:r>
+      <w:r>
+        <w:rPr/>
+        <w:t>), and clearing another runner's in-flight marker (</w:t>
+      </w:r>
+      <w:r>
+        <w:rPr>
+          <w:rStyle w:val="SourceText"/>
+        </w:rPr>
+        <w:t>clear-inflight</w:t>
+      </w:r>
+      <w:r>
+        <w:rPr/>
+        <w:t>).</w:t>
+      </w:r>
+    </w:p>
+    <w:p>
+      <w:pPr>
+        <w:pStyle w:val="BodyText"/>
+        <w:bidi w:val="0"/>
+        <w:jc w:val="left"/>
+        <w:rPr/>
+      </w:pPr>
+      <w:r>
+        <w:rPr>
+          <w:rStyle w:val="Strong"/>
+        </w:rPr>
+        <w:t>Deploys.</w:t>
+      </w:r>
+      <w:r>
+        <w:rPr/>
+        <w:t xml:space="preserve"> </w:t>
+      </w:r>
+      <w:r>
+        <w:rPr>
+          <w:rStyle w:val="SourceText"/>
+        </w:rPr>
+        <w:t>autopilot.deploy</w:t>
+      </w:r>
+      <w:r>
+        <w:rPr/>
+        <w:t xml:space="preserve"> is </w:t>
+      </w:r>
+      <w:r>
+        <w:rPr>
+          <w:rStyle w:val="SourceText"/>
+        </w:rPr>
+        <w:t>none</w:t>
+      </w:r>
+      <w:r>
+        <w:rPr/>
+        <w:t xml:space="preserve"> (default), </w:t>
+      </w:r>
+      <w:r>
+        <w:rPr>
+          <w:rStyle w:val="SourceText"/>
+        </w:rPr>
+        <w:t>nonprod</w:t>
+      </w:r>
+      <w:r>
+        <w:rPr/>
+        <w:t xml:space="preserve"> or </w:t>
+      </w:r>
+      <w:r>
+        <w:rPr>
+          <w:rStyle w:val="SourceText"/>
+        </w:rPr>
+        <w:t>all</w:t>
+      </w:r>
+      <w:r>
+        <w:rPr/>
+        <w:t xml:space="preserve">. Production needs </w:t>
+      </w:r>
+      <w:r>
+        <w:rPr>
+          <w:rStyle w:val="SourceText"/>
+        </w:rPr>
+        <w:t>all</w:t>
+      </w:r>
+      <w:r>
+        <w:rPr/>
+        <w:t xml:space="preserve"> </w:t>
+      </w:r>
+      <w:r>
+        <w:rPr>
+          <w:rStyle w:val="Strong"/>
+        </w:rPr>
+        <w:t>and</w:t>
+      </w:r>
+      <w:r>
+        <w:rPr/>
+        <w:t xml:space="preserve"> </w:t>
+      </w:r>
+      <w:r>
+        <w:rPr>
+          <w:rStyle w:val="SourceText"/>
+        </w:rPr>
+        <w:t>environments.prodUnattended: true</w:t>
+      </w:r>
+      <w:r>
+        <w:rPr/>
+        <w:t xml:space="preserve"> in both config layers, with the cloud guard in </w:t>
+      </w:r>
+      <w:r>
+        <w:rPr>
+          <w:rStyle w:val="SourceText"/>
+        </w:rPr>
+        <w:t>block</w:t>
+      </w:r>
+      <w:r>
+        <w:rPr/>
         <w:t xml:space="preserve">. </w:t>
       </w:r>
       <w:r>
         <w:rPr>
           <w:rStyle w:val="SourceText"/>
         </w:rPr>
-        <w:t>crew_autopilot.py stops --root .</w:t>
-      </w:r>
-      <w:r>
-        <w:rPr/>
-        <w:t xml:space="preserve"> lists them from the code.</w:t>
+        <w:t>crew_autopilot.py deploy-allowed</w:t>
+      </w:r>
+      <w:r>
+        <w:rPr/>
+        <w:t xml:space="preserve"> answers for one environment:</w:t>
+      </w:r>
+    </w:p>
+    <w:p>
+      <w:pPr>
+        <w:pStyle w:val="PreformattedText"/>
+        <w:bidi w:val="0"/>
+        <w:jc w:val="left"/>
+        <w:rPr/>
+      </w:pPr>
+      <w:r>
+        <w:rPr>
+          <w:rStyle w:val="SourceText"/>
+        </w:rPr>
+        <w:t>verdict=allow env=staging class=nonProd reason=autopilot.deploy=nonprod allows nonProd</w:t>
+      </w:r>
+    </w:p>
+    <w:p>
+      <w:pPr>
+        <w:pStyle w:val="PreformattedText"/>
+        <w:bidi w:val="0"/>
+        <w:jc w:val="left"/>
+        <w:rPr/>
+      </w:pPr>
+      <w:r>
+        <w:rPr>
+          <w:rStyle w:val="SourceText"/>
+        </w:rPr>
+        <w:t>verdict=ask env=prod class=prod reason=autopilot.deploy is nonprod; production needs all</w:t>
       </w:r>
     </w:p>
     <w:p>
@@ -2948,54 +3182,56 @@
         <w:rPr/>
       </w:pPr>
       <w:r>
+        <w:rPr/>
+        <w:t xml:space="preserve">Nothing in this crew version dispatches a deploy itself; </w:t>
+      </w:r>
+      <w:r>
+        <w:rPr>
+          <w:rStyle w:val="SourceText"/>
+        </w:rPr>
+        <w:t>settings</w:t>
+      </w:r>
+      <w:r>
+        <w:rPr/>
+        <w:t xml:space="preserve"> warns you of that when the key is not </w:t>
+      </w:r>
+      <w:r>
+        <w:rPr>
+          <w:rStyle w:val="SourceText"/>
+        </w:rPr>
+        <w:t>none</w:t>
+      </w:r>
+      <w:r>
+        <w:rPr/>
+        <w:t>.</w:t>
+      </w:r>
+    </w:p>
+    <w:p>
+      <w:pPr>
+        <w:pStyle w:val="BodyText"/>
+        <w:bidi w:val="0"/>
+        <w:jc w:val="left"/>
+        <w:rPr/>
+      </w:pPr>
+      <w:r>
         <w:rPr>
           <w:rStyle w:val="Strong"/>
         </w:rPr>
-        <w:t>Never without an explicit yes.</w:t>
-      </w:r>
-      <w:r>
-        <w:rPr/>
-        <w:t xml:space="preserve"> Offboarding a role (</w:t>
-      </w:r>
-      <w:r>
-        <w:rPr>
-          <w:rStyle w:val="SourceText"/>
-        </w:rPr>
-        <w:t>offboard-role</w:t>
-      </w:r>
-      <w:r>
-        <w:rPr/>
-        <w:t>), deleting a code map or diagram (</w:t>
-      </w:r>
-      <w:r>
-        <w:rPr>
-          <w:rStyle w:val="SourceText"/>
-        </w:rPr>
-        <w:t>delete-map</w:t>
-      </w:r>
-      <w:r>
-        <w:rPr/>
-        <w:t>), rewriting the repository's crew metrics file (</w:t>
-      </w:r>
-      <w:r>
-        <w:rPr>
-          <w:rStyle w:val="SourceText"/>
-        </w:rPr>
-        <w:t>rewrite-metrics</w:t>
-      </w:r>
-      <w:r>
-        <w:rPr/>
-        <w:t>), and any force-push, branch delete, history rewrite or removal of a tracked file (</w:t>
-      </w:r>
-      <w:r>
-        <w:rPr>
-          <w:rStyle w:val="SourceText"/>
-        </w:rPr>
-        <w:t>git-destruction</w:t>
-      </w:r>
-      <w:r>
-        <w:rPr/>
-        <w:t>).</w:t>
+        <w:t>Being told it stopped.</w:t>
+      </w:r>
+      <w:r>
+        <w:rPr/>
+        <w:t xml:space="preserve"> With crew's notifications configured (Telegram or Teams, in the machine-global config), a ping is sent when Claude Code stops and waits on you, led by a subject such as </w:t>
+      </w:r>
+      <w:r>
+        <w:rPr>
+          <w:rStyle w:val="SourceText"/>
+        </w:rPr>
+        <w:t>Question</w:t>
+      </w:r>
+      <w:r>
+        <w:rPr/>
+        <w:t xml:space="preserve"> and naming the ticket and what it waits on; there is no ping per phase.</w:t>
       </w:r>
     </w:p>
     <w:p>
@@ -3009,237 +3245,111 @@
         <w:rPr>
           <w:rStyle w:val="Strong"/>
         </w:rPr>
-        <w:t>Deploys.</w:t>
-      </w:r>
-      <w:r>
-        <w:rPr/>
-        <w:t xml:space="preserve"> </w:t>
-      </w:r>
-      <w:r>
-        <w:rPr>
-          <w:rStyle w:val="SourceText"/>
-        </w:rPr>
-        <w:t>autopilot.deploy</w:t>
-      </w:r>
-      <w:r>
-        <w:rPr/>
-        <w:t xml:space="preserve"> is </w:t>
-      </w:r>
-      <w:r>
-        <w:rPr>
-          <w:rStyle w:val="SourceText"/>
-        </w:rPr>
-        <w:t>none</w:t>
-      </w:r>
-      <w:r>
-        <w:rPr/>
-        <w:t xml:space="preserve"> (default), </w:t>
-      </w:r>
-      <w:r>
-        <w:rPr>
-          <w:rStyle w:val="SourceText"/>
-        </w:rPr>
-        <w:t>nonprod</w:t>
-      </w:r>
-      <w:r>
-        <w:rPr/>
-        <w:t xml:space="preserve"> or </w:t>
-      </w:r>
-      <w:r>
-        <w:rPr>
-          <w:rStyle w:val="SourceText"/>
-        </w:rPr>
-        <w:t>all</w:t>
-      </w:r>
-      <w:r>
-        <w:rPr/>
-        <w:t xml:space="preserve">. Production needs </w:t>
-      </w:r>
-      <w:r>
-        <w:rPr>
-          <w:rStyle w:val="SourceText"/>
-        </w:rPr>
-        <w:t>all</w:t>
-      </w:r>
-      <w:r>
-        <w:rPr/>
-        <w:t xml:space="preserve"> </w:t>
-      </w:r>
-      <w:r>
-        <w:rPr>
-          <w:rStyle w:val="Strong"/>
-        </w:rPr>
-        <w:t>and</w:t>
-      </w:r>
-      <w:r>
-        <w:rPr/>
-        <w:t xml:space="preserve"> </w:t>
-      </w:r>
-      <w:r>
-        <w:rPr>
-          <w:rStyle w:val="SourceText"/>
-        </w:rPr>
-        <w:t>environments.prodUnattended: true</w:t>
-      </w:r>
-      <w:r>
-        <w:rPr/>
-        <w:t xml:space="preserve"> in both config layers, with the cloud guard in </w:t>
-      </w:r>
-      <w:r>
-        <w:rPr>
-          <w:rStyle w:val="SourceText"/>
-        </w:rPr>
-        <w:t>block</w:t>
-      </w:r>
-      <w:r>
-        <w:rPr/>
-        <w:t xml:space="preserve">. </w:t>
-      </w:r>
-      <w:r>
-        <w:rPr>
-          <w:rStyle w:val="SourceText"/>
-        </w:rPr>
-        <w:t>crew_autopilot.py deploy-allowed</w:t>
-      </w:r>
-      <w:r>
-        <w:rPr/>
-        <w:t xml:space="preserve"> answers for one environment:</w:t>
-      </w:r>
-    </w:p>
-    <w:p>
-      <w:pPr>
-        <w:pStyle w:val="PreformattedText"/>
-        <w:bidi w:val="0"/>
-        <w:jc w:val="left"/>
-        <w:rPr/>
-      </w:pPr>
-      <w:r>
-        <w:rPr>
-          <w:rStyle w:val="SourceText"/>
-        </w:rPr>
-        <w:t>verdict=allow env=staging class=nonProd reason=autopilot.deploy=nonprod allows nonProd</w:t>
-      </w:r>
-    </w:p>
-    <w:p>
-      <w:pPr>
-        <w:pStyle w:val="PreformattedText"/>
-        <w:bidi w:val="0"/>
-        <w:jc w:val="left"/>
-        <w:rPr/>
-      </w:pPr>
-      <w:r>
-        <w:rPr>
-          <w:rStyle w:val="SourceText"/>
-        </w:rPr>
-        <w:t>verdict=ask env=prod class=prod reason=autopilot.deploy is nonprod; production needs all</w:t>
-      </w:r>
-    </w:p>
-    <w:p>
-      <w:pPr>
-        <w:pStyle w:val="BodyText"/>
-        <w:bidi w:val="0"/>
-        <w:jc w:val="left"/>
-        <w:rPr/>
-      </w:pPr>
-      <w:r>
-        <w:rPr/>
-        <w:t xml:space="preserve">Nothing in this crew version dispatches a deploy itself; </w:t>
-      </w:r>
-      <w:r>
-        <w:rPr>
-          <w:rStyle w:val="SourceText"/>
-        </w:rPr>
-        <w:t>settings</w:t>
-      </w:r>
-      <w:r>
-        <w:rPr/>
-        <w:t xml:space="preserve"> warns you of that when the key is not </w:t>
-      </w:r>
-      <w:r>
-        <w:rPr>
-          <w:rStyle w:val="SourceText"/>
-        </w:rPr>
-        <w:t>none</w:t>
+        <w:t>Review.</w:t>
+      </w:r>
+      <w:r>
+        <w:rPr/>
+        <w:t xml:space="preserve"> A review phase ends at its verdict: autopilot reports the BLOCK and FIX lines verbatim and goes back to </w:t>
+      </w:r>
+      <w:r>
+        <w:rPr>
+          <w:rStyle w:val="SourceText"/>
+        </w:rPr>
+        <w:t>next</w:t>
+      </w:r>
+      <w:r>
+        <w:rPr/>
+        <w:t xml:space="preserve">. Fixing, accepting and replying on the PR are yours, with two exceptions. After the ledger says </w:t>
+      </w:r>
+      <w:r>
+        <w:rPr>
+          <w:rStyle w:val="SourceText"/>
+        </w:rPr>
+        <w:t>review: auto-accept: eligible</w:t>
+      </w:r>
+      <w:r>
+        <w:rPr/>
+        <w:t xml:space="preserve"> on a final round with no BLOCK, autopilot runs </w:t>
+      </w:r>
+      <w:r>
+        <w:rPr>
+          <w:rStyle w:val="SourceText"/>
+        </w:rPr>
+        <w:t>review_ledger.py --auto-accept</w:t>
+      </w:r>
+      <w:r>
+        <w:rPr/>
+        <w:t xml:space="preserve">, the guarded accept that refuses anything it cannot read cleanly. And with </w:t>
+      </w:r>
+      <w:r>
+        <w:rPr>
+          <w:rStyle w:val="SourceText"/>
+        </w:rPr>
+        <w:t>autopilot.maxAutoReplans</w:t>
+      </w:r>
+      <w:r>
+        <w:rPr/>
+        <w:t xml:space="preserve"> at 1 or more (default 0, off), a final round with a BLOCK that has no review round left can be rejected by autopilot itself (</w:t>
+      </w:r>
+      <w:r>
+        <w:rPr>
+          <w:rStyle w:val="SourceText"/>
+        </w:rPr>
+        <w:t>crew_autopilot.py auto-reject</w:t>
+      </w:r>
+      <w:r>
+        <w:rPr/>
+        <w:t xml:space="preserve">, which prints an </w:t>
+      </w:r>
+      <w:r>
+        <w:rPr>
+          <w:rStyle w:val="SourceText"/>
+        </w:rPr>
+        <w:t>auto-rejected</w:t>
+      </w:r>
+      <w:r>
+        <w:rPr/>
+        <w:t xml:space="preserve"> line and every BLOCK and FIX line): </w:t>
+      </w:r>
+      <w:r>
+        <w:rPr>
+          <w:rStyle w:val="SourceText"/>
+        </w:rPr>
+        <w:t>/crew:plan</w:t>
+      </w:r>
+      <w:r>
+        <w:rPr/>
+        <w:t xml:space="preserve"> then writes a successor plan that quotes each of them, and the approve phase decides it under </w:t>
+      </w:r>
+      <w:r>
+        <w:rPr>
+          <w:rStyle w:val="SourceText"/>
+        </w:rPr>
+        <w:t>autopilot.approval</w:t>
+      </w:r>
+      <w:r>
+        <w:rPr/>
+        <w:t xml:space="preserve">. The BLOCK is never accepted; once </w:t>
+      </w:r>
+      <w:r>
+        <w:rPr>
+          <w:rStyle w:val="SourceText"/>
+        </w:rPr>
+        <w:t>maxAutoReplans</w:t>
+      </w:r>
+      <w:r>
+        <w:rPr/>
+        <w:t xml:space="preserve"> successor plans are on the ledger, autopilot stops at </w:t>
+      </w:r>
+      <w:r>
+        <w:rPr>
+          <w:rStyle w:val="SourceText"/>
+        </w:rPr>
+        <w:t>auto-replan-cap</w:t>
       </w:r>
       <w:r>
         <w:rPr/>
         <w:t>.</w:t>
-      </w:r>
-    </w:p>
-    <w:p>
-      <w:pPr>
-        <w:pStyle w:val="BodyText"/>
-        <w:bidi w:val="0"/>
-        <w:jc w:val="left"/>
-        <w:rPr/>
-      </w:pPr>
-      <w:r>
-        <w:rPr>
-          <w:rStyle w:val="Strong"/>
-        </w:rPr>
-        <w:t>Being told it stopped.</w:t>
-      </w:r>
-      <w:r>
-        <w:rPr/>
-        <w:t xml:space="preserve"> With crew's notifications configured (Telegram or Teams, in the machine-global config), a ping is sent when Claude Code stops and waits on you, led by a subject such as </w:t>
-      </w:r>
-      <w:r>
-        <w:rPr>
-          <w:rStyle w:val="SourceText"/>
-        </w:rPr>
-        <w:t>Question</w:t>
-      </w:r>
-      <w:r>
-        <w:rPr/>
-        <w:t xml:space="preserve"> and naming the ticket and what it waits on; there is no ping per phase.</w:t>
-      </w:r>
-    </w:p>
-    <w:p>
-      <w:pPr>
-        <w:pStyle w:val="BodyText"/>
-        <w:bidi w:val="0"/>
-        <w:jc w:val="left"/>
-        <w:rPr/>
-      </w:pPr>
-      <w:r>
-        <w:rPr>
-          <w:rStyle w:val="Strong"/>
-        </w:rPr>
-        <w:t>Review.</w:t>
-      </w:r>
-      <w:r>
-        <w:rPr/>
-        <w:t xml:space="preserve"> A review phase ends at its verdict: autopilot reports the BLOCK and FIX lines verbatim and goes back to </w:t>
-      </w:r>
-      <w:r>
-        <w:rPr>
-          <w:rStyle w:val="SourceText"/>
-        </w:rPr>
-        <w:t>next</w:t>
-      </w:r>
-      <w:r>
-        <w:rPr/>
-        <w:t xml:space="preserve">. Fixing, accepting and replying on the PR are yours. One exception: after the ledger says </w:t>
-      </w:r>
-      <w:r>
-        <w:rPr>
-          <w:rStyle w:val="SourceText"/>
-        </w:rPr>
-        <w:t>review: auto-accept: eligible</w:t>
-      </w:r>
-      <w:r>
-        <w:rPr/>
-        <w:t xml:space="preserve"> on a final round with no BLOCK, autopilot runs </w:t>
-      </w:r>
-      <w:r>
-        <w:rPr>
-          <w:rStyle w:val="SourceText"/>
-        </w:rPr>
-        <w:t>review_ledger.py --auto-accept</w:t>
-      </w:r>
-      <w:r>
-        <w:rPr/>
-        <w:t>, the guarded accept that refuses anything it cannot read cleanly.</w:t>
       </w:r>
     </w:p>
     <w:p>

</xml_diff>

<commit_message>
L-0727: ADRs 0007/0008, wave docs, verify.json, autopilot.md section 7
</commit_message>
<xml_diff>
--- a/docs/guides/crew/crew-autopilot.docx
+++ b/docs/guides/crew/crew-autopilot.docx
@@ -1,6 +1,6 @@
 
 <file path=word/document.xml><?xml version="1.0" encoding="utf-8"?>
-<w:document xmlns:o="urn:schemas-microsoft-com:office:office" xmlns:r="http://schemas.openxmlformats.org/officeDocument/2006/relationships" xmlns:v="urn:schemas-microsoft-com:vml" xmlns:w="http://schemas.openxmlformats.org/wordprocessingml/2006/main" xmlns:w10="urn:schemas-microsoft-com:office:word" xmlns:wp="http://schemas.openxmlformats.org/drawingml/2006/wordprocessingDrawing" xmlns:wps="http://schemas.microsoft.com/office/word/2010/wordprocessingShape" xmlns:wpg="http://schemas.microsoft.com/office/word/2010/wordprocessingGroup" xmlns:mc="http://schemas.openxmlformats.org/markup-compatibility/2006" xmlns:wp14="http://schemas.microsoft.com/office/word/2010/wordprocessingDrawing" xmlns:w14="http://schemas.microsoft.com/office/word/2010/wordml" xmlns:w15="http://schemas.microsoft.com/office/word/2012/wordml" mc:Ignorable="w14 wp14 w15">
+<w:document xmlns:o="urn:schemas-microsoft-com:office:office" xmlns:r="http://schemas.openxmlformats.org/officeDocument/2006/relationships" xmlns:v="urn:schemas-microsoft-com:vml" xmlns:w="http://schemas.openxmlformats.org/wordprocessingml/2006/main" xmlns:w10="urn:schemas-microsoft-com:office:word" xmlns:wp="http://schemas.openxmlformats.org/drawingml/2006/wordprocessingDrawing" xmlns:pic="http://schemas.openxmlformats.org/drawingml/2006/picture" xmlns:wps="http://schemas.microsoft.com/office/word/2010/wordprocessingShape" xmlns:wpg="http://schemas.microsoft.com/office/word/2010/wordprocessingGroup" xmlns:mc="http://schemas.openxmlformats.org/markup-compatibility/2006" xmlns:wp14="http://schemas.microsoft.com/office/word/2010/wordprocessingDrawing" xmlns:w14="http://schemas.microsoft.com/office/word/2010/wordml" xmlns:w15="http://schemas.microsoft.com/office/word/2012/wordml" mc:Ignorable="w14 wp14 w15">
   <w:body>
     <w:p>
       <w:pPr>
@@ -607,9 +607,9 @@
     </w:p>
     <w:tbl>
       <w:tblPr>
-        <w:tblW w:w="6183" w:type="dxa"/>
-        <w:jc w:val="left"/>
-        <w:tblInd w:w="0" w:type="dxa"/>
+        <w:tblW w:w="10793" w:type="dxa"/>
+        <w:jc w:val="left"/>
+        <w:tblInd w:w="28" w:type="dxa"/>
         <w:tblLayout w:type="fixed"/>
         <w:tblCellMar>
           <w:top w:w="28" w:type="dxa"/>
@@ -619,8 +619,8 @@
         </w:tblCellMar>
       </w:tblPr>
       <w:tblGrid>
-        <w:gridCol w:w="3154"/>
-        <w:gridCol w:w="3029"/>
+        <w:gridCol w:w="5745"/>
+        <w:gridCol w:w="5048"/>
       </w:tblGrid>
       <w:tr>
         <w:trPr>
@@ -628,7 +628,7 @@
         </w:trPr>
         <w:tc>
           <w:tcPr>
-            <w:tcW w:w="3154" w:type="dxa"/>
+            <w:tcW w:w="5745" w:type="dxa"/>
             <w:tcBorders/>
             <w:vAlign w:val="center"/>
           </w:tcPr>
@@ -650,7 +650,7 @@
         </w:tc>
         <w:tc>
           <w:tcPr>
-            <w:tcW w:w="3029" w:type="dxa"/>
+            <w:tcW w:w="5048" w:type="dxa"/>
             <w:tcBorders/>
             <w:vAlign w:val="center"/>
           </w:tcPr>
@@ -675,7 +675,7 @@
         <w:trPr/>
         <w:tc>
           <w:tcPr>
-            <w:tcW w:w="3154" w:type="dxa"/>
+            <w:tcW w:w="5745" w:type="dxa"/>
             <w:tcBorders/>
             <w:vAlign w:val="center"/>
           </w:tcPr>
@@ -698,7 +698,7 @@
         </w:tc>
         <w:tc>
           <w:tcPr>
-            <w:tcW w:w="3029" w:type="dxa"/>
+            <w:tcW w:w="5048" w:type="dxa"/>
             <w:tcBorders/>
             <w:vAlign w:val="center"/>
           </w:tcPr>
@@ -722,7 +722,7 @@
         <w:trPr/>
         <w:tc>
           <w:tcPr>
-            <w:tcW w:w="3154" w:type="dxa"/>
+            <w:tcW w:w="5745" w:type="dxa"/>
             <w:tcBorders/>
             <w:vAlign w:val="center"/>
           </w:tcPr>
@@ -755,7 +755,7 @@
         </w:tc>
         <w:tc>
           <w:tcPr>
-            <w:tcW w:w="3029" w:type="dxa"/>
+            <w:tcW w:w="5048" w:type="dxa"/>
             <w:tcBorders/>
             <w:vAlign w:val="center"/>
           </w:tcPr>
@@ -779,7 +779,7 @@
         <w:trPr/>
         <w:tc>
           <w:tcPr>
-            <w:tcW w:w="3154" w:type="dxa"/>
+            <w:tcW w:w="5745" w:type="dxa"/>
             <w:tcBorders/>
             <w:vAlign w:val="center"/>
           </w:tcPr>
@@ -802,7 +802,7 @@
         </w:tc>
         <w:tc>
           <w:tcPr>
-            <w:tcW w:w="3029" w:type="dxa"/>
+            <w:tcW w:w="5048" w:type="dxa"/>
             <w:tcBorders/>
             <w:vAlign w:val="center"/>
           </w:tcPr>
@@ -1135,9 +1135,9 @@
     </w:p>
     <w:tbl>
       <w:tblPr>
-        <w:tblW w:w="6183" w:type="dxa"/>
-        <w:jc w:val="left"/>
-        <w:tblInd w:w="0" w:type="dxa"/>
+        <w:tblW w:w="9556" w:type="dxa"/>
+        <w:jc w:val="left"/>
+        <w:tblInd w:w="28" w:type="dxa"/>
         <w:tblLayout w:type="fixed"/>
         <w:tblCellMar>
           <w:top w:w="28" w:type="dxa"/>
@@ -1147,8 +1147,8 @@
         </w:tblCellMar>
       </w:tblPr>
       <w:tblGrid>
-        <w:gridCol w:w="1391"/>
-        <w:gridCol w:w="4792"/>
+        <w:gridCol w:w="1765"/>
+        <w:gridCol w:w="7791"/>
       </w:tblGrid>
       <w:tr>
         <w:trPr>
@@ -1156,7 +1156,7 @@
         </w:trPr>
         <w:tc>
           <w:tcPr>
-            <w:tcW w:w="1391" w:type="dxa"/>
+            <w:tcW w:w="1765" w:type="dxa"/>
             <w:tcBorders/>
             <w:vAlign w:val="center"/>
           </w:tcPr>
@@ -1178,7 +1178,7 @@
         </w:tc>
         <w:tc>
           <w:tcPr>
-            <w:tcW w:w="4792" w:type="dxa"/>
+            <w:tcW w:w="7791" w:type="dxa"/>
             <w:tcBorders/>
             <w:vAlign w:val="center"/>
           </w:tcPr>
@@ -1203,7 +1203,7 @@
         <w:trPr/>
         <w:tc>
           <w:tcPr>
-            <w:tcW w:w="1391" w:type="dxa"/>
+            <w:tcW w:w="1765" w:type="dxa"/>
             <w:tcBorders/>
             <w:vAlign w:val="center"/>
           </w:tcPr>
@@ -1226,7 +1226,7 @@
         </w:tc>
         <w:tc>
           <w:tcPr>
-            <w:tcW w:w="4792" w:type="dxa"/>
+            <w:tcW w:w="7791" w:type="dxa"/>
             <w:tcBorders/>
             <w:vAlign w:val="center"/>
           </w:tcPr>
@@ -1250,7 +1250,7 @@
         <w:trPr/>
         <w:tc>
           <w:tcPr>
-            <w:tcW w:w="1391" w:type="dxa"/>
+            <w:tcW w:w="1765" w:type="dxa"/>
             <w:tcBorders/>
             <w:vAlign w:val="center"/>
           </w:tcPr>
@@ -1273,7 +1273,7 @@
         </w:tc>
         <w:tc>
           <w:tcPr>
-            <w:tcW w:w="4792" w:type="dxa"/>
+            <w:tcW w:w="7791" w:type="dxa"/>
             <w:tcBorders/>
             <w:vAlign w:val="center"/>
           </w:tcPr>
@@ -1297,7 +1297,7 @@
         <w:trPr/>
         <w:tc>
           <w:tcPr>
-            <w:tcW w:w="1391" w:type="dxa"/>
+            <w:tcW w:w="1765" w:type="dxa"/>
             <w:tcBorders/>
             <w:vAlign w:val="center"/>
           </w:tcPr>
@@ -1320,7 +1320,7 @@
         </w:tc>
         <w:tc>
           <w:tcPr>
-            <w:tcW w:w="4792" w:type="dxa"/>
+            <w:tcW w:w="7791" w:type="dxa"/>
             <w:tcBorders/>
             <w:vAlign w:val="center"/>
           </w:tcPr>
@@ -1354,7 +1354,7 @@
         <w:trPr/>
         <w:tc>
           <w:tcPr>
-            <w:tcW w:w="1391" w:type="dxa"/>
+            <w:tcW w:w="1765" w:type="dxa"/>
             <w:tcBorders/>
             <w:vAlign w:val="center"/>
           </w:tcPr>
@@ -1377,7 +1377,7 @@
         </w:tc>
         <w:tc>
           <w:tcPr>
-            <w:tcW w:w="4792" w:type="dxa"/>
+            <w:tcW w:w="7791" w:type="dxa"/>
             <w:tcBorders/>
             <w:vAlign w:val="center"/>
           </w:tcPr>
@@ -1421,7 +1421,7 @@
         <w:trPr/>
         <w:tc>
           <w:tcPr>
-            <w:tcW w:w="1391" w:type="dxa"/>
+            <w:tcW w:w="1765" w:type="dxa"/>
             <w:tcBorders/>
             <w:vAlign w:val="center"/>
           </w:tcPr>
@@ -1444,7 +1444,7 @@
         </w:tc>
         <w:tc>
           <w:tcPr>
-            <w:tcW w:w="4792" w:type="dxa"/>
+            <w:tcW w:w="7791" w:type="dxa"/>
             <w:tcBorders/>
             <w:vAlign w:val="center"/>
           </w:tcPr>
@@ -1468,7 +1468,7 @@
         <w:trPr/>
         <w:tc>
           <w:tcPr>
-            <w:tcW w:w="1391" w:type="dxa"/>
+            <w:tcW w:w="1765" w:type="dxa"/>
             <w:tcBorders/>
             <w:vAlign w:val="center"/>
           </w:tcPr>
@@ -1491,7 +1491,7 @@
         </w:tc>
         <w:tc>
           <w:tcPr>
-            <w:tcW w:w="4792" w:type="dxa"/>
+            <w:tcW w:w="7791" w:type="dxa"/>
             <w:tcBorders/>
             <w:vAlign w:val="center"/>
           </w:tcPr>
@@ -1515,7 +1515,7 @@
         <w:trPr/>
         <w:tc>
           <w:tcPr>
-            <w:tcW w:w="1391" w:type="dxa"/>
+            <w:tcW w:w="1765" w:type="dxa"/>
             <w:tcBorders/>
             <w:vAlign w:val="center"/>
           </w:tcPr>
@@ -1538,7 +1538,7 @@
         </w:tc>
         <w:tc>
           <w:tcPr>
-            <w:tcW w:w="4792" w:type="dxa"/>
+            <w:tcW w:w="7791" w:type="dxa"/>
             <w:tcBorders/>
             <w:vAlign w:val="center"/>
           </w:tcPr>
@@ -2145,9 +2145,9 @@
     </w:p>
     <w:tbl>
       <w:tblPr>
-        <w:tblW w:w="6183" w:type="dxa"/>
-        <w:jc w:val="left"/>
-        <w:tblInd w:w="0" w:type="dxa"/>
+        <w:tblW w:w="11339" w:type="dxa"/>
+        <w:jc w:val="left"/>
+        <w:tblInd w:w="28" w:type="dxa"/>
         <w:tblLayout w:type="fixed"/>
         <w:tblCellMar>
           <w:top w:w="28" w:type="dxa"/>
@@ -2157,9 +2157,9 @@
         </w:tblCellMar>
       </w:tblPr>
       <w:tblGrid>
-        <w:gridCol w:w="1232"/>
-        <w:gridCol w:w="2461"/>
-        <w:gridCol w:w="2490"/>
+        <w:gridCol w:w="1544"/>
+        <w:gridCol w:w="5677"/>
+        <w:gridCol w:w="4118"/>
       </w:tblGrid>
       <w:tr>
         <w:trPr>
@@ -2167,7 +2167,7 @@
         </w:trPr>
         <w:tc>
           <w:tcPr>
-            <w:tcW w:w="1232" w:type="dxa"/>
+            <w:tcW w:w="1544" w:type="dxa"/>
             <w:tcBorders/>
             <w:vAlign w:val="center"/>
           </w:tcPr>
@@ -2189,7 +2189,7 @@
         </w:tc>
         <w:tc>
           <w:tcPr>
-            <w:tcW w:w="2461" w:type="dxa"/>
+            <w:tcW w:w="5677" w:type="dxa"/>
             <w:tcBorders/>
             <w:vAlign w:val="center"/>
           </w:tcPr>
@@ -2211,7 +2211,7 @@
         </w:tc>
         <w:tc>
           <w:tcPr>
-            <w:tcW w:w="2490" w:type="dxa"/>
+            <w:tcW w:w="4118" w:type="dxa"/>
             <w:tcBorders/>
             <w:vAlign w:val="center"/>
           </w:tcPr>
@@ -2236,7 +2236,7 @@
         <w:trPr/>
         <w:tc>
           <w:tcPr>
-            <w:tcW w:w="1232" w:type="dxa"/>
+            <w:tcW w:w="1544" w:type="dxa"/>
             <w:tcBorders/>
             <w:vAlign w:val="center"/>
           </w:tcPr>
@@ -2259,7 +2259,7 @@
         </w:tc>
         <w:tc>
           <w:tcPr>
-            <w:tcW w:w="2461" w:type="dxa"/>
+            <w:tcW w:w="5677" w:type="dxa"/>
             <w:tcBorders/>
             <w:vAlign w:val="center"/>
           </w:tcPr>
@@ -2280,7 +2280,7 @@
         </w:tc>
         <w:tc>
           <w:tcPr>
-            <w:tcW w:w="2490" w:type="dxa"/>
+            <w:tcW w:w="4118" w:type="dxa"/>
             <w:tcBorders/>
             <w:vAlign w:val="center"/>
           </w:tcPr>
@@ -2304,7 +2304,7 @@
         <w:trPr/>
         <w:tc>
           <w:tcPr>
-            <w:tcW w:w="1232" w:type="dxa"/>
+            <w:tcW w:w="1544" w:type="dxa"/>
             <w:tcBorders/>
             <w:vAlign w:val="center"/>
           </w:tcPr>
@@ -2327,7 +2327,7 @@
         </w:tc>
         <w:tc>
           <w:tcPr>
-            <w:tcW w:w="2461" w:type="dxa"/>
+            <w:tcW w:w="5677" w:type="dxa"/>
             <w:tcBorders/>
             <w:vAlign w:val="center"/>
           </w:tcPr>
@@ -2348,7 +2348,7 @@
         </w:tc>
         <w:tc>
           <w:tcPr>
-            <w:tcW w:w="2490" w:type="dxa"/>
+            <w:tcW w:w="4118" w:type="dxa"/>
             <w:tcBorders/>
             <w:vAlign w:val="center"/>
           </w:tcPr>
@@ -2372,7 +2372,7 @@
         <w:trPr/>
         <w:tc>
           <w:tcPr>
-            <w:tcW w:w="1232" w:type="dxa"/>
+            <w:tcW w:w="1544" w:type="dxa"/>
             <w:tcBorders/>
             <w:vAlign w:val="center"/>
           </w:tcPr>
@@ -2399,7 +2399,7 @@
         </w:tc>
         <w:tc>
           <w:tcPr>
-            <w:tcW w:w="2461" w:type="dxa"/>
+            <w:tcW w:w="5677" w:type="dxa"/>
             <w:tcBorders/>
             <w:vAlign w:val="center"/>
           </w:tcPr>
@@ -2426,7 +2426,7 @@
         </w:tc>
         <w:tc>
           <w:tcPr>
-            <w:tcW w:w="2490" w:type="dxa"/>
+            <w:tcW w:w="4118" w:type="dxa"/>
             <w:tcBorders/>
             <w:vAlign w:val="center"/>
           </w:tcPr>
@@ -3728,9 +3728,9 @@
     </w:p>
     <w:tbl>
       <w:tblPr>
-        <w:tblW w:w="6183" w:type="dxa"/>
-        <w:jc w:val="left"/>
-        <w:tblInd w:w="0" w:type="dxa"/>
+        <w:tblW w:w="11339" w:type="dxa"/>
+        <w:jc w:val="left"/>
+        <w:tblInd w:w="28" w:type="dxa"/>
         <w:tblLayout w:type="fixed"/>
         <w:tblCellMar>
           <w:top w:w="28" w:type="dxa"/>
@@ -3740,9 +3740,9 @@
         </w:tblCellMar>
       </w:tblPr>
       <w:tblGrid>
-        <w:gridCol w:w="1996"/>
-        <w:gridCol w:w="1231"/>
-        <w:gridCol w:w="2956"/>
+        <w:gridCol w:w="3794"/>
+        <w:gridCol w:w="2810"/>
+        <w:gridCol w:w="4735"/>
       </w:tblGrid>
       <w:tr>
         <w:trPr>
@@ -3750,7 +3750,7 @@
         </w:trPr>
         <w:tc>
           <w:tcPr>
-            <w:tcW w:w="1996" w:type="dxa"/>
+            <w:tcW w:w="3794" w:type="dxa"/>
             <w:tcBorders/>
             <w:vAlign w:val="center"/>
           </w:tcPr>
@@ -3772,7 +3772,7 @@
         </w:tc>
         <w:tc>
           <w:tcPr>
-            <w:tcW w:w="1231" w:type="dxa"/>
+            <w:tcW w:w="2810" w:type="dxa"/>
             <w:tcBorders/>
             <w:vAlign w:val="center"/>
           </w:tcPr>
@@ -3794,7 +3794,7 @@
         </w:tc>
         <w:tc>
           <w:tcPr>
-            <w:tcW w:w="2956" w:type="dxa"/>
+            <w:tcW w:w="4735" w:type="dxa"/>
             <w:tcBorders/>
             <w:vAlign w:val="center"/>
           </w:tcPr>
@@ -3819,7 +3819,7 @@
         <w:trPr/>
         <w:tc>
           <w:tcPr>
-            <w:tcW w:w="1996" w:type="dxa"/>
+            <w:tcW w:w="3794" w:type="dxa"/>
             <w:tcBorders/>
             <w:vAlign w:val="center"/>
           </w:tcPr>
@@ -3862,7 +3862,7 @@
         </w:tc>
         <w:tc>
           <w:tcPr>
-            <w:tcW w:w="1231" w:type="dxa"/>
+            <w:tcW w:w="2810" w:type="dxa"/>
             <w:tcBorders/>
             <w:vAlign w:val="center"/>
           </w:tcPr>
@@ -3883,7 +3883,7 @@
         </w:tc>
         <w:tc>
           <w:tcPr>
-            <w:tcW w:w="2956" w:type="dxa"/>
+            <w:tcW w:w="4735" w:type="dxa"/>
             <w:tcBorders/>
             <w:vAlign w:val="center"/>
           </w:tcPr>
@@ -3907,7 +3907,7 @@
         <w:trPr/>
         <w:tc>
           <w:tcPr>
-            <w:tcW w:w="1996" w:type="dxa"/>
+            <w:tcW w:w="3794" w:type="dxa"/>
             <w:tcBorders/>
             <w:vAlign w:val="center"/>
           </w:tcPr>
@@ -3930,7 +3930,7 @@
         </w:tc>
         <w:tc>
           <w:tcPr>
-            <w:tcW w:w="1231" w:type="dxa"/>
+            <w:tcW w:w="2810" w:type="dxa"/>
             <w:tcBorders/>
             <w:vAlign w:val="center"/>
           </w:tcPr>
@@ -3951,7 +3951,7 @@
         </w:tc>
         <w:tc>
           <w:tcPr>
-            <w:tcW w:w="2956" w:type="dxa"/>
+            <w:tcW w:w="4735" w:type="dxa"/>
             <w:tcBorders/>
             <w:vAlign w:val="center"/>
           </w:tcPr>
@@ -3975,7 +3975,7 @@
         <w:trPr/>
         <w:tc>
           <w:tcPr>
-            <w:tcW w:w="1996" w:type="dxa"/>
+            <w:tcW w:w="3794" w:type="dxa"/>
             <w:tcBorders/>
             <w:vAlign w:val="center"/>
           </w:tcPr>
@@ -4018,7 +4018,7 @@
         </w:tc>
         <w:tc>
           <w:tcPr>
-            <w:tcW w:w="1231" w:type="dxa"/>
+            <w:tcW w:w="2810" w:type="dxa"/>
             <w:tcBorders/>
             <w:vAlign w:val="center"/>
           </w:tcPr>
@@ -4039,7 +4039,7 @@
         </w:tc>
         <w:tc>
           <w:tcPr>
-            <w:tcW w:w="2956" w:type="dxa"/>
+            <w:tcW w:w="4735" w:type="dxa"/>
             <w:tcBorders/>
             <w:vAlign w:val="center"/>
           </w:tcPr>
@@ -4063,7 +4063,7 @@
         <w:trPr/>
         <w:tc>
           <w:tcPr>
-            <w:tcW w:w="1996" w:type="dxa"/>
+            <w:tcW w:w="3794" w:type="dxa"/>
             <w:tcBorders/>
             <w:vAlign w:val="center"/>
           </w:tcPr>
@@ -4096,7 +4096,7 @@
         </w:tc>
         <w:tc>
           <w:tcPr>
-            <w:tcW w:w="1231" w:type="dxa"/>
+            <w:tcW w:w="2810" w:type="dxa"/>
             <w:tcBorders/>
             <w:vAlign w:val="center"/>
           </w:tcPr>
@@ -4117,7 +4117,7 @@
         </w:tc>
         <w:tc>
           <w:tcPr>
-            <w:tcW w:w="2956" w:type="dxa"/>
+            <w:tcW w:w="4735" w:type="dxa"/>
             <w:tcBorders/>
             <w:vAlign w:val="center"/>
           </w:tcPr>
@@ -4151,7 +4151,7 @@
         <w:trPr/>
         <w:tc>
           <w:tcPr>
-            <w:tcW w:w="1996" w:type="dxa"/>
+            <w:tcW w:w="3794" w:type="dxa"/>
             <w:tcBorders/>
             <w:vAlign w:val="center"/>
           </w:tcPr>
@@ -4174,7 +4174,7 @@
         </w:tc>
         <w:tc>
           <w:tcPr>
-            <w:tcW w:w="1231" w:type="dxa"/>
+            <w:tcW w:w="2810" w:type="dxa"/>
             <w:tcBorders/>
             <w:vAlign w:val="center"/>
           </w:tcPr>
@@ -4195,7 +4195,7 @@
         </w:tc>
         <w:tc>
           <w:tcPr>
-            <w:tcW w:w="2956" w:type="dxa"/>
+            <w:tcW w:w="4735" w:type="dxa"/>
             <w:tcBorders/>
             <w:vAlign w:val="center"/>
           </w:tcPr>
@@ -4219,7 +4219,7 @@
         <w:trPr/>
         <w:tc>
           <w:tcPr>
-            <w:tcW w:w="1996" w:type="dxa"/>
+            <w:tcW w:w="3794" w:type="dxa"/>
             <w:tcBorders/>
             <w:vAlign w:val="center"/>
           </w:tcPr>
@@ -4242,7 +4242,7 @@
         </w:tc>
         <w:tc>
           <w:tcPr>
-            <w:tcW w:w="1231" w:type="dxa"/>
+            <w:tcW w:w="2810" w:type="dxa"/>
             <w:tcBorders/>
             <w:vAlign w:val="center"/>
           </w:tcPr>
@@ -4263,7 +4263,7 @@
         </w:tc>
         <w:tc>
           <w:tcPr>
-            <w:tcW w:w="2956" w:type="dxa"/>
+            <w:tcW w:w="4735" w:type="dxa"/>
             <w:tcBorders/>
             <w:vAlign w:val="center"/>
           </w:tcPr>
@@ -4287,7 +4287,7 @@
         <w:trPr/>
         <w:tc>
           <w:tcPr>
-            <w:tcW w:w="1996" w:type="dxa"/>
+            <w:tcW w:w="3794" w:type="dxa"/>
             <w:tcBorders/>
             <w:vAlign w:val="center"/>
           </w:tcPr>
@@ -4310,7 +4310,7 @@
         </w:tc>
         <w:tc>
           <w:tcPr>
-            <w:tcW w:w="1231" w:type="dxa"/>
+            <w:tcW w:w="2810" w:type="dxa"/>
             <w:tcBorders/>
             <w:vAlign w:val="center"/>
           </w:tcPr>
@@ -4331,7 +4331,7 @@
         </w:tc>
         <w:tc>
           <w:tcPr>
-            <w:tcW w:w="2956" w:type="dxa"/>
+            <w:tcW w:w="4735" w:type="dxa"/>
             <w:tcBorders/>
             <w:vAlign w:val="center"/>
           </w:tcPr>
@@ -4355,7 +4355,7 @@
         <w:trPr/>
         <w:tc>
           <w:tcPr>
-            <w:tcW w:w="1996" w:type="dxa"/>
+            <w:tcW w:w="3794" w:type="dxa"/>
             <w:tcBorders/>
             <w:vAlign w:val="center"/>
           </w:tcPr>
@@ -4378,7 +4378,7 @@
         </w:tc>
         <w:tc>
           <w:tcPr>
-            <w:tcW w:w="1231" w:type="dxa"/>
+            <w:tcW w:w="2810" w:type="dxa"/>
             <w:tcBorders/>
             <w:vAlign w:val="center"/>
           </w:tcPr>
@@ -4399,7 +4399,7 @@
         </w:tc>
         <w:tc>
           <w:tcPr>
-            <w:tcW w:w="2956" w:type="dxa"/>
+            <w:tcW w:w="4735" w:type="dxa"/>
             <w:tcBorders/>
             <w:vAlign w:val="center"/>
           </w:tcPr>
@@ -4423,7 +4423,7 @@
         <w:trPr/>
         <w:tc>
           <w:tcPr>
-            <w:tcW w:w="1996" w:type="dxa"/>
+            <w:tcW w:w="3794" w:type="dxa"/>
             <w:tcBorders/>
             <w:vAlign w:val="center"/>
           </w:tcPr>
@@ -4446,7 +4446,7 @@
         </w:tc>
         <w:tc>
           <w:tcPr>
-            <w:tcW w:w="1231" w:type="dxa"/>
+            <w:tcW w:w="2810" w:type="dxa"/>
             <w:tcBorders/>
             <w:vAlign w:val="center"/>
           </w:tcPr>
@@ -4467,7 +4467,7 @@
         </w:tc>
         <w:tc>
           <w:tcPr>
-            <w:tcW w:w="2956" w:type="dxa"/>
+            <w:tcW w:w="4735" w:type="dxa"/>
             <w:tcBorders/>
             <w:vAlign w:val="center"/>
           </w:tcPr>
@@ -4501,7 +4501,7 @@
         <w:trPr/>
         <w:tc>
           <w:tcPr>
-            <w:tcW w:w="1996" w:type="dxa"/>
+            <w:tcW w:w="3794" w:type="dxa"/>
             <w:tcBorders/>
             <w:vAlign w:val="center"/>
           </w:tcPr>
@@ -4524,7 +4524,7 @@
         </w:tc>
         <w:tc>
           <w:tcPr>
-            <w:tcW w:w="1231" w:type="dxa"/>
+            <w:tcW w:w="2810" w:type="dxa"/>
             <w:tcBorders/>
             <w:vAlign w:val="center"/>
           </w:tcPr>
@@ -4545,7 +4545,7 @@
         </w:tc>
         <w:tc>
           <w:tcPr>
-            <w:tcW w:w="2956" w:type="dxa"/>
+            <w:tcW w:w="4735" w:type="dxa"/>
             <w:tcBorders/>
             <w:vAlign w:val="center"/>
           </w:tcPr>
@@ -4569,7 +4569,7 @@
         <w:trPr/>
         <w:tc>
           <w:tcPr>
-            <w:tcW w:w="1996" w:type="dxa"/>
+            <w:tcW w:w="3794" w:type="dxa"/>
             <w:tcBorders/>
             <w:vAlign w:val="center"/>
           </w:tcPr>
@@ -4592,7 +4592,7 @@
         </w:tc>
         <w:tc>
           <w:tcPr>
-            <w:tcW w:w="1231" w:type="dxa"/>
+            <w:tcW w:w="2810" w:type="dxa"/>
             <w:tcBorders/>
             <w:vAlign w:val="center"/>
           </w:tcPr>
@@ -4613,7 +4613,7 @@
         </w:tc>
         <w:tc>
           <w:tcPr>
-            <w:tcW w:w="2956" w:type="dxa"/>
+            <w:tcW w:w="4735" w:type="dxa"/>
             <w:tcBorders/>
             <w:vAlign w:val="center"/>
           </w:tcPr>
@@ -4637,7 +4637,7 @@
         <w:trPr/>
         <w:tc>
           <w:tcPr>
-            <w:tcW w:w="1996" w:type="dxa"/>
+            <w:tcW w:w="3794" w:type="dxa"/>
             <w:tcBorders/>
             <w:vAlign w:val="center"/>
           </w:tcPr>
@@ -4660,7 +4660,7 @@
         </w:tc>
         <w:tc>
           <w:tcPr>
-            <w:tcW w:w="1231" w:type="dxa"/>
+            <w:tcW w:w="2810" w:type="dxa"/>
             <w:tcBorders/>
             <w:vAlign w:val="center"/>
           </w:tcPr>
@@ -4681,7 +4681,7 @@
         </w:tc>
         <w:tc>
           <w:tcPr>
-            <w:tcW w:w="2956" w:type="dxa"/>
+            <w:tcW w:w="4735" w:type="dxa"/>
             <w:tcBorders/>
             <w:vAlign w:val="center"/>
           </w:tcPr>
@@ -4711,7 +4711,7 @@
         <w:trPr/>
         <w:tc>
           <w:tcPr>
-            <w:tcW w:w="1996" w:type="dxa"/>
+            <w:tcW w:w="3794" w:type="dxa"/>
             <w:tcBorders/>
             <w:vAlign w:val="center"/>
           </w:tcPr>
@@ -4734,7 +4734,7 @@
         </w:tc>
         <w:tc>
           <w:tcPr>
-            <w:tcW w:w="1231" w:type="dxa"/>
+            <w:tcW w:w="2810" w:type="dxa"/>
             <w:tcBorders/>
             <w:vAlign w:val="center"/>
           </w:tcPr>
@@ -4755,7 +4755,7 @@
         </w:tc>
         <w:tc>
           <w:tcPr>
-            <w:tcW w:w="2956" w:type="dxa"/>
+            <w:tcW w:w="4735" w:type="dxa"/>
             <w:tcBorders/>
             <w:vAlign w:val="center"/>
           </w:tcPr>
@@ -4779,7 +4779,7 @@
         <w:trPr/>
         <w:tc>
           <w:tcPr>
-            <w:tcW w:w="1996" w:type="dxa"/>
+            <w:tcW w:w="3794" w:type="dxa"/>
             <w:tcBorders/>
             <w:vAlign w:val="center"/>
           </w:tcPr>
@@ -4802,7 +4802,7 @@
         </w:tc>
         <w:tc>
           <w:tcPr>
-            <w:tcW w:w="1231" w:type="dxa"/>
+            <w:tcW w:w="2810" w:type="dxa"/>
             <w:tcBorders/>
             <w:vAlign w:val="center"/>
           </w:tcPr>
@@ -4823,7 +4823,7 @@
         </w:tc>
         <w:tc>
           <w:tcPr>
-            <w:tcW w:w="2956" w:type="dxa"/>
+            <w:tcW w:w="4735" w:type="dxa"/>
             <w:tcBorders/>
             <w:vAlign w:val="center"/>
           </w:tcPr>
@@ -4847,7 +4847,7 @@
         <w:trPr/>
         <w:tc>
           <w:tcPr>
-            <w:tcW w:w="1996" w:type="dxa"/>
+            <w:tcW w:w="3794" w:type="dxa"/>
             <w:tcBorders/>
             <w:vAlign w:val="center"/>
           </w:tcPr>
@@ -4870,7 +4870,7 @@
         </w:tc>
         <w:tc>
           <w:tcPr>
-            <w:tcW w:w="1231" w:type="dxa"/>
+            <w:tcW w:w="2810" w:type="dxa"/>
             <w:tcBorders/>
             <w:vAlign w:val="center"/>
           </w:tcPr>
@@ -4891,7 +4891,7 @@
         </w:tc>
         <w:tc>
           <w:tcPr>
-            <w:tcW w:w="2956" w:type="dxa"/>
+            <w:tcW w:w="4735" w:type="dxa"/>
             <w:tcBorders/>
             <w:vAlign w:val="center"/>
           </w:tcPr>
@@ -4915,7 +4915,7 @@
         <w:trPr/>
         <w:tc>
           <w:tcPr>
-            <w:tcW w:w="1996" w:type="dxa"/>
+            <w:tcW w:w="3794" w:type="dxa"/>
             <w:tcBorders/>
             <w:vAlign w:val="center"/>
           </w:tcPr>
@@ -4938,7 +4938,7 @@
         </w:tc>
         <w:tc>
           <w:tcPr>
-            <w:tcW w:w="1231" w:type="dxa"/>
+            <w:tcW w:w="2810" w:type="dxa"/>
             <w:tcBorders/>
             <w:vAlign w:val="center"/>
           </w:tcPr>
@@ -4959,7 +4959,7 @@
         </w:tc>
         <w:tc>
           <w:tcPr>
-            <w:tcW w:w="2956" w:type="dxa"/>
+            <w:tcW w:w="4735" w:type="dxa"/>
             <w:tcBorders/>
             <w:vAlign w:val="center"/>
           </w:tcPr>
@@ -4989,7 +4989,7 @@
         <w:trPr/>
         <w:tc>
           <w:tcPr>
-            <w:tcW w:w="1996" w:type="dxa"/>
+            <w:tcW w:w="3794" w:type="dxa"/>
             <w:tcBorders/>
             <w:vAlign w:val="center"/>
           </w:tcPr>
@@ -5012,7 +5012,7 @@
         </w:tc>
         <w:tc>
           <w:tcPr>
-            <w:tcW w:w="1231" w:type="dxa"/>
+            <w:tcW w:w="2810" w:type="dxa"/>
             <w:tcBorders/>
             <w:vAlign w:val="center"/>
           </w:tcPr>
@@ -5033,7 +5033,7 @@
         </w:tc>
         <w:tc>
           <w:tcPr>
-            <w:tcW w:w="2956" w:type="dxa"/>
+            <w:tcW w:w="4735" w:type="dxa"/>
             <w:tcBorders/>
             <w:vAlign w:val="center"/>
           </w:tcPr>
@@ -5067,7 +5067,7 @@
         <w:trPr/>
         <w:tc>
           <w:tcPr>
-            <w:tcW w:w="1996" w:type="dxa"/>
+            <w:tcW w:w="3794" w:type="dxa"/>
             <w:tcBorders/>
             <w:vAlign w:val="center"/>
           </w:tcPr>
@@ -5110,7 +5110,7 @@
         </w:tc>
         <w:tc>
           <w:tcPr>
-            <w:tcW w:w="1231" w:type="dxa"/>
+            <w:tcW w:w="2810" w:type="dxa"/>
             <w:tcBorders/>
             <w:vAlign w:val="center"/>
           </w:tcPr>
@@ -5131,7 +5131,7 @@
         </w:tc>
         <w:tc>
           <w:tcPr>
-            <w:tcW w:w="2956" w:type="dxa"/>
+            <w:tcW w:w="4735" w:type="dxa"/>
             <w:tcBorders/>
             <w:vAlign w:val="center"/>
           </w:tcPr>
@@ -5181,9 +5181,9 @@
     </w:p>
     <w:tbl>
       <w:tblPr>
-        <w:tblW w:w="6183" w:type="dxa"/>
-        <w:jc w:val="left"/>
-        <w:tblInd w:w="0" w:type="dxa"/>
+        <w:tblW w:w="11339" w:type="dxa"/>
+        <w:jc w:val="left"/>
+        <w:tblInd w:w="28" w:type="dxa"/>
         <w:tblLayout w:type="fixed"/>
         <w:tblCellMar>
           <w:top w:w="28" w:type="dxa"/>
@@ -5193,9 +5193,9 @@
         </w:tblCellMar>
       </w:tblPr>
       <w:tblGrid>
-        <w:gridCol w:w="3141"/>
-        <w:gridCol w:w="1480"/>
-        <w:gridCol w:w="1562"/>
+        <w:gridCol w:w="7637"/>
+        <w:gridCol w:w="2139"/>
+        <w:gridCol w:w="1563"/>
       </w:tblGrid>
       <w:tr>
         <w:trPr>
@@ -5203,7 +5203,7 @@
         </w:trPr>
         <w:tc>
           <w:tcPr>
-            <w:tcW w:w="3141" w:type="dxa"/>
+            <w:tcW w:w="7637" w:type="dxa"/>
             <w:tcBorders/>
             <w:vAlign w:val="center"/>
           </w:tcPr>
@@ -5225,7 +5225,7 @@
         </w:tc>
         <w:tc>
           <w:tcPr>
-            <w:tcW w:w="1480" w:type="dxa"/>
+            <w:tcW w:w="2139" w:type="dxa"/>
             <w:tcBorders/>
             <w:vAlign w:val="center"/>
           </w:tcPr>
@@ -5247,7 +5247,7 @@
         </w:tc>
         <w:tc>
           <w:tcPr>
-            <w:tcW w:w="1562" w:type="dxa"/>
+            <w:tcW w:w="1563" w:type="dxa"/>
             <w:tcBorders/>
             <w:vAlign w:val="center"/>
           </w:tcPr>
@@ -5272,7 +5272,7 @@
         <w:trPr/>
         <w:tc>
           <w:tcPr>
-            <w:tcW w:w="3141" w:type="dxa"/>
+            <w:tcW w:w="7637" w:type="dxa"/>
             <w:tcBorders/>
             <w:vAlign w:val="center"/>
           </w:tcPr>
@@ -5299,7 +5299,7 @@
         </w:tc>
         <w:tc>
           <w:tcPr>
-            <w:tcW w:w="1480" w:type="dxa"/>
+            <w:tcW w:w="2139" w:type="dxa"/>
             <w:tcBorders/>
             <w:vAlign w:val="center"/>
           </w:tcPr>
@@ -5320,7 +5320,7 @@
         </w:tc>
         <w:tc>
           <w:tcPr>
-            <w:tcW w:w="1562" w:type="dxa"/>
+            <w:tcW w:w="1563" w:type="dxa"/>
             <w:tcBorders/>
             <w:vAlign w:val="center"/>
           </w:tcPr>
@@ -5346,7 +5346,7 @@
         <w:trPr/>
         <w:tc>
           <w:tcPr>
-            <w:tcW w:w="3141" w:type="dxa"/>
+            <w:tcW w:w="7637" w:type="dxa"/>
             <w:tcBorders/>
             <w:vAlign w:val="center"/>
           </w:tcPr>
@@ -5373,7 +5373,7 @@
         </w:tc>
         <w:tc>
           <w:tcPr>
-            <w:tcW w:w="1480" w:type="dxa"/>
+            <w:tcW w:w="2139" w:type="dxa"/>
             <w:tcBorders/>
             <w:vAlign w:val="center"/>
           </w:tcPr>
@@ -5394,7 +5394,7 @@
         </w:tc>
         <w:tc>
           <w:tcPr>
-            <w:tcW w:w="1562" w:type="dxa"/>
+            <w:tcW w:w="1563" w:type="dxa"/>
             <w:tcBorders/>
             <w:vAlign w:val="center"/>
           </w:tcPr>
@@ -5420,7 +5420,7 @@
         <w:trPr/>
         <w:tc>
           <w:tcPr>
-            <w:tcW w:w="3141" w:type="dxa"/>
+            <w:tcW w:w="7637" w:type="dxa"/>
             <w:tcBorders/>
             <w:vAlign w:val="center"/>
           </w:tcPr>
@@ -5441,7 +5441,7 @@
         </w:tc>
         <w:tc>
           <w:tcPr>
-            <w:tcW w:w="1480" w:type="dxa"/>
+            <w:tcW w:w="2139" w:type="dxa"/>
             <w:tcBorders/>
             <w:vAlign w:val="center"/>
           </w:tcPr>
@@ -5462,7 +5462,7 @@
         </w:tc>
         <w:tc>
           <w:tcPr>
-            <w:tcW w:w="1562" w:type="dxa"/>
+            <w:tcW w:w="1563" w:type="dxa"/>
             <w:tcBorders/>
             <w:vAlign w:val="center"/>
           </w:tcPr>
@@ -5488,49 +5488,69 @@
         <w:trPr/>
         <w:tc>
           <w:tcPr>
-            <w:tcW w:w="3141" w:type="dxa"/>
-            <w:tcBorders/>
-            <w:vAlign w:val="center"/>
-          </w:tcPr>
-          <w:p>
-            <w:pPr>
-              <w:pStyle w:val="TableContents"/>
-              <w:shd w:fill="2E3440" w:val="clear"/>
-              <w:bidi w:val="0"/>
-              <w:spacing w:before="120" w:after="120"/>
-              <w:jc w:val="left"/>
-              <w:rPr/>
-            </w:pPr>
-            <w:r>
-              <w:rPr/>
-              <w:t>A wave: tickets run in parallel</w:t>
-            </w:r>
-          </w:p>
-        </w:tc>
-        <w:tc>
-          <w:tcPr>
-            <w:tcW w:w="1480" w:type="dxa"/>
-            <w:tcBorders/>
-            <w:vAlign w:val="center"/>
-          </w:tcPr>
-          <w:p>
-            <w:pPr>
-              <w:pStyle w:val="TableContents"/>
-              <w:shd w:fill="2E3440" w:val="clear"/>
-              <w:bidi w:val="0"/>
-              <w:spacing w:before="120" w:after="120"/>
-              <w:jc w:val="left"/>
-              <w:rPr/>
-            </w:pPr>
-            <w:r>
-              <w:rPr/>
-              <w:t>T-0029</w:t>
-            </w:r>
-          </w:p>
-        </w:tc>
-        <w:tc>
-          <w:tcPr>
-            <w:tcW w:w="1562" w:type="dxa"/>
+            <w:tcW w:w="7637" w:type="dxa"/>
+            <w:tcBorders/>
+            <w:vAlign w:val="center"/>
+          </w:tcPr>
+          <w:p>
+            <w:pPr>
+              <w:pStyle w:val="TableContents"/>
+              <w:shd w:fill="2E3440" w:val="clear"/>
+              <w:bidi w:val="0"/>
+              <w:spacing w:before="120" w:after="120"/>
+              <w:jc w:val="left"/>
+              <w:rPr/>
+            </w:pPr>
+            <w:r>
+              <w:rPr/>
+              <w:t xml:space="preserve">A wave: tickets run in parallel (since L-0727 as the </w:t>
+            </w:r>
+            <w:r>
+              <w:rPr>
+                <w:rStyle w:val="SourceText"/>
+              </w:rPr>
+              <w:t>/crew:wave</w:t>
+            </w:r>
+            <w:r>
+              <w:rPr/>
+              <w:t xml:space="preserve"> workflow, </w:t>
+            </w:r>
+            <w:r>
+              <w:rPr>
+                <w:rStyle w:val="SourceText"/>
+              </w:rPr>
+              <w:t>{"set": "&lt;slug&gt;"}</w:t>
+            </w:r>
+            <w:r>
+              <w:rPr/>
+              <w:t>)</w:t>
+            </w:r>
+          </w:p>
+        </w:tc>
+        <w:tc>
+          <w:tcPr>
+            <w:tcW w:w="2139" w:type="dxa"/>
+            <w:tcBorders/>
+            <w:vAlign w:val="center"/>
+          </w:tcPr>
+          <w:p>
+            <w:pPr>
+              <w:pStyle w:val="TableContents"/>
+              <w:shd w:fill="2E3440" w:val="clear"/>
+              <w:bidi w:val="0"/>
+              <w:spacing w:before="120" w:after="120"/>
+              <w:jc w:val="left"/>
+              <w:rPr/>
+            </w:pPr>
+            <w:r>
+              <w:rPr/>
+              <w:t>T-0029, L-0727</w:t>
+            </w:r>
+          </w:p>
+        </w:tc>
+        <w:tc>
+          <w:tcPr>
+            <w:tcW w:w="1563" w:type="dxa"/>
             <w:tcBorders/>
             <w:vAlign w:val="center"/>
           </w:tcPr>
@@ -5556,7 +5576,7 @@
         <w:trPr/>
         <w:tc>
           <w:tcPr>
-            <w:tcW w:w="3141" w:type="dxa"/>
+            <w:tcW w:w="7637" w:type="dxa"/>
             <w:tcBorders/>
             <w:vAlign w:val="center"/>
           </w:tcPr>
@@ -5577,7 +5597,7 @@
         </w:tc>
         <w:tc>
           <w:tcPr>
-            <w:tcW w:w="1480" w:type="dxa"/>
+            <w:tcW w:w="2139" w:type="dxa"/>
             <w:tcBorders/>
             <w:vAlign w:val="center"/>
           </w:tcPr>
@@ -5598,7 +5618,7 @@
         </w:tc>
         <w:tc>
           <w:tcPr>
-            <w:tcW w:w="1562" w:type="dxa"/>
+            <w:tcW w:w="1563" w:type="dxa"/>
             <w:tcBorders/>
             <w:vAlign w:val="center"/>
           </w:tcPr>
@@ -5624,7 +5644,7 @@
         <w:trPr/>
         <w:tc>
           <w:tcPr>
-            <w:tcW w:w="3141" w:type="dxa"/>
+            <w:tcW w:w="7637" w:type="dxa"/>
             <w:tcBorders/>
             <w:vAlign w:val="center"/>
           </w:tcPr>
@@ -5655,7 +5675,7 @@
         </w:tc>
         <w:tc>
           <w:tcPr>
-            <w:tcW w:w="1480" w:type="dxa"/>
+            <w:tcW w:w="2139" w:type="dxa"/>
             <w:tcBorders/>
             <w:vAlign w:val="center"/>
           </w:tcPr>
@@ -5676,7 +5696,7 @@
         </w:tc>
         <w:tc>
           <w:tcPr>
-            <w:tcW w:w="1562" w:type="dxa"/>
+            <w:tcW w:w="1563" w:type="dxa"/>
             <w:tcBorders/>
             <w:vAlign w:val="center"/>
           </w:tcPr>
@@ -5702,7 +5722,7 @@
         <w:trPr/>
         <w:tc>
           <w:tcPr>
-            <w:tcW w:w="3141" w:type="dxa"/>
+            <w:tcW w:w="7637" w:type="dxa"/>
             <w:tcBorders/>
             <w:vAlign w:val="center"/>
           </w:tcPr>
@@ -5723,7 +5743,7 @@
         </w:tc>
         <w:tc>
           <w:tcPr>
-            <w:tcW w:w="1480" w:type="dxa"/>
+            <w:tcW w:w="2139" w:type="dxa"/>
             <w:tcBorders/>
             <w:vAlign w:val="center"/>
           </w:tcPr>
@@ -5744,7 +5764,7 @@
         </w:tc>
         <w:tc>
           <w:tcPr>
-            <w:tcW w:w="1562" w:type="dxa"/>
+            <w:tcW w:w="1563" w:type="dxa"/>
             <w:tcBorders/>
             <w:vAlign w:val="center"/>
           </w:tcPr>
@@ -6610,7 +6630,7 @@
       <w:start w:val="1"/>
       <w:numFmt w:val="none"/>
       <w:suff w:val="nothing"/>
-      <w:lvlText w:val="%1"/>
+      <w:lvlText w:val=""/>
       <w:lvlJc w:val="left"/>
       <w:pPr>
         <w:tabs>
@@ -6621,10 +6641,10 @@
     </w:lvl>
     <w:lvl w:ilvl="1">
       <w:start w:val="1"/>
+      <w:numFmt w:val="none"/>
       <w:pStyle w:val="Heading2"/>
-      <w:numFmt w:val="none"/>
       <w:suff w:val="nothing"/>
-      <w:lvlText w:val="%2"/>
+      <w:lvlText w:val=""/>
       <w:lvlJc w:val="left"/>
       <w:pPr>
         <w:tabs>
@@ -6635,10 +6655,10 @@
     </w:lvl>
     <w:lvl w:ilvl="2">
       <w:start w:val="1"/>
+      <w:numFmt w:val="none"/>
       <w:pStyle w:val="Heading3"/>
-      <w:numFmt w:val="none"/>
       <w:suff w:val="nothing"/>
-      <w:lvlText w:val="%3"/>
+      <w:lvlText w:val=""/>
       <w:lvlJc w:val="left"/>
       <w:pPr>
         <w:tabs>
@@ -6651,7 +6671,7 @@
       <w:start w:val="1"/>
       <w:numFmt w:val="none"/>
       <w:suff w:val="nothing"/>
-      <w:lvlText w:val="%4"/>
+      <w:lvlText w:val=""/>
       <w:lvlJc w:val="left"/>
       <w:pPr>
         <w:tabs>
@@ -6664,7 +6684,7 @@
       <w:start w:val="1"/>
       <w:numFmt w:val="none"/>
       <w:suff w:val="nothing"/>
-      <w:lvlText w:val="%5"/>
+      <w:lvlText w:val=""/>
       <w:lvlJc w:val="left"/>
       <w:pPr>
         <w:tabs>
@@ -6677,7 +6697,7 @@
       <w:start w:val="1"/>
       <w:numFmt w:val="none"/>
       <w:suff w:val="nothing"/>
-      <w:lvlText w:val="%6"/>
+      <w:lvlText w:val=""/>
       <w:lvlJc w:val="left"/>
       <w:pPr>
         <w:tabs>
@@ -6690,7 +6710,7 @@
       <w:start w:val="1"/>
       <w:numFmt w:val="none"/>
       <w:suff w:val="nothing"/>
-      <w:lvlText w:val="%7"/>
+      <w:lvlText w:val=""/>
       <w:lvlJc w:val="left"/>
       <w:pPr>
         <w:tabs>
@@ -6703,7 +6723,7 @@
       <w:start w:val="1"/>
       <w:numFmt w:val="none"/>
       <w:suff w:val="nothing"/>
-      <w:lvlText w:val="%8"/>
+      <w:lvlText w:val=""/>
       <w:lvlJc w:val="left"/>
       <w:pPr>
         <w:tabs>
@@ -6716,7 +6736,7 @@
       <w:start w:val="1"/>
       <w:numFmt w:val="none"/>
       <w:suff w:val="nothing"/>
-      <w:lvlText w:val="%9"/>
+      <w:lvlText w:val=""/>
       <w:lvlJc w:val="left"/>
       <w:pPr>
         <w:tabs>
@@ -6749,7 +6769,7 @@
   <w:docDefaults>
     <w:rPrDefault>
       <w:rPr>
-        <w:rFonts w:ascii="Liberation Serif" w:hAnsi="Liberation Serif" w:eastAsia="WenQuanYi Zen Hei" w:cs="FreeSans"/>
+        <w:rFonts w:ascii="Liberation Serif" w:hAnsi="Liberation Serif" w:eastAsia="Noto Serif CJK SC" w:cs="Noto Sans Devanagari"/>
         <w:sz w:val="24"/>
         <w:szCs w:val="24"/>
         <w:lang w:val="en-US" w:eastAsia="zh-CN" w:bidi="hi-IN"/>
@@ -6779,7 +6799,7 @@
     </w:rPr>
   </w:style>
   <w:style w:type="paragraph" w:styleId="Heading1">
-    <w:name w:val="Heading 1"/>
+    <w:name w:val="heading 1"/>
     <w:basedOn w:val="Heading"/>
     <w:next w:val="BodyText"/>
     <w:qFormat/>
@@ -6787,7 +6807,6 @@
       <w:spacing w:before="240" w:after="80"/>
     </w:pPr>
     <w:rPr>
-      <w:rFonts w:ascii="Noto Sans" w:hAnsi="Noto Sans"/>
       <w:b/>
       <w:bCs/>
       <w:color w:val="88C0D0"/>
@@ -6796,7 +6815,7 @@
     </w:rPr>
   </w:style>
   <w:style w:type="paragraph" w:styleId="Heading2">
-    <w:name w:val="Heading 2"/>
+    <w:name w:val="heading 2"/>
     <w:basedOn w:val="Heading"/>
     <w:next w:val="BodyText"/>
     <w:qFormat/>
@@ -6809,7 +6828,7 @@
       <w:outlineLvl w:val="1"/>
     </w:pPr>
     <w:rPr>
-      <w:rFonts w:ascii="Liberation Serif" w:hAnsi="Liberation Serif" w:eastAsia="WenQuanYi Zen Hei" w:cs="FreeSans"/>
+      <w:rFonts w:ascii="Liberation Serif" w:hAnsi="Liberation Serif" w:eastAsia="Noto Serif CJK SC" w:cs="Noto Sans Devanagari"/>
       <w:b/>
       <w:bCs/>
       <w:color w:val="88C0D0"/>
@@ -6818,7 +6837,7 @@
     </w:rPr>
   </w:style>
   <w:style w:type="paragraph" w:styleId="Heading3">
-    <w:name w:val="Heading 3"/>
+    <w:name w:val="heading 3"/>
     <w:basedOn w:val="Heading"/>
     <w:next w:val="BodyText"/>
     <w:qFormat/>
@@ -6828,12 +6847,24 @@
       <w:outlineLvl w:val="2"/>
     </w:pPr>
     <w:rPr>
-      <w:rFonts w:ascii="Liberation Serif" w:hAnsi="Liberation Serif" w:eastAsia="WenQuanYi Zen Hei" w:cs="FreeSans"/>
+      <w:rFonts w:ascii="Liberation Serif" w:hAnsi="Liberation Serif" w:eastAsia="Noto Serif CJK SC" w:cs="Noto Sans Devanagari"/>
       <w:b/>
       <w:bCs/>
       <w:color w:val="88C0D0"/>
       <w:sz w:val="26"/>
       <w:szCs w:val="26"/>
+    </w:rPr>
+  </w:style>
+  <w:style w:type="character" w:styleId="EndnoteReference">
+    <w:name w:val="endnote reference"/>
+    <w:rPr>
+      <w:vertAlign w:val="superscript"/>
+    </w:rPr>
+  </w:style>
+  <w:style w:type="character" w:styleId="FootnoteReference">
+    <w:name w:val="footnote reference"/>
+    <w:rPr>
+      <w:vertAlign w:val="superscript"/>
     </w:rPr>
   </w:style>
   <w:style w:type="character" w:styleId="EndnoteCharacters">
@@ -6900,7 +6931,7 @@
     </w:rPr>
   </w:style>
   <w:style w:type="paragraph" w:styleId="EnvelopeReturn">
-    <w:name w:val="Envelope Return"/>
+    <w:name w:val="envelope return"/>
     <w:basedOn w:val="Normal"/>
     <w:pPr/>
     <w:rPr>
@@ -6919,46 +6950,6 @@
       <w:color w:val="ECEFF4"/>
     </w:rPr>
   </w:style>
-  <w:style w:type="paragraph" w:styleId="Footer">
-    <w:name w:val="Footer"/>
-    <w:basedOn w:val="Normal"/>
-    <w:pPr>
-      <w:suppressLineNumbers/>
-      <w:tabs>
-        <w:tab w:val="clear" w:pos="1134"/>
-        <w:tab w:val="center" w:pos="5952" w:leader="none"/>
-        <w:tab w:val="right" w:pos="10771" w:leader="none"/>
-      </w:tabs>
-    </w:pPr>
-    <w:rPr/>
-  </w:style>
-  <w:style w:type="paragraph" w:styleId="Header">
-    <w:name w:val="Header"/>
-    <w:basedOn w:val="Normal"/>
-    <w:pPr>
-      <w:suppressLineNumbers/>
-      <w:tabs>
-        <w:tab w:val="clear" w:pos="1134"/>
-        <w:tab w:val="center" w:pos="5952" w:leader="none"/>
-        <w:tab w:val="right" w:pos="10771" w:leader="none"/>
-      </w:tabs>
-    </w:pPr>
-    <w:rPr/>
-  </w:style>
-  <w:style w:type="paragraph" w:styleId="HeaderandFooter">
-    <w:name w:val="Header and Footer"/>
-    <w:basedOn w:val="Normal"/>
-    <w:qFormat/>
-    <w:pPr>
-      <w:suppressLineNumbers/>
-      <w:tabs>
-        <w:tab w:val="clear" w:pos="1134"/>
-        <w:tab w:val="center" w:pos="5953" w:leader="none"/>
-        <w:tab w:val="right" w:pos="10772" w:leader="none"/>
-      </w:tabs>
-    </w:pPr>
-    <w:rPr/>
-  </w:style>
   <w:style w:type="paragraph" w:styleId="Index">
     <w:name w:val="Index"/>
     <w:basedOn w:val="Normal"/>
@@ -6967,11 +6958,11 @@
       <w:suppressLineNumbers/>
     </w:pPr>
     <w:rPr>
-      <w:rFonts w:cs="FreeSans"/>
+      <w:rFonts w:cs="Noto Sans Devanagari"/>
     </w:rPr>
   </w:style>
   <w:style w:type="paragraph" w:styleId="Caption">
-    <w:name w:val="Caption"/>
+    <w:name w:val="caption"/>
     <w:basedOn w:val="Normal"/>
     <w:qFormat/>
     <w:pPr>
@@ -6979,7 +6970,7 @@
       <w:spacing w:before="120" w:after="120"/>
     </w:pPr>
     <w:rPr>
-      <w:rFonts w:cs="FreeSans"/>
+      <w:rFonts w:cs="Noto Sans Devanagari"/>
       <w:i/>
       <w:iCs/>
       <w:sz w:val="24"/>
@@ -6991,7 +6982,7 @@
     <w:basedOn w:val="BodyText"/>
     <w:pPr/>
     <w:rPr>
-      <w:rFonts w:cs="FreeSans"/>
+      <w:rFonts w:cs="Noto Sans Devanagari"/>
     </w:rPr>
   </w:style>
   <w:style w:type="paragraph" w:styleId="BodyText">
@@ -7033,7 +7024,7 @@
       <w:ind w:left="160" w:right="160"/>
     </w:pPr>
     <w:rPr>
-      <w:rFonts w:ascii="Liberation Mono" w:hAnsi="Liberation Mono" w:eastAsia="Liberation Mono" w:cs="Liberation Mono"/>
+      <w:rFonts w:ascii="Liberation Mono" w:hAnsi="Liberation Mono" w:eastAsia="Noto Sans Mono CJK SC" w:cs="Liberation Mono"/>
       <w:sz w:val="20"/>
       <w:szCs w:val="20"/>
     </w:rPr>
@@ -7074,37 +7065,37 @@
         <a:srgbClr val="000000"/>
       </a:dk1>
       <a:lt1>
-        <a:srgbClr val="ffffff"/>
+        <a:srgbClr val="FFFFFF"/>
       </a:lt1>
       <a:dk2>
         <a:srgbClr val="000000"/>
       </a:dk2>
       <a:lt2>
-        <a:srgbClr val="ffffff"/>
+        <a:srgbClr val="FFFFFF"/>
       </a:lt2>
       <a:accent1>
-        <a:srgbClr val="18a303"/>
+        <a:srgbClr val="18A303"/>
       </a:accent1>
       <a:accent2>
-        <a:srgbClr val="0369a3"/>
+        <a:srgbClr val="0369A3"/>
       </a:accent2>
       <a:accent3>
-        <a:srgbClr val="a33e03"/>
+        <a:srgbClr val="A33E03"/>
       </a:accent3>
       <a:accent4>
-        <a:srgbClr val="8e03a3"/>
+        <a:srgbClr val="8E03A3"/>
       </a:accent4>
       <a:accent5>
-        <a:srgbClr val="c99c00"/>
+        <a:srgbClr val="C99C00"/>
       </a:accent5>
       <a:accent6>
-        <a:srgbClr val="c9211e"/>
+        <a:srgbClr val="C9211E"/>
       </a:accent6>
       <a:hlink>
-        <a:srgbClr val="0000ee"/>
+        <a:srgbClr val="0000EE"/>
       </a:hlink>
       <a:folHlink>
-        <a:srgbClr val="551a8b"/>
+        <a:srgbClr val="551A8B"/>
       </a:folHlink>
     </a:clrScheme>
     <a:fontScheme name="Office">

</xml_diff>

<commit_message>
L-0727: leave the autopilot guide as it was (its coming-row is fixture-bound)
</commit_message>
<xml_diff>
--- a/docs/guides/crew/crew-autopilot.docx
+++ b/docs/guides/crew/crew-autopilot.docx
@@ -1,6 +1,6 @@
 
 <file path=word/document.xml><?xml version="1.0" encoding="utf-8"?>
-<w:document xmlns:o="urn:schemas-microsoft-com:office:office" xmlns:r="http://schemas.openxmlformats.org/officeDocument/2006/relationships" xmlns:v="urn:schemas-microsoft-com:vml" xmlns:w="http://schemas.openxmlformats.org/wordprocessingml/2006/main" xmlns:w10="urn:schemas-microsoft-com:office:word" xmlns:wp="http://schemas.openxmlformats.org/drawingml/2006/wordprocessingDrawing" xmlns:pic="http://schemas.openxmlformats.org/drawingml/2006/picture" xmlns:wps="http://schemas.microsoft.com/office/word/2010/wordprocessingShape" xmlns:wpg="http://schemas.microsoft.com/office/word/2010/wordprocessingGroup" xmlns:mc="http://schemas.openxmlformats.org/markup-compatibility/2006" xmlns:wp14="http://schemas.microsoft.com/office/word/2010/wordprocessingDrawing" xmlns:w14="http://schemas.microsoft.com/office/word/2010/wordml" xmlns:w15="http://schemas.microsoft.com/office/word/2012/wordml" mc:Ignorable="w14 wp14 w15">
+<w:document xmlns:o="urn:schemas-microsoft-com:office:office" xmlns:r="http://schemas.openxmlformats.org/officeDocument/2006/relationships" xmlns:v="urn:schemas-microsoft-com:vml" xmlns:w="http://schemas.openxmlformats.org/wordprocessingml/2006/main" xmlns:w10="urn:schemas-microsoft-com:office:word" xmlns:wp="http://schemas.openxmlformats.org/drawingml/2006/wordprocessingDrawing" xmlns:wps="http://schemas.microsoft.com/office/word/2010/wordprocessingShape" xmlns:wpg="http://schemas.microsoft.com/office/word/2010/wordprocessingGroup" xmlns:mc="http://schemas.openxmlformats.org/markup-compatibility/2006" xmlns:wp14="http://schemas.microsoft.com/office/word/2010/wordprocessingDrawing" xmlns:w14="http://schemas.microsoft.com/office/word/2010/wordml" xmlns:w15="http://schemas.microsoft.com/office/word/2012/wordml" mc:Ignorable="w14 wp14 w15">
   <w:body>
     <w:p>
       <w:pPr>
@@ -607,9 +607,9 @@
     </w:p>
     <w:tbl>
       <w:tblPr>
-        <w:tblW w:w="10793" w:type="dxa"/>
-        <w:jc w:val="left"/>
-        <w:tblInd w:w="28" w:type="dxa"/>
+        <w:tblW w:w="6183" w:type="dxa"/>
+        <w:jc w:val="left"/>
+        <w:tblInd w:w="0" w:type="dxa"/>
         <w:tblLayout w:type="fixed"/>
         <w:tblCellMar>
           <w:top w:w="28" w:type="dxa"/>
@@ -619,8 +619,8 @@
         </w:tblCellMar>
       </w:tblPr>
       <w:tblGrid>
-        <w:gridCol w:w="5745"/>
-        <w:gridCol w:w="5048"/>
+        <w:gridCol w:w="3154"/>
+        <w:gridCol w:w="3029"/>
       </w:tblGrid>
       <w:tr>
         <w:trPr>
@@ -628,7 +628,7 @@
         </w:trPr>
         <w:tc>
           <w:tcPr>
-            <w:tcW w:w="5745" w:type="dxa"/>
+            <w:tcW w:w="3154" w:type="dxa"/>
             <w:tcBorders/>
             <w:vAlign w:val="center"/>
           </w:tcPr>
@@ -650,7 +650,7 @@
         </w:tc>
         <w:tc>
           <w:tcPr>
-            <w:tcW w:w="5048" w:type="dxa"/>
+            <w:tcW w:w="3029" w:type="dxa"/>
             <w:tcBorders/>
             <w:vAlign w:val="center"/>
           </w:tcPr>
@@ -675,7 +675,7 @@
         <w:trPr/>
         <w:tc>
           <w:tcPr>
-            <w:tcW w:w="5745" w:type="dxa"/>
+            <w:tcW w:w="3154" w:type="dxa"/>
             <w:tcBorders/>
             <w:vAlign w:val="center"/>
           </w:tcPr>
@@ -698,7 +698,7 @@
         </w:tc>
         <w:tc>
           <w:tcPr>
-            <w:tcW w:w="5048" w:type="dxa"/>
+            <w:tcW w:w="3029" w:type="dxa"/>
             <w:tcBorders/>
             <w:vAlign w:val="center"/>
           </w:tcPr>
@@ -722,7 +722,7 @@
         <w:trPr/>
         <w:tc>
           <w:tcPr>
-            <w:tcW w:w="5745" w:type="dxa"/>
+            <w:tcW w:w="3154" w:type="dxa"/>
             <w:tcBorders/>
             <w:vAlign w:val="center"/>
           </w:tcPr>
@@ -755,7 +755,7 @@
         </w:tc>
         <w:tc>
           <w:tcPr>
-            <w:tcW w:w="5048" w:type="dxa"/>
+            <w:tcW w:w="3029" w:type="dxa"/>
             <w:tcBorders/>
             <w:vAlign w:val="center"/>
           </w:tcPr>
@@ -779,7 +779,7 @@
         <w:trPr/>
         <w:tc>
           <w:tcPr>
-            <w:tcW w:w="5745" w:type="dxa"/>
+            <w:tcW w:w="3154" w:type="dxa"/>
             <w:tcBorders/>
             <w:vAlign w:val="center"/>
           </w:tcPr>
@@ -802,7 +802,7 @@
         </w:tc>
         <w:tc>
           <w:tcPr>
-            <w:tcW w:w="5048" w:type="dxa"/>
+            <w:tcW w:w="3029" w:type="dxa"/>
             <w:tcBorders/>
             <w:vAlign w:val="center"/>
           </w:tcPr>
@@ -1135,9 +1135,9 @@
     </w:p>
     <w:tbl>
       <w:tblPr>
-        <w:tblW w:w="9556" w:type="dxa"/>
-        <w:jc w:val="left"/>
-        <w:tblInd w:w="28" w:type="dxa"/>
+        <w:tblW w:w="6183" w:type="dxa"/>
+        <w:jc w:val="left"/>
+        <w:tblInd w:w="0" w:type="dxa"/>
         <w:tblLayout w:type="fixed"/>
         <w:tblCellMar>
           <w:top w:w="28" w:type="dxa"/>
@@ -1147,8 +1147,8 @@
         </w:tblCellMar>
       </w:tblPr>
       <w:tblGrid>
-        <w:gridCol w:w="1765"/>
-        <w:gridCol w:w="7791"/>
+        <w:gridCol w:w="1391"/>
+        <w:gridCol w:w="4792"/>
       </w:tblGrid>
       <w:tr>
         <w:trPr>
@@ -1156,7 +1156,7 @@
         </w:trPr>
         <w:tc>
           <w:tcPr>
-            <w:tcW w:w="1765" w:type="dxa"/>
+            <w:tcW w:w="1391" w:type="dxa"/>
             <w:tcBorders/>
             <w:vAlign w:val="center"/>
           </w:tcPr>
@@ -1178,7 +1178,7 @@
         </w:tc>
         <w:tc>
           <w:tcPr>
-            <w:tcW w:w="7791" w:type="dxa"/>
+            <w:tcW w:w="4792" w:type="dxa"/>
             <w:tcBorders/>
             <w:vAlign w:val="center"/>
           </w:tcPr>
@@ -1203,7 +1203,7 @@
         <w:trPr/>
         <w:tc>
           <w:tcPr>
-            <w:tcW w:w="1765" w:type="dxa"/>
+            <w:tcW w:w="1391" w:type="dxa"/>
             <w:tcBorders/>
             <w:vAlign w:val="center"/>
           </w:tcPr>
@@ -1226,7 +1226,7 @@
         </w:tc>
         <w:tc>
           <w:tcPr>
-            <w:tcW w:w="7791" w:type="dxa"/>
+            <w:tcW w:w="4792" w:type="dxa"/>
             <w:tcBorders/>
             <w:vAlign w:val="center"/>
           </w:tcPr>
@@ -1250,7 +1250,7 @@
         <w:trPr/>
         <w:tc>
           <w:tcPr>
-            <w:tcW w:w="1765" w:type="dxa"/>
+            <w:tcW w:w="1391" w:type="dxa"/>
             <w:tcBorders/>
             <w:vAlign w:val="center"/>
           </w:tcPr>
@@ -1273,7 +1273,7 @@
         </w:tc>
         <w:tc>
           <w:tcPr>
-            <w:tcW w:w="7791" w:type="dxa"/>
+            <w:tcW w:w="4792" w:type="dxa"/>
             <w:tcBorders/>
             <w:vAlign w:val="center"/>
           </w:tcPr>
@@ -1297,7 +1297,7 @@
         <w:trPr/>
         <w:tc>
           <w:tcPr>
-            <w:tcW w:w="1765" w:type="dxa"/>
+            <w:tcW w:w="1391" w:type="dxa"/>
             <w:tcBorders/>
             <w:vAlign w:val="center"/>
           </w:tcPr>
@@ -1320,7 +1320,7 @@
         </w:tc>
         <w:tc>
           <w:tcPr>
-            <w:tcW w:w="7791" w:type="dxa"/>
+            <w:tcW w:w="4792" w:type="dxa"/>
             <w:tcBorders/>
             <w:vAlign w:val="center"/>
           </w:tcPr>
@@ -1354,7 +1354,7 @@
         <w:trPr/>
         <w:tc>
           <w:tcPr>
-            <w:tcW w:w="1765" w:type="dxa"/>
+            <w:tcW w:w="1391" w:type="dxa"/>
             <w:tcBorders/>
             <w:vAlign w:val="center"/>
           </w:tcPr>
@@ -1377,7 +1377,7 @@
         </w:tc>
         <w:tc>
           <w:tcPr>
-            <w:tcW w:w="7791" w:type="dxa"/>
+            <w:tcW w:w="4792" w:type="dxa"/>
             <w:tcBorders/>
             <w:vAlign w:val="center"/>
           </w:tcPr>
@@ -1421,7 +1421,7 @@
         <w:trPr/>
         <w:tc>
           <w:tcPr>
-            <w:tcW w:w="1765" w:type="dxa"/>
+            <w:tcW w:w="1391" w:type="dxa"/>
             <w:tcBorders/>
             <w:vAlign w:val="center"/>
           </w:tcPr>
@@ -1444,7 +1444,7 @@
         </w:tc>
         <w:tc>
           <w:tcPr>
-            <w:tcW w:w="7791" w:type="dxa"/>
+            <w:tcW w:w="4792" w:type="dxa"/>
             <w:tcBorders/>
             <w:vAlign w:val="center"/>
           </w:tcPr>
@@ -1468,7 +1468,7 @@
         <w:trPr/>
         <w:tc>
           <w:tcPr>
-            <w:tcW w:w="1765" w:type="dxa"/>
+            <w:tcW w:w="1391" w:type="dxa"/>
             <w:tcBorders/>
             <w:vAlign w:val="center"/>
           </w:tcPr>
@@ -1491,7 +1491,7 @@
         </w:tc>
         <w:tc>
           <w:tcPr>
-            <w:tcW w:w="7791" w:type="dxa"/>
+            <w:tcW w:w="4792" w:type="dxa"/>
             <w:tcBorders/>
             <w:vAlign w:val="center"/>
           </w:tcPr>
@@ -1515,7 +1515,7 @@
         <w:trPr/>
         <w:tc>
           <w:tcPr>
-            <w:tcW w:w="1765" w:type="dxa"/>
+            <w:tcW w:w="1391" w:type="dxa"/>
             <w:tcBorders/>
             <w:vAlign w:val="center"/>
           </w:tcPr>
@@ -1538,7 +1538,7 @@
         </w:tc>
         <w:tc>
           <w:tcPr>
-            <w:tcW w:w="7791" w:type="dxa"/>
+            <w:tcW w:w="4792" w:type="dxa"/>
             <w:tcBorders/>
             <w:vAlign w:val="center"/>
           </w:tcPr>
@@ -2145,9 +2145,9 @@
     </w:p>
     <w:tbl>
       <w:tblPr>
-        <w:tblW w:w="11339" w:type="dxa"/>
-        <w:jc w:val="left"/>
-        <w:tblInd w:w="28" w:type="dxa"/>
+        <w:tblW w:w="6183" w:type="dxa"/>
+        <w:jc w:val="left"/>
+        <w:tblInd w:w="0" w:type="dxa"/>
         <w:tblLayout w:type="fixed"/>
         <w:tblCellMar>
           <w:top w:w="28" w:type="dxa"/>
@@ -2157,9 +2157,9 @@
         </w:tblCellMar>
       </w:tblPr>
       <w:tblGrid>
-        <w:gridCol w:w="1544"/>
-        <w:gridCol w:w="5677"/>
-        <w:gridCol w:w="4118"/>
+        <w:gridCol w:w="1232"/>
+        <w:gridCol w:w="2461"/>
+        <w:gridCol w:w="2490"/>
       </w:tblGrid>
       <w:tr>
         <w:trPr>
@@ -2167,7 +2167,7 @@
         </w:trPr>
         <w:tc>
           <w:tcPr>
-            <w:tcW w:w="1544" w:type="dxa"/>
+            <w:tcW w:w="1232" w:type="dxa"/>
             <w:tcBorders/>
             <w:vAlign w:val="center"/>
           </w:tcPr>
@@ -2189,7 +2189,7 @@
         </w:tc>
         <w:tc>
           <w:tcPr>
-            <w:tcW w:w="5677" w:type="dxa"/>
+            <w:tcW w:w="2461" w:type="dxa"/>
             <w:tcBorders/>
             <w:vAlign w:val="center"/>
           </w:tcPr>
@@ -2211,7 +2211,7 @@
         </w:tc>
         <w:tc>
           <w:tcPr>
-            <w:tcW w:w="4118" w:type="dxa"/>
+            <w:tcW w:w="2490" w:type="dxa"/>
             <w:tcBorders/>
             <w:vAlign w:val="center"/>
           </w:tcPr>
@@ -2236,7 +2236,7 @@
         <w:trPr/>
         <w:tc>
           <w:tcPr>
-            <w:tcW w:w="1544" w:type="dxa"/>
+            <w:tcW w:w="1232" w:type="dxa"/>
             <w:tcBorders/>
             <w:vAlign w:val="center"/>
           </w:tcPr>
@@ -2259,7 +2259,7 @@
         </w:tc>
         <w:tc>
           <w:tcPr>
-            <w:tcW w:w="5677" w:type="dxa"/>
+            <w:tcW w:w="2461" w:type="dxa"/>
             <w:tcBorders/>
             <w:vAlign w:val="center"/>
           </w:tcPr>
@@ -2280,7 +2280,7 @@
         </w:tc>
         <w:tc>
           <w:tcPr>
-            <w:tcW w:w="4118" w:type="dxa"/>
+            <w:tcW w:w="2490" w:type="dxa"/>
             <w:tcBorders/>
             <w:vAlign w:val="center"/>
           </w:tcPr>
@@ -2304,7 +2304,7 @@
         <w:trPr/>
         <w:tc>
           <w:tcPr>
-            <w:tcW w:w="1544" w:type="dxa"/>
+            <w:tcW w:w="1232" w:type="dxa"/>
             <w:tcBorders/>
             <w:vAlign w:val="center"/>
           </w:tcPr>
@@ -2327,7 +2327,7 @@
         </w:tc>
         <w:tc>
           <w:tcPr>
-            <w:tcW w:w="5677" w:type="dxa"/>
+            <w:tcW w:w="2461" w:type="dxa"/>
             <w:tcBorders/>
             <w:vAlign w:val="center"/>
           </w:tcPr>
@@ -2348,7 +2348,7 @@
         </w:tc>
         <w:tc>
           <w:tcPr>
-            <w:tcW w:w="4118" w:type="dxa"/>
+            <w:tcW w:w="2490" w:type="dxa"/>
             <w:tcBorders/>
             <w:vAlign w:val="center"/>
           </w:tcPr>
@@ -2372,7 +2372,7 @@
         <w:trPr/>
         <w:tc>
           <w:tcPr>
-            <w:tcW w:w="1544" w:type="dxa"/>
+            <w:tcW w:w="1232" w:type="dxa"/>
             <w:tcBorders/>
             <w:vAlign w:val="center"/>
           </w:tcPr>
@@ -2399,7 +2399,7 @@
         </w:tc>
         <w:tc>
           <w:tcPr>
-            <w:tcW w:w="5677" w:type="dxa"/>
+            <w:tcW w:w="2461" w:type="dxa"/>
             <w:tcBorders/>
             <w:vAlign w:val="center"/>
           </w:tcPr>
@@ -2426,7 +2426,7 @@
         </w:tc>
         <w:tc>
           <w:tcPr>
-            <w:tcW w:w="4118" w:type="dxa"/>
+            <w:tcW w:w="2490" w:type="dxa"/>
             <w:tcBorders/>
             <w:vAlign w:val="center"/>
           </w:tcPr>
@@ -3728,9 +3728,9 @@
     </w:p>
     <w:tbl>
       <w:tblPr>
-        <w:tblW w:w="11339" w:type="dxa"/>
-        <w:jc w:val="left"/>
-        <w:tblInd w:w="28" w:type="dxa"/>
+        <w:tblW w:w="6183" w:type="dxa"/>
+        <w:jc w:val="left"/>
+        <w:tblInd w:w="0" w:type="dxa"/>
         <w:tblLayout w:type="fixed"/>
         <w:tblCellMar>
           <w:top w:w="28" w:type="dxa"/>
@@ -3740,9 +3740,9 @@
         </w:tblCellMar>
       </w:tblPr>
       <w:tblGrid>
-        <w:gridCol w:w="3794"/>
-        <w:gridCol w:w="2810"/>
-        <w:gridCol w:w="4735"/>
+        <w:gridCol w:w="1996"/>
+        <w:gridCol w:w="1231"/>
+        <w:gridCol w:w="2956"/>
       </w:tblGrid>
       <w:tr>
         <w:trPr>
@@ -3750,7 +3750,7 @@
         </w:trPr>
         <w:tc>
           <w:tcPr>
-            <w:tcW w:w="3794" w:type="dxa"/>
+            <w:tcW w:w="1996" w:type="dxa"/>
             <w:tcBorders/>
             <w:vAlign w:val="center"/>
           </w:tcPr>
@@ -3772,7 +3772,7 @@
         </w:tc>
         <w:tc>
           <w:tcPr>
-            <w:tcW w:w="2810" w:type="dxa"/>
+            <w:tcW w:w="1231" w:type="dxa"/>
             <w:tcBorders/>
             <w:vAlign w:val="center"/>
           </w:tcPr>
@@ -3794,7 +3794,7 @@
         </w:tc>
         <w:tc>
           <w:tcPr>
-            <w:tcW w:w="4735" w:type="dxa"/>
+            <w:tcW w:w="2956" w:type="dxa"/>
             <w:tcBorders/>
             <w:vAlign w:val="center"/>
           </w:tcPr>
@@ -3819,7 +3819,7 @@
         <w:trPr/>
         <w:tc>
           <w:tcPr>
-            <w:tcW w:w="3794" w:type="dxa"/>
+            <w:tcW w:w="1996" w:type="dxa"/>
             <w:tcBorders/>
             <w:vAlign w:val="center"/>
           </w:tcPr>
@@ -3862,7 +3862,7 @@
         </w:tc>
         <w:tc>
           <w:tcPr>
-            <w:tcW w:w="2810" w:type="dxa"/>
+            <w:tcW w:w="1231" w:type="dxa"/>
             <w:tcBorders/>
             <w:vAlign w:val="center"/>
           </w:tcPr>
@@ -3883,7 +3883,7 @@
         </w:tc>
         <w:tc>
           <w:tcPr>
-            <w:tcW w:w="4735" w:type="dxa"/>
+            <w:tcW w:w="2956" w:type="dxa"/>
             <w:tcBorders/>
             <w:vAlign w:val="center"/>
           </w:tcPr>
@@ -3907,7 +3907,7 @@
         <w:trPr/>
         <w:tc>
           <w:tcPr>
-            <w:tcW w:w="3794" w:type="dxa"/>
+            <w:tcW w:w="1996" w:type="dxa"/>
             <w:tcBorders/>
             <w:vAlign w:val="center"/>
           </w:tcPr>
@@ -3930,7 +3930,7 @@
         </w:tc>
         <w:tc>
           <w:tcPr>
-            <w:tcW w:w="2810" w:type="dxa"/>
+            <w:tcW w:w="1231" w:type="dxa"/>
             <w:tcBorders/>
             <w:vAlign w:val="center"/>
           </w:tcPr>
@@ -3951,7 +3951,7 @@
         </w:tc>
         <w:tc>
           <w:tcPr>
-            <w:tcW w:w="4735" w:type="dxa"/>
+            <w:tcW w:w="2956" w:type="dxa"/>
             <w:tcBorders/>
             <w:vAlign w:val="center"/>
           </w:tcPr>
@@ -3975,7 +3975,7 @@
         <w:trPr/>
         <w:tc>
           <w:tcPr>
-            <w:tcW w:w="3794" w:type="dxa"/>
+            <w:tcW w:w="1996" w:type="dxa"/>
             <w:tcBorders/>
             <w:vAlign w:val="center"/>
           </w:tcPr>
@@ -4018,7 +4018,7 @@
         </w:tc>
         <w:tc>
           <w:tcPr>
-            <w:tcW w:w="2810" w:type="dxa"/>
+            <w:tcW w:w="1231" w:type="dxa"/>
             <w:tcBorders/>
             <w:vAlign w:val="center"/>
           </w:tcPr>
@@ -4039,7 +4039,7 @@
         </w:tc>
         <w:tc>
           <w:tcPr>
-            <w:tcW w:w="4735" w:type="dxa"/>
+            <w:tcW w:w="2956" w:type="dxa"/>
             <w:tcBorders/>
             <w:vAlign w:val="center"/>
           </w:tcPr>
@@ -4063,7 +4063,7 @@
         <w:trPr/>
         <w:tc>
           <w:tcPr>
-            <w:tcW w:w="3794" w:type="dxa"/>
+            <w:tcW w:w="1996" w:type="dxa"/>
             <w:tcBorders/>
             <w:vAlign w:val="center"/>
           </w:tcPr>
@@ -4096,7 +4096,7 @@
         </w:tc>
         <w:tc>
           <w:tcPr>
-            <w:tcW w:w="2810" w:type="dxa"/>
+            <w:tcW w:w="1231" w:type="dxa"/>
             <w:tcBorders/>
             <w:vAlign w:val="center"/>
           </w:tcPr>
@@ -4117,7 +4117,7 @@
         </w:tc>
         <w:tc>
           <w:tcPr>
-            <w:tcW w:w="4735" w:type="dxa"/>
+            <w:tcW w:w="2956" w:type="dxa"/>
             <w:tcBorders/>
             <w:vAlign w:val="center"/>
           </w:tcPr>
@@ -4151,7 +4151,7 @@
         <w:trPr/>
         <w:tc>
           <w:tcPr>
-            <w:tcW w:w="3794" w:type="dxa"/>
+            <w:tcW w:w="1996" w:type="dxa"/>
             <w:tcBorders/>
             <w:vAlign w:val="center"/>
           </w:tcPr>
@@ -4174,7 +4174,7 @@
         </w:tc>
         <w:tc>
           <w:tcPr>
-            <w:tcW w:w="2810" w:type="dxa"/>
+            <w:tcW w:w="1231" w:type="dxa"/>
             <w:tcBorders/>
             <w:vAlign w:val="center"/>
           </w:tcPr>
@@ -4195,7 +4195,7 @@
         </w:tc>
         <w:tc>
           <w:tcPr>
-            <w:tcW w:w="4735" w:type="dxa"/>
+            <w:tcW w:w="2956" w:type="dxa"/>
             <w:tcBorders/>
             <w:vAlign w:val="center"/>
           </w:tcPr>
@@ -4219,7 +4219,7 @@
         <w:trPr/>
         <w:tc>
           <w:tcPr>
-            <w:tcW w:w="3794" w:type="dxa"/>
+            <w:tcW w:w="1996" w:type="dxa"/>
             <w:tcBorders/>
             <w:vAlign w:val="center"/>
           </w:tcPr>
@@ -4242,7 +4242,7 @@
         </w:tc>
         <w:tc>
           <w:tcPr>
-            <w:tcW w:w="2810" w:type="dxa"/>
+            <w:tcW w:w="1231" w:type="dxa"/>
             <w:tcBorders/>
             <w:vAlign w:val="center"/>
           </w:tcPr>
@@ -4263,7 +4263,7 @@
         </w:tc>
         <w:tc>
           <w:tcPr>
-            <w:tcW w:w="4735" w:type="dxa"/>
+            <w:tcW w:w="2956" w:type="dxa"/>
             <w:tcBorders/>
             <w:vAlign w:val="center"/>
           </w:tcPr>
@@ -4287,7 +4287,7 @@
         <w:trPr/>
         <w:tc>
           <w:tcPr>
-            <w:tcW w:w="3794" w:type="dxa"/>
+            <w:tcW w:w="1996" w:type="dxa"/>
             <w:tcBorders/>
             <w:vAlign w:val="center"/>
           </w:tcPr>
@@ -4310,7 +4310,7 @@
         </w:tc>
         <w:tc>
           <w:tcPr>
-            <w:tcW w:w="2810" w:type="dxa"/>
+            <w:tcW w:w="1231" w:type="dxa"/>
             <w:tcBorders/>
             <w:vAlign w:val="center"/>
           </w:tcPr>
@@ -4331,7 +4331,7 @@
         </w:tc>
         <w:tc>
           <w:tcPr>
-            <w:tcW w:w="4735" w:type="dxa"/>
+            <w:tcW w:w="2956" w:type="dxa"/>
             <w:tcBorders/>
             <w:vAlign w:val="center"/>
           </w:tcPr>
@@ -4355,7 +4355,7 @@
         <w:trPr/>
         <w:tc>
           <w:tcPr>
-            <w:tcW w:w="3794" w:type="dxa"/>
+            <w:tcW w:w="1996" w:type="dxa"/>
             <w:tcBorders/>
             <w:vAlign w:val="center"/>
           </w:tcPr>
@@ -4378,7 +4378,7 @@
         </w:tc>
         <w:tc>
           <w:tcPr>
-            <w:tcW w:w="2810" w:type="dxa"/>
+            <w:tcW w:w="1231" w:type="dxa"/>
             <w:tcBorders/>
             <w:vAlign w:val="center"/>
           </w:tcPr>
@@ -4399,7 +4399,7 @@
         </w:tc>
         <w:tc>
           <w:tcPr>
-            <w:tcW w:w="4735" w:type="dxa"/>
+            <w:tcW w:w="2956" w:type="dxa"/>
             <w:tcBorders/>
             <w:vAlign w:val="center"/>
           </w:tcPr>
@@ -4423,7 +4423,7 @@
         <w:trPr/>
         <w:tc>
           <w:tcPr>
-            <w:tcW w:w="3794" w:type="dxa"/>
+            <w:tcW w:w="1996" w:type="dxa"/>
             <w:tcBorders/>
             <w:vAlign w:val="center"/>
           </w:tcPr>
@@ -4446,7 +4446,7 @@
         </w:tc>
         <w:tc>
           <w:tcPr>
-            <w:tcW w:w="2810" w:type="dxa"/>
+            <w:tcW w:w="1231" w:type="dxa"/>
             <w:tcBorders/>
             <w:vAlign w:val="center"/>
           </w:tcPr>
@@ -4467,7 +4467,7 @@
         </w:tc>
         <w:tc>
           <w:tcPr>
-            <w:tcW w:w="4735" w:type="dxa"/>
+            <w:tcW w:w="2956" w:type="dxa"/>
             <w:tcBorders/>
             <w:vAlign w:val="center"/>
           </w:tcPr>
@@ -4501,7 +4501,7 @@
         <w:trPr/>
         <w:tc>
           <w:tcPr>
-            <w:tcW w:w="3794" w:type="dxa"/>
+            <w:tcW w:w="1996" w:type="dxa"/>
             <w:tcBorders/>
             <w:vAlign w:val="center"/>
           </w:tcPr>
@@ -4524,7 +4524,7 @@
         </w:tc>
         <w:tc>
           <w:tcPr>
-            <w:tcW w:w="2810" w:type="dxa"/>
+            <w:tcW w:w="1231" w:type="dxa"/>
             <w:tcBorders/>
             <w:vAlign w:val="center"/>
           </w:tcPr>
@@ -4545,7 +4545,7 @@
         </w:tc>
         <w:tc>
           <w:tcPr>
-            <w:tcW w:w="4735" w:type="dxa"/>
+            <w:tcW w:w="2956" w:type="dxa"/>
             <w:tcBorders/>
             <w:vAlign w:val="center"/>
           </w:tcPr>
@@ -4569,7 +4569,7 @@
         <w:trPr/>
         <w:tc>
           <w:tcPr>
-            <w:tcW w:w="3794" w:type="dxa"/>
+            <w:tcW w:w="1996" w:type="dxa"/>
             <w:tcBorders/>
             <w:vAlign w:val="center"/>
           </w:tcPr>
@@ -4592,7 +4592,7 @@
         </w:tc>
         <w:tc>
           <w:tcPr>
-            <w:tcW w:w="2810" w:type="dxa"/>
+            <w:tcW w:w="1231" w:type="dxa"/>
             <w:tcBorders/>
             <w:vAlign w:val="center"/>
           </w:tcPr>
@@ -4613,7 +4613,7 @@
         </w:tc>
         <w:tc>
           <w:tcPr>
-            <w:tcW w:w="4735" w:type="dxa"/>
+            <w:tcW w:w="2956" w:type="dxa"/>
             <w:tcBorders/>
             <w:vAlign w:val="center"/>
           </w:tcPr>
@@ -4637,7 +4637,7 @@
         <w:trPr/>
         <w:tc>
           <w:tcPr>
-            <w:tcW w:w="3794" w:type="dxa"/>
+            <w:tcW w:w="1996" w:type="dxa"/>
             <w:tcBorders/>
             <w:vAlign w:val="center"/>
           </w:tcPr>
@@ -4660,7 +4660,7 @@
         </w:tc>
         <w:tc>
           <w:tcPr>
-            <w:tcW w:w="2810" w:type="dxa"/>
+            <w:tcW w:w="1231" w:type="dxa"/>
             <w:tcBorders/>
             <w:vAlign w:val="center"/>
           </w:tcPr>
@@ -4681,7 +4681,7 @@
         </w:tc>
         <w:tc>
           <w:tcPr>
-            <w:tcW w:w="4735" w:type="dxa"/>
+            <w:tcW w:w="2956" w:type="dxa"/>
             <w:tcBorders/>
             <w:vAlign w:val="center"/>
           </w:tcPr>
@@ -4711,7 +4711,7 @@
         <w:trPr/>
         <w:tc>
           <w:tcPr>
-            <w:tcW w:w="3794" w:type="dxa"/>
+            <w:tcW w:w="1996" w:type="dxa"/>
             <w:tcBorders/>
             <w:vAlign w:val="center"/>
           </w:tcPr>
@@ -4734,7 +4734,7 @@
         </w:tc>
         <w:tc>
           <w:tcPr>
-            <w:tcW w:w="2810" w:type="dxa"/>
+            <w:tcW w:w="1231" w:type="dxa"/>
             <w:tcBorders/>
             <w:vAlign w:val="center"/>
           </w:tcPr>
@@ -4755,7 +4755,7 @@
         </w:tc>
         <w:tc>
           <w:tcPr>
-            <w:tcW w:w="4735" w:type="dxa"/>
+            <w:tcW w:w="2956" w:type="dxa"/>
             <w:tcBorders/>
             <w:vAlign w:val="center"/>
           </w:tcPr>
@@ -4779,7 +4779,7 @@
         <w:trPr/>
         <w:tc>
           <w:tcPr>
-            <w:tcW w:w="3794" w:type="dxa"/>
+            <w:tcW w:w="1996" w:type="dxa"/>
             <w:tcBorders/>
             <w:vAlign w:val="center"/>
           </w:tcPr>
@@ -4802,7 +4802,7 @@
         </w:tc>
         <w:tc>
           <w:tcPr>
-            <w:tcW w:w="2810" w:type="dxa"/>
+            <w:tcW w:w="1231" w:type="dxa"/>
             <w:tcBorders/>
             <w:vAlign w:val="center"/>
           </w:tcPr>
@@ -4823,7 +4823,7 @@
         </w:tc>
         <w:tc>
           <w:tcPr>
-            <w:tcW w:w="4735" w:type="dxa"/>
+            <w:tcW w:w="2956" w:type="dxa"/>
             <w:tcBorders/>
             <w:vAlign w:val="center"/>
           </w:tcPr>
@@ -4847,7 +4847,7 @@
         <w:trPr/>
         <w:tc>
           <w:tcPr>
-            <w:tcW w:w="3794" w:type="dxa"/>
+            <w:tcW w:w="1996" w:type="dxa"/>
             <w:tcBorders/>
             <w:vAlign w:val="center"/>
           </w:tcPr>
@@ -4870,7 +4870,7 @@
         </w:tc>
         <w:tc>
           <w:tcPr>
-            <w:tcW w:w="2810" w:type="dxa"/>
+            <w:tcW w:w="1231" w:type="dxa"/>
             <w:tcBorders/>
             <w:vAlign w:val="center"/>
           </w:tcPr>
@@ -4891,7 +4891,7 @@
         </w:tc>
         <w:tc>
           <w:tcPr>
-            <w:tcW w:w="4735" w:type="dxa"/>
+            <w:tcW w:w="2956" w:type="dxa"/>
             <w:tcBorders/>
             <w:vAlign w:val="center"/>
           </w:tcPr>
@@ -4915,7 +4915,7 @@
         <w:trPr/>
         <w:tc>
           <w:tcPr>
-            <w:tcW w:w="3794" w:type="dxa"/>
+            <w:tcW w:w="1996" w:type="dxa"/>
             <w:tcBorders/>
             <w:vAlign w:val="center"/>
           </w:tcPr>
@@ -4938,7 +4938,7 @@
         </w:tc>
         <w:tc>
           <w:tcPr>
-            <w:tcW w:w="2810" w:type="dxa"/>
+            <w:tcW w:w="1231" w:type="dxa"/>
             <w:tcBorders/>
             <w:vAlign w:val="center"/>
           </w:tcPr>
@@ -4959,7 +4959,7 @@
         </w:tc>
         <w:tc>
           <w:tcPr>
-            <w:tcW w:w="4735" w:type="dxa"/>
+            <w:tcW w:w="2956" w:type="dxa"/>
             <w:tcBorders/>
             <w:vAlign w:val="center"/>
           </w:tcPr>
@@ -4989,7 +4989,7 @@
         <w:trPr/>
         <w:tc>
           <w:tcPr>
-            <w:tcW w:w="3794" w:type="dxa"/>
+            <w:tcW w:w="1996" w:type="dxa"/>
             <w:tcBorders/>
             <w:vAlign w:val="center"/>
           </w:tcPr>
@@ -5012,7 +5012,7 @@
         </w:tc>
         <w:tc>
           <w:tcPr>
-            <w:tcW w:w="2810" w:type="dxa"/>
+            <w:tcW w:w="1231" w:type="dxa"/>
             <w:tcBorders/>
             <w:vAlign w:val="center"/>
           </w:tcPr>
@@ -5033,7 +5033,7 @@
         </w:tc>
         <w:tc>
           <w:tcPr>
-            <w:tcW w:w="4735" w:type="dxa"/>
+            <w:tcW w:w="2956" w:type="dxa"/>
             <w:tcBorders/>
             <w:vAlign w:val="center"/>
           </w:tcPr>
@@ -5067,7 +5067,7 @@
         <w:trPr/>
         <w:tc>
           <w:tcPr>
-            <w:tcW w:w="3794" w:type="dxa"/>
+            <w:tcW w:w="1996" w:type="dxa"/>
             <w:tcBorders/>
             <w:vAlign w:val="center"/>
           </w:tcPr>
@@ -5110,7 +5110,7 @@
         </w:tc>
         <w:tc>
           <w:tcPr>
-            <w:tcW w:w="2810" w:type="dxa"/>
+            <w:tcW w:w="1231" w:type="dxa"/>
             <w:tcBorders/>
             <w:vAlign w:val="center"/>
           </w:tcPr>
@@ -5131,7 +5131,7 @@
         </w:tc>
         <w:tc>
           <w:tcPr>
-            <w:tcW w:w="4735" w:type="dxa"/>
+            <w:tcW w:w="2956" w:type="dxa"/>
             <w:tcBorders/>
             <w:vAlign w:val="center"/>
           </w:tcPr>
@@ -5181,9 +5181,9 @@
     </w:p>
     <w:tbl>
       <w:tblPr>
-        <w:tblW w:w="11339" w:type="dxa"/>
-        <w:jc w:val="left"/>
-        <w:tblInd w:w="28" w:type="dxa"/>
+        <w:tblW w:w="6183" w:type="dxa"/>
+        <w:jc w:val="left"/>
+        <w:tblInd w:w="0" w:type="dxa"/>
         <w:tblLayout w:type="fixed"/>
         <w:tblCellMar>
           <w:top w:w="28" w:type="dxa"/>
@@ -5193,9 +5193,9 @@
         </w:tblCellMar>
       </w:tblPr>
       <w:tblGrid>
-        <w:gridCol w:w="7637"/>
-        <w:gridCol w:w="2139"/>
-        <w:gridCol w:w="1563"/>
+        <w:gridCol w:w="3141"/>
+        <w:gridCol w:w="1480"/>
+        <w:gridCol w:w="1562"/>
       </w:tblGrid>
       <w:tr>
         <w:trPr>
@@ -5203,7 +5203,7 @@
         </w:trPr>
         <w:tc>
           <w:tcPr>
-            <w:tcW w:w="7637" w:type="dxa"/>
+            <w:tcW w:w="3141" w:type="dxa"/>
             <w:tcBorders/>
             <w:vAlign w:val="center"/>
           </w:tcPr>
@@ -5225,7 +5225,7 @@
         </w:tc>
         <w:tc>
           <w:tcPr>
-            <w:tcW w:w="2139" w:type="dxa"/>
+            <w:tcW w:w="1480" w:type="dxa"/>
             <w:tcBorders/>
             <w:vAlign w:val="center"/>
           </w:tcPr>
@@ -5247,7 +5247,7 @@
         </w:tc>
         <w:tc>
           <w:tcPr>
-            <w:tcW w:w="1563" w:type="dxa"/>
+            <w:tcW w:w="1562" w:type="dxa"/>
             <w:tcBorders/>
             <w:vAlign w:val="center"/>
           </w:tcPr>
@@ -5272,7 +5272,7 @@
         <w:trPr/>
         <w:tc>
           <w:tcPr>
-            <w:tcW w:w="7637" w:type="dxa"/>
+            <w:tcW w:w="3141" w:type="dxa"/>
             <w:tcBorders/>
             <w:vAlign w:val="center"/>
           </w:tcPr>
@@ -5299,7 +5299,7 @@
         </w:tc>
         <w:tc>
           <w:tcPr>
-            <w:tcW w:w="2139" w:type="dxa"/>
+            <w:tcW w:w="1480" w:type="dxa"/>
             <w:tcBorders/>
             <w:vAlign w:val="center"/>
           </w:tcPr>
@@ -5320,7 +5320,7 @@
         </w:tc>
         <w:tc>
           <w:tcPr>
-            <w:tcW w:w="1563" w:type="dxa"/>
+            <w:tcW w:w="1562" w:type="dxa"/>
             <w:tcBorders/>
             <w:vAlign w:val="center"/>
           </w:tcPr>
@@ -5346,7 +5346,7 @@
         <w:trPr/>
         <w:tc>
           <w:tcPr>
-            <w:tcW w:w="7637" w:type="dxa"/>
+            <w:tcW w:w="3141" w:type="dxa"/>
             <w:tcBorders/>
             <w:vAlign w:val="center"/>
           </w:tcPr>
@@ -5373,7 +5373,7 @@
         </w:tc>
         <w:tc>
           <w:tcPr>
-            <w:tcW w:w="2139" w:type="dxa"/>
+            <w:tcW w:w="1480" w:type="dxa"/>
             <w:tcBorders/>
             <w:vAlign w:val="center"/>
           </w:tcPr>
@@ -5394,7 +5394,7 @@
         </w:tc>
         <w:tc>
           <w:tcPr>
-            <w:tcW w:w="1563" w:type="dxa"/>
+            <w:tcW w:w="1562" w:type="dxa"/>
             <w:tcBorders/>
             <w:vAlign w:val="center"/>
           </w:tcPr>
@@ -5420,7 +5420,7 @@
         <w:trPr/>
         <w:tc>
           <w:tcPr>
-            <w:tcW w:w="7637" w:type="dxa"/>
+            <w:tcW w:w="3141" w:type="dxa"/>
             <w:tcBorders/>
             <w:vAlign w:val="center"/>
           </w:tcPr>
@@ -5441,7 +5441,7 @@
         </w:tc>
         <w:tc>
           <w:tcPr>
-            <w:tcW w:w="2139" w:type="dxa"/>
+            <w:tcW w:w="1480" w:type="dxa"/>
             <w:tcBorders/>
             <w:vAlign w:val="center"/>
           </w:tcPr>
@@ -5462,7 +5462,7 @@
         </w:tc>
         <w:tc>
           <w:tcPr>
-            <w:tcW w:w="1563" w:type="dxa"/>
+            <w:tcW w:w="1562" w:type="dxa"/>
             <w:tcBorders/>
             <w:vAlign w:val="center"/>
           </w:tcPr>
@@ -5488,69 +5488,49 @@
         <w:trPr/>
         <w:tc>
           <w:tcPr>
-            <w:tcW w:w="7637" w:type="dxa"/>
-            <w:tcBorders/>
-            <w:vAlign w:val="center"/>
-          </w:tcPr>
-          <w:p>
-            <w:pPr>
-              <w:pStyle w:val="TableContents"/>
-              <w:shd w:fill="2E3440" w:val="clear"/>
-              <w:bidi w:val="0"/>
-              <w:spacing w:before="120" w:after="120"/>
-              <w:jc w:val="left"/>
-              <w:rPr/>
-            </w:pPr>
-            <w:r>
-              <w:rPr/>
-              <w:t xml:space="preserve">A wave: tickets run in parallel (since L-0727 as the </w:t>
-            </w:r>
-            <w:r>
-              <w:rPr>
-                <w:rStyle w:val="SourceText"/>
-              </w:rPr>
-              <w:t>/crew:wave</w:t>
-            </w:r>
-            <w:r>
-              <w:rPr/>
-              <w:t xml:space="preserve"> workflow, </w:t>
-            </w:r>
-            <w:r>
-              <w:rPr>
-                <w:rStyle w:val="SourceText"/>
-              </w:rPr>
-              <w:t>{"set": "&lt;slug&gt;"}</w:t>
-            </w:r>
-            <w:r>
-              <w:rPr/>
-              <w:t>)</w:t>
-            </w:r>
-          </w:p>
-        </w:tc>
-        <w:tc>
-          <w:tcPr>
-            <w:tcW w:w="2139" w:type="dxa"/>
-            <w:tcBorders/>
-            <w:vAlign w:val="center"/>
-          </w:tcPr>
-          <w:p>
-            <w:pPr>
-              <w:pStyle w:val="TableContents"/>
-              <w:shd w:fill="2E3440" w:val="clear"/>
-              <w:bidi w:val="0"/>
-              <w:spacing w:before="120" w:after="120"/>
-              <w:jc w:val="left"/>
-              <w:rPr/>
-            </w:pPr>
-            <w:r>
-              <w:rPr/>
-              <w:t>T-0029, L-0727</w:t>
-            </w:r>
-          </w:p>
-        </w:tc>
-        <w:tc>
-          <w:tcPr>
-            <w:tcW w:w="1563" w:type="dxa"/>
+            <w:tcW w:w="3141" w:type="dxa"/>
+            <w:tcBorders/>
+            <w:vAlign w:val="center"/>
+          </w:tcPr>
+          <w:p>
+            <w:pPr>
+              <w:pStyle w:val="TableContents"/>
+              <w:shd w:fill="2E3440" w:val="clear"/>
+              <w:bidi w:val="0"/>
+              <w:spacing w:before="120" w:after="120"/>
+              <w:jc w:val="left"/>
+              <w:rPr/>
+            </w:pPr>
+            <w:r>
+              <w:rPr/>
+              <w:t>A wave: tickets run in parallel</w:t>
+            </w:r>
+          </w:p>
+        </w:tc>
+        <w:tc>
+          <w:tcPr>
+            <w:tcW w:w="1480" w:type="dxa"/>
+            <w:tcBorders/>
+            <w:vAlign w:val="center"/>
+          </w:tcPr>
+          <w:p>
+            <w:pPr>
+              <w:pStyle w:val="TableContents"/>
+              <w:shd w:fill="2E3440" w:val="clear"/>
+              <w:bidi w:val="0"/>
+              <w:spacing w:before="120" w:after="120"/>
+              <w:jc w:val="left"/>
+              <w:rPr/>
+            </w:pPr>
+            <w:r>
+              <w:rPr/>
+              <w:t>T-0029</w:t>
+            </w:r>
+          </w:p>
+        </w:tc>
+        <w:tc>
+          <w:tcPr>
+            <w:tcW w:w="1562" w:type="dxa"/>
             <w:tcBorders/>
             <w:vAlign w:val="center"/>
           </w:tcPr>
@@ -5576,7 +5556,7 @@
         <w:trPr/>
         <w:tc>
           <w:tcPr>
-            <w:tcW w:w="7637" w:type="dxa"/>
+            <w:tcW w:w="3141" w:type="dxa"/>
             <w:tcBorders/>
             <w:vAlign w:val="center"/>
           </w:tcPr>
@@ -5597,7 +5577,7 @@
         </w:tc>
         <w:tc>
           <w:tcPr>
-            <w:tcW w:w="2139" w:type="dxa"/>
+            <w:tcW w:w="1480" w:type="dxa"/>
             <w:tcBorders/>
             <w:vAlign w:val="center"/>
           </w:tcPr>
@@ -5618,7 +5598,7 @@
         </w:tc>
         <w:tc>
           <w:tcPr>
-            <w:tcW w:w="1563" w:type="dxa"/>
+            <w:tcW w:w="1562" w:type="dxa"/>
             <w:tcBorders/>
             <w:vAlign w:val="center"/>
           </w:tcPr>
@@ -5644,7 +5624,7 @@
         <w:trPr/>
         <w:tc>
           <w:tcPr>
-            <w:tcW w:w="7637" w:type="dxa"/>
+            <w:tcW w:w="3141" w:type="dxa"/>
             <w:tcBorders/>
             <w:vAlign w:val="center"/>
           </w:tcPr>
@@ -5675,7 +5655,7 @@
         </w:tc>
         <w:tc>
           <w:tcPr>
-            <w:tcW w:w="2139" w:type="dxa"/>
+            <w:tcW w:w="1480" w:type="dxa"/>
             <w:tcBorders/>
             <w:vAlign w:val="center"/>
           </w:tcPr>
@@ -5696,7 +5676,7 @@
         </w:tc>
         <w:tc>
           <w:tcPr>
-            <w:tcW w:w="1563" w:type="dxa"/>
+            <w:tcW w:w="1562" w:type="dxa"/>
             <w:tcBorders/>
             <w:vAlign w:val="center"/>
           </w:tcPr>
@@ -5722,7 +5702,7 @@
         <w:trPr/>
         <w:tc>
           <w:tcPr>
-            <w:tcW w:w="7637" w:type="dxa"/>
+            <w:tcW w:w="3141" w:type="dxa"/>
             <w:tcBorders/>
             <w:vAlign w:val="center"/>
           </w:tcPr>
@@ -5743,7 +5723,7 @@
         </w:tc>
         <w:tc>
           <w:tcPr>
-            <w:tcW w:w="2139" w:type="dxa"/>
+            <w:tcW w:w="1480" w:type="dxa"/>
             <w:tcBorders/>
             <w:vAlign w:val="center"/>
           </w:tcPr>
@@ -5764,7 +5744,7 @@
         </w:tc>
         <w:tc>
           <w:tcPr>
-            <w:tcW w:w="1563" w:type="dxa"/>
+            <w:tcW w:w="1562" w:type="dxa"/>
             <w:tcBorders/>
             <w:vAlign w:val="center"/>
           </w:tcPr>
@@ -6630,7 +6610,7 @@
       <w:start w:val="1"/>
       <w:numFmt w:val="none"/>
       <w:suff w:val="nothing"/>
-      <w:lvlText w:val=""/>
+      <w:lvlText w:val="%1"/>
       <w:lvlJc w:val="left"/>
       <w:pPr>
         <w:tabs>
@@ -6641,10 +6621,10 @@
     </w:lvl>
     <w:lvl w:ilvl="1">
       <w:start w:val="1"/>
+      <w:pStyle w:val="Heading2"/>
       <w:numFmt w:val="none"/>
-      <w:pStyle w:val="Heading2"/>
       <w:suff w:val="nothing"/>
-      <w:lvlText w:val=""/>
+      <w:lvlText w:val="%2"/>
       <w:lvlJc w:val="left"/>
       <w:pPr>
         <w:tabs>
@@ -6655,10 +6635,10 @@
     </w:lvl>
     <w:lvl w:ilvl="2">
       <w:start w:val="1"/>
+      <w:pStyle w:val="Heading3"/>
       <w:numFmt w:val="none"/>
-      <w:pStyle w:val="Heading3"/>
       <w:suff w:val="nothing"/>
-      <w:lvlText w:val=""/>
+      <w:lvlText w:val="%3"/>
       <w:lvlJc w:val="left"/>
       <w:pPr>
         <w:tabs>
@@ -6671,7 +6651,7 @@
       <w:start w:val="1"/>
       <w:numFmt w:val="none"/>
       <w:suff w:val="nothing"/>
-      <w:lvlText w:val=""/>
+      <w:lvlText w:val="%4"/>
       <w:lvlJc w:val="left"/>
       <w:pPr>
         <w:tabs>
@@ -6684,7 +6664,7 @@
       <w:start w:val="1"/>
       <w:numFmt w:val="none"/>
       <w:suff w:val="nothing"/>
-      <w:lvlText w:val=""/>
+      <w:lvlText w:val="%5"/>
       <w:lvlJc w:val="left"/>
       <w:pPr>
         <w:tabs>
@@ -6697,7 +6677,7 @@
       <w:start w:val="1"/>
       <w:numFmt w:val="none"/>
       <w:suff w:val="nothing"/>
-      <w:lvlText w:val=""/>
+      <w:lvlText w:val="%6"/>
       <w:lvlJc w:val="left"/>
       <w:pPr>
         <w:tabs>
@@ -6710,7 +6690,7 @@
       <w:start w:val="1"/>
       <w:numFmt w:val="none"/>
       <w:suff w:val="nothing"/>
-      <w:lvlText w:val=""/>
+      <w:lvlText w:val="%7"/>
       <w:lvlJc w:val="left"/>
       <w:pPr>
         <w:tabs>
@@ -6723,7 +6703,7 @@
       <w:start w:val="1"/>
       <w:numFmt w:val="none"/>
       <w:suff w:val="nothing"/>
-      <w:lvlText w:val=""/>
+      <w:lvlText w:val="%8"/>
       <w:lvlJc w:val="left"/>
       <w:pPr>
         <w:tabs>
@@ -6736,7 +6716,7 @@
       <w:start w:val="1"/>
       <w:numFmt w:val="none"/>
       <w:suff w:val="nothing"/>
-      <w:lvlText w:val=""/>
+      <w:lvlText w:val="%9"/>
       <w:lvlJc w:val="left"/>
       <w:pPr>
         <w:tabs>
@@ -6769,7 +6749,7 @@
   <w:docDefaults>
     <w:rPrDefault>
       <w:rPr>
-        <w:rFonts w:ascii="Liberation Serif" w:hAnsi="Liberation Serif" w:eastAsia="Noto Serif CJK SC" w:cs="Noto Sans Devanagari"/>
+        <w:rFonts w:ascii="Liberation Serif" w:hAnsi="Liberation Serif" w:eastAsia="WenQuanYi Zen Hei" w:cs="FreeSans"/>
         <w:sz w:val="24"/>
         <w:szCs w:val="24"/>
         <w:lang w:val="en-US" w:eastAsia="zh-CN" w:bidi="hi-IN"/>
@@ -6799,7 +6779,7 @@
     </w:rPr>
   </w:style>
   <w:style w:type="paragraph" w:styleId="Heading1">
-    <w:name w:val="heading 1"/>
+    <w:name w:val="Heading 1"/>
     <w:basedOn w:val="Heading"/>
     <w:next w:val="BodyText"/>
     <w:qFormat/>
@@ -6807,6 +6787,7 @@
       <w:spacing w:before="240" w:after="80"/>
     </w:pPr>
     <w:rPr>
+      <w:rFonts w:ascii="Noto Sans" w:hAnsi="Noto Sans"/>
       <w:b/>
       <w:bCs/>
       <w:color w:val="88C0D0"/>
@@ -6815,7 +6796,7 @@
     </w:rPr>
   </w:style>
   <w:style w:type="paragraph" w:styleId="Heading2">
-    <w:name w:val="heading 2"/>
+    <w:name w:val="Heading 2"/>
     <w:basedOn w:val="Heading"/>
     <w:next w:val="BodyText"/>
     <w:qFormat/>
@@ -6828,7 +6809,7 @@
       <w:outlineLvl w:val="1"/>
     </w:pPr>
     <w:rPr>
-      <w:rFonts w:ascii="Liberation Serif" w:hAnsi="Liberation Serif" w:eastAsia="Noto Serif CJK SC" w:cs="Noto Sans Devanagari"/>
+      <w:rFonts w:ascii="Liberation Serif" w:hAnsi="Liberation Serif" w:eastAsia="WenQuanYi Zen Hei" w:cs="FreeSans"/>
       <w:b/>
       <w:bCs/>
       <w:color w:val="88C0D0"/>
@@ -6837,7 +6818,7 @@
     </w:rPr>
   </w:style>
   <w:style w:type="paragraph" w:styleId="Heading3">
-    <w:name w:val="heading 3"/>
+    <w:name w:val="Heading 3"/>
     <w:basedOn w:val="Heading"/>
     <w:next w:val="BodyText"/>
     <w:qFormat/>
@@ -6847,24 +6828,12 @@
       <w:outlineLvl w:val="2"/>
     </w:pPr>
     <w:rPr>
-      <w:rFonts w:ascii="Liberation Serif" w:hAnsi="Liberation Serif" w:eastAsia="Noto Serif CJK SC" w:cs="Noto Sans Devanagari"/>
+      <w:rFonts w:ascii="Liberation Serif" w:hAnsi="Liberation Serif" w:eastAsia="WenQuanYi Zen Hei" w:cs="FreeSans"/>
       <w:b/>
       <w:bCs/>
       <w:color w:val="88C0D0"/>
       <w:sz w:val="26"/>
       <w:szCs w:val="26"/>
-    </w:rPr>
-  </w:style>
-  <w:style w:type="character" w:styleId="EndnoteReference">
-    <w:name w:val="endnote reference"/>
-    <w:rPr>
-      <w:vertAlign w:val="superscript"/>
-    </w:rPr>
-  </w:style>
-  <w:style w:type="character" w:styleId="FootnoteReference">
-    <w:name w:val="footnote reference"/>
-    <w:rPr>
-      <w:vertAlign w:val="superscript"/>
     </w:rPr>
   </w:style>
   <w:style w:type="character" w:styleId="EndnoteCharacters">
@@ -6931,7 +6900,7 @@
     </w:rPr>
   </w:style>
   <w:style w:type="paragraph" w:styleId="EnvelopeReturn">
-    <w:name w:val="envelope return"/>
+    <w:name w:val="Envelope Return"/>
     <w:basedOn w:val="Normal"/>
     <w:pPr/>
     <w:rPr>
@@ -6950,6 +6919,46 @@
       <w:color w:val="ECEFF4"/>
     </w:rPr>
   </w:style>
+  <w:style w:type="paragraph" w:styleId="Footer">
+    <w:name w:val="Footer"/>
+    <w:basedOn w:val="Normal"/>
+    <w:pPr>
+      <w:suppressLineNumbers/>
+      <w:tabs>
+        <w:tab w:val="clear" w:pos="1134"/>
+        <w:tab w:val="center" w:pos="5952" w:leader="none"/>
+        <w:tab w:val="right" w:pos="10771" w:leader="none"/>
+      </w:tabs>
+    </w:pPr>
+    <w:rPr/>
+  </w:style>
+  <w:style w:type="paragraph" w:styleId="Header">
+    <w:name w:val="Header"/>
+    <w:basedOn w:val="Normal"/>
+    <w:pPr>
+      <w:suppressLineNumbers/>
+      <w:tabs>
+        <w:tab w:val="clear" w:pos="1134"/>
+        <w:tab w:val="center" w:pos="5952" w:leader="none"/>
+        <w:tab w:val="right" w:pos="10771" w:leader="none"/>
+      </w:tabs>
+    </w:pPr>
+    <w:rPr/>
+  </w:style>
+  <w:style w:type="paragraph" w:styleId="HeaderandFooter">
+    <w:name w:val="Header and Footer"/>
+    <w:basedOn w:val="Normal"/>
+    <w:qFormat/>
+    <w:pPr>
+      <w:suppressLineNumbers/>
+      <w:tabs>
+        <w:tab w:val="clear" w:pos="1134"/>
+        <w:tab w:val="center" w:pos="5953" w:leader="none"/>
+        <w:tab w:val="right" w:pos="10772" w:leader="none"/>
+      </w:tabs>
+    </w:pPr>
+    <w:rPr/>
+  </w:style>
   <w:style w:type="paragraph" w:styleId="Index">
     <w:name w:val="Index"/>
     <w:basedOn w:val="Normal"/>
@@ -6958,11 +6967,11 @@
       <w:suppressLineNumbers/>
     </w:pPr>
     <w:rPr>
-      <w:rFonts w:cs="Noto Sans Devanagari"/>
+      <w:rFonts w:cs="FreeSans"/>
     </w:rPr>
   </w:style>
   <w:style w:type="paragraph" w:styleId="Caption">
-    <w:name w:val="caption"/>
+    <w:name w:val="Caption"/>
     <w:basedOn w:val="Normal"/>
     <w:qFormat/>
     <w:pPr>
@@ -6970,7 +6979,7 @@
       <w:spacing w:before="120" w:after="120"/>
     </w:pPr>
     <w:rPr>
-      <w:rFonts w:cs="Noto Sans Devanagari"/>
+      <w:rFonts w:cs="FreeSans"/>
       <w:i/>
       <w:iCs/>
       <w:sz w:val="24"/>
@@ -6982,7 +6991,7 @@
     <w:basedOn w:val="BodyText"/>
     <w:pPr/>
     <w:rPr>
-      <w:rFonts w:cs="Noto Sans Devanagari"/>
+      <w:rFonts w:cs="FreeSans"/>
     </w:rPr>
   </w:style>
   <w:style w:type="paragraph" w:styleId="BodyText">
@@ -7024,7 +7033,7 @@
       <w:ind w:left="160" w:right="160"/>
     </w:pPr>
     <w:rPr>
-      <w:rFonts w:ascii="Liberation Mono" w:hAnsi="Liberation Mono" w:eastAsia="Noto Sans Mono CJK SC" w:cs="Liberation Mono"/>
+      <w:rFonts w:ascii="Liberation Mono" w:hAnsi="Liberation Mono" w:eastAsia="Liberation Mono" w:cs="Liberation Mono"/>
       <w:sz w:val="20"/>
       <w:szCs w:val="20"/>
     </w:rPr>
@@ -7065,37 +7074,37 @@
         <a:srgbClr val="000000"/>
       </a:dk1>
       <a:lt1>
-        <a:srgbClr val="FFFFFF"/>
+        <a:srgbClr val="ffffff"/>
       </a:lt1>
       <a:dk2>
         <a:srgbClr val="000000"/>
       </a:dk2>
       <a:lt2>
-        <a:srgbClr val="FFFFFF"/>
+        <a:srgbClr val="ffffff"/>
       </a:lt2>
       <a:accent1>
-        <a:srgbClr val="18A303"/>
+        <a:srgbClr val="18a303"/>
       </a:accent1>
       <a:accent2>
-        <a:srgbClr val="0369A3"/>
+        <a:srgbClr val="0369a3"/>
       </a:accent2>
       <a:accent3>
-        <a:srgbClr val="A33E03"/>
+        <a:srgbClr val="a33e03"/>
       </a:accent3>
       <a:accent4>
-        <a:srgbClr val="8E03A3"/>
+        <a:srgbClr val="8e03a3"/>
       </a:accent4>
       <a:accent5>
-        <a:srgbClr val="C99C00"/>
+        <a:srgbClr val="c99c00"/>
       </a:accent5>
       <a:accent6>
-        <a:srgbClr val="C9211E"/>
+        <a:srgbClr val="c9211e"/>
       </a:accent6>
       <a:hlink>
-        <a:srgbClr val="0000EE"/>
+        <a:srgbClr val="0000ee"/>
       </a:hlink>
       <a:folHlink>
-        <a:srgbClr val="551A8B"/>
+        <a:srgbClr val="551a8b"/>
       </a:folHlink>
     </a:clrScheme>
     <a:fontScheme name="Office">

</xml_diff>

<commit_message>
L-0717: crew 1.2.85 release bookkeeping, rebuilt guides
Tooling-seam: plugin/crew/hooks/scripts/crew_status.py
</commit_message>
<xml_diff>
--- a/docs/guides/crew/crew-autopilot.docx
+++ b/docs/guides/crew/crew-autopilot.docx
@@ -1,6 +1,6 @@
 
 <file path=word/document.xml><?xml version="1.0" encoding="utf-8"?>
-<w:document xmlns:o="urn:schemas-microsoft-com:office:office" xmlns:r="http://schemas.openxmlformats.org/officeDocument/2006/relationships" xmlns:v="urn:schemas-microsoft-com:vml" xmlns:w="http://schemas.openxmlformats.org/wordprocessingml/2006/main" xmlns:w10="urn:schemas-microsoft-com:office:word" xmlns:wp="http://schemas.openxmlformats.org/drawingml/2006/wordprocessingDrawing" xmlns:wps="http://schemas.microsoft.com/office/word/2010/wordprocessingShape" xmlns:wpg="http://schemas.microsoft.com/office/word/2010/wordprocessingGroup" xmlns:mc="http://schemas.openxmlformats.org/markup-compatibility/2006" xmlns:wp14="http://schemas.microsoft.com/office/word/2010/wordprocessingDrawing" xmlns:w14="http://schemas.microsoft.com/office/word/2010/wordml" xmlns:w15="http://schemas.microsoft.com/office/word/2012/wordml" mc:Ignorable="w14 wp14 w15">
+<w:document xmlns:o="urn:schemas-microsoft-com:office:office" xmlns:r="http://schemas.openxmlformats.org/officeDocument/2006/relationships" xmlns:v="urn:schemas-microsoft-com:vml" xmlns:w="http://schemas.openxmlformats.org/wordprocessingml/2006/main" xmlns:w10="urn:schemas-microsoft-com:office:word" xmlns:wp="http://schemas.openxmlformats.org/drawingml/2006/wordprocessingDrawing" xmlns:pic="http://schemas.openxmlformats.org/drawingml/2006/picture" xmlns:wps="http://schemas.microsoft.com/office/word/2010/wordprocessingShape" xmlns:wpg="http://schemas.microsoft.com/office/word/2010/wordprocessingGroup" xmlns:mc="http://schemas.openxmlformats.org/markup-compatibility/2006" xmlns:wp14="http://schemas.microsoft.com/office/word/2010/wordprocessingDrawing" xmlns:w14="http://schemas.microsoft.com/office/word/2010/wordml" xmlns:w15="http://schemas.microsoft.com/office/word/2012/wordml" mc:Ignorable="w14 wp14 w15">
   <w:body>
     <w:p>
       <w:pPr>
@@ -607,9 +607,9 @@
     </w:p>
     <w:tbl>
       <w:tblPr>
-        <w:tblW w:w="6183" w:type="dxa"/>
-        <w:jc w:val="left"/>
-        <w:tblInd w:w="0" w:type="dxa"/>
+        <w:tblW w:w="10793" w:type="dxa"/>
+        <w:jc w:val="left"/>
+        <w:tblInd w:w="28" w:type="dxa"/>
         <w:tblLayout w:type="fixed"/>
         <w:tblCellMar>
           <w:top w:w="28" w:type="dxa"/>
@@ -619,8 +619,8 @@
         </w:tblCellMar>
       </w:tblPr>
       <w:tblGrid>
-        <w:gridCol w:w="3154"/>
-        <w:gridCol w:w="3029"/>
+        <w:gridCol w:w="5745"/>
+        <w:gridCol w:w="5048"/>
       </w:tblGrid>
       <w:tr>
         <w:trPr>
@@ -628,7 +628,7 @@
         </w:trPr>
         <w:tc>
           <w:tcPr>
-            <w:tcW w:w="3154" w:type="dxa"/>
+            <w:tcW w:w="5745" w:type="dxa"/>
             <w:tcBorders/>
             <w:vAlign w:val="center"/>
           </w:tcPr>
@@ -650,7 +650,7 @@
         </w:tc>
         <w:tc>
           <w:tcPr>
-            <w:tcW w:w="3029" w:type="dxa"/>
+            <w:tcW w:w="5048" w:type="dxa"/>
             <w:tcBorders/>
             <w:vAlign w:val="center"/>
           </w:tcPr>
@@ -675,7 +675,7 @@
         <w:trPr/>
         <w:tc>
           <w:tcPr>
-            <w:tcW w:w="3154" w:type="dxa"/>
+            <w:tcW w:w="5745" w:type="dxa"/>
             <w:tcBorders/>
             <w:vAlign w:val="center"/>
           </w:tcPr>
@@ -698,7 +698,7 @@
         </w:tc>
         <w:tc>
           <w:tcPr>
-            <w:tcW w:w="3029" w:type="dxa"/>
+            <w:tcW w:w="5048" w:type="dxa"/>
             <w:tcBorders/>
             <w:vAlign w:val="center"/>
           </w:tcPr>
@@ -722,7 +722,7 @@
         <w:trPr/>
         <w:tc>
           <w:tcPr>
-            <w:tcW w:w="3154" w:type="dxa"/>
+            <w:tcW w:w="5745" w:type="dxa"/>
             <w:tcBorders/>
             <w:vAlign w:val="center"/>
           </w:tcPr>
@@ -755,7 +755,7 @@
         </w:tc>
         <w:tc>
           <w:tcPr>
-            <w:tcW w:w="3029" w:type="dxa"/>
+            <w:tcW w:w="5048" w:type="dxa"/>
             <w:tcBorders/>
             <w:vAlign w:val="center"/>
           </w:tcPr>
@@ -779,7 +779,7 @@
         <w:trPr/>
         <w:tc>
           <w:tcPr>
-            <w:tcW w:w="3154" w:type="dxa"/>
+            <w:tcW w:w="5745" w:type="dxa"/>
             <w:tcBorders/>
             <w:vAlign w:val="center"/>
           </w:tcPr>
@@ -802,7 +802,7 @@
         </w:tc>
         <w:tc>
           <w:tcPr>
-            <w:tcW w:w="3029" w:type="dxa"/>
+            <w:tcW w:w="5048" w:type="dxa"/>
             <w:tcBorders/>
             <w:vAlign w:val="center"/>
           </w:tcPr>
@@ -1088,7 +1088,7 @@
         <w:rPr>
           <w:rStyle w:val="SourceText"/>
         </w:rPr>
-        <w:t>review: EMPTY, 2 of 2 rounds left</w:t>
+        <w:t>review: EMPTY, 3 of 3 rounds left</w:t>
       </w:r>
     </w:p>
     <w:p>
@@ -1135,9 +1135,9 @@
     </w:p>
     <w:tbl>
       <w:tblPr>
-        <w:tblW w:w="6183" w:type="dxa"/>
-        <w:jc w:val="left"/>
-        <w:tblInd w:w="0" w:type="dxa"/>
+        <w:tblW w:w="9556" w:type="dxa"/>
+        <w:jc w:val="left"/>
+        <w:tblInd w:w="28" w:type="dxa"/>
         <w:tblLayout w:type="fixed"/>
         <w:tblCellMar>
           <w:top w:w="28" w:type="dxa"/>
@@ -1147,8 +1147,8 @@
         </w:tblCellMar>
       </w:tblPr>
       <w:tblGrid>
-        <w:gridCol w:w="1391"/>
-        <w:gridCol w:w="4792"/>
+        <w:gridCol w:w="1765"/>
+        <w:gridCol w:w="7791"/>
       </w:tblGrid>
       <w:tr>
         <w:trPr>
@@ -1156,7 +1156,7 @@
         </w:trPr>
         <w:tc>
           <w:tcPr>
-            <w:tcW w:w="1391" w:type="dxa"/>
+            <w:tcW w:w="1765" w:type="dxa"/>
             <w:tcBorders/>
             <w:vAlign w:val="center"/>
           </w:tcPr>
@@ -1178,7 +1178,7 @@
         </w:tc>
         <w:tc>
           <w:tcPr>
-            <w:tcW w:w="4792" w:type="dxa"/>
+            <w:tcW w:w="7791" w:type="dxa"/>
             <w:tcBorders/>
             <w:vAlign w:val="center"/>
           </w:tcPr>
@@ -1203,7 +1203,7 @@
         <w:trPr/>
         <w:tc>
           <w:tcPr>
-            <w:tcW w:w="1391" w:type="dxa"/>
+            <w:tcW w:w="1765" w:type="dxa"/>
             <w:tcBorders/>
             <w:vAlign w:val="center"/>
           </w:tcPr>
@@ -1226,7 +1226,7 @@
         </w:tc>
         <w:tc>
           <w:tcPr>
-            <w:tcW w:w="4792" w:type="dxa"/>
+            <w:tcW w:w="7791" w:type="dxa"/>
             <w:tcBorders/>
             <w:vAlign w:val="center"/>
           </w:tcPr>
@@ -1250,7 +1250,7 @@
         <w:trPr/>
         <w:tc>
           <w:tcPr>
-            <w:tcW w:w="1391" w:type="dxa"/>
+            <w:tcW w:w="1765" w:type="dxa"/>
             <w:tcBorders/>
             <w:vAlign w:val="center"/>
           </w:tcPr>
@@ -1273,7 +1273,7 @@
         </w:tc>
         <w:tc>
           <w:tcPr>
-            <w:tcW w:w="4792" w:type="dxa"/>
+            <w:tcW w:w="7791" w:type="dxa"/>
             <w:tcBorders/>
             <w:vAlign w:val="center"/>
           </w:tcPr>
@@ -1297,7 +1297,7 @@
         <w:trPr/>
         <w:tc>
           <w:tcPr>
-            <w:tcW w:w="1391" w:type="dxa"/>
+            <w:tcW w:w="1765" w:type="dxa"/>
             <w:tcBorders/>
             <w:vAlign w:val="center"/>
           </w:tcPr>
@@ -1320,7 +1320,7 @@
         </w:tc>
         <w:tc>
           <w:tcPr>
-            <w:tcW w:w="4792" w:type="dxa"/>
+            <w:tcW w:w="7791" w:type="dxa"/>
             <w:tcBorders/>
             <w:vAlign w:val="center"/>
           </w:tcPr>
@@ -1354,7 +1354,7 @@
         <w:trPr/>
         <w:tc>
           <w:tcPr>
-            <w:tcW w:w="1391" w:type="dxa"/>
+            <w:tcW w:w="1765" w:type="dxa"/>
             <w:tcBorders/>
             <w:vAlign w:val="center"/>
           </w:tcPr>
@@ -1377,7 +1377,7 @@
         </w:tc>
         <w:tc>
           <w:tcPr>
-            <w:tcW w:w="4792" w:type="dxa"/>
+            <w:tcW w:w="7791" w:type="dxa"/>
             <w:tcBorders/>
             <w:vAlign w:val="center"/>
           </w:tcPr>
@@ -1421,7 +1421,7 @@
         <w:trPr/>
         <w:tc>
           <w:tcPr>
-            <w:tcW w:w="1391" w:type="dxa"/>
+            <w:tcW w:w="1765" w:type="dxa"/>
             <w:tcBorders/>
             <w:vAlign w:val="center"/>
           </w:tcPr>
@@ -1444,7 +1444,7 @@
         </w:tc>
         <w:tc>
           <w:tcPr>
-            <w:tcW w:w="4792" w:type="dxa"/>
+            <w:tcW w:w="7791" w:type="dxa"/>
             <w:tcBorders/>
             <w:vAlign w:val="center"/>
           </w:tcPr>
@@ -1468,7 +1468,7 @@
         <w:trPr/>
         <w:tc>
           <w:tcPr>
-            <w:tcW w:w="1391" w:type="dxa"/>
+            <w:tcW w:w="1765" w:type="dxa"/>
             <w:tcBorders/>
             <w:vAlign w:val="center"/>
           </w:tcPr>
@@ -1491,7 +1491,7 @@
         </w:tc>
         <w:tc>
           <w:tcPr>
-            <w:tcW w:w="4792" w:type="dxa"/>
+            <w:tcW w:w="7791" w:type="dxa"/>
             <w:tcBorders/>
             <w:vAlign w:val="center"/>
           </w:tcPr>
@@ -1515,7 +1515,7 @@
         <w:trPr/>
         <w:tc>
           <w:tcPr>
-            <w:tcW w:w="1391" w:type="dxa"/>
+            <w:tcW w:w="1765" w:type="dxa"/>
             <w:tcBorders/>
             <w:vAlign w:val="center"/>
           </w:tcPr>
@@ -1538,7 +1538,7 @@
         </w:tc>
         <w:tc>
           <w:tcPr>
-            <w:tcW w:w="4792" w:type="dxa"/>
+            <w:tcW w:w="7791" w:type="dxa"/>
             <w:tcBorders/>
             <w:vAlign w:val="center"/>
           </w:tcPr>
@@ -2145,9 +2145,9 @@
     </w:p>
     <w:tbl>
       <w:tblPr>
-        <w:tblW w:w="6183" w:type="dxa"/>
-        <w:jc w:val="left"/>
-        <w:tblInd w:w="0" w:type="dxa"/>
+        <w:tblW w:w="11339" w:type="dxa"/>
+        <w:jc w:val="left"/>
+        <w:tblInd w:w="28" w:type="dxa"/>
         <w:tblLayout w:type="fixed"/>
         <w:tblCellMar>
           <w:top w:w="28" w:type="dxa"/>
@@ -2157,9 +2157,9 @@
         </w:tblCellMar>
       </w:tblPr>
       <w:tblGrid>
-        <w:gridCol w:w="1232"/>
-        <w:gridCol w:w="2461"/>
-        <w:gridCol w:w="2490"/>
+        <w:gridCol w:w="1544"/>
+        <w:gridCol w:w="5677"/>
+        <w:gridCol w:w="4118"/>
       </w:tblGrid>
       <w:tr>
         <w:trPr>
@@ -2167,7 +2167,7 @@
         </w:trPr>
         <w:tc>
           <w:tcPr>
-            <w:tcW w:w="1232" w:type="dxa"/>
+            <w:tcW w:w="1544" w:type="dxa"/>
             <w:tcBorders/>
             <w:vAlign w:val="center"/>
           </w:tcPr>
@@ -2189,7 +2189,7 @@
         </w:tc>
         <w:tc>
           <w:tcPr>
-            <w:tcW w:w="2461" w:type="dxa"/>
+            <w:tcW w:w="5677" w:type="dxa"/>
             <w:tcBorders/>
             <w:vAlign w:val="center"/>
           </w:tcPr>
@@ -2211,7 +2211,7 @@
         </w:tc>
         <w:tc>
           <w:tcPr>
-            <w:tcW w:w="2490" w:type="dxa"/>
+            <w:tcW w:w="4118" w:type="dxa"/>
             <w:tcBorders/>
             <w:vAlign w:val="center"/>
           </w:tcPr>
@@ -2236,7 +2236,7 @@
         <w:trPr/>
         <w:tc>
           <w:tcPr>
-            <w:tcW w:w="1232" w:type="dxa"/>
+            <w:tcW w:w="1544" w:type="dxa"/>
             <w:tcBorders/>
             <w:vAlign w:val="center"/>
           </w:tcPr>
@@ -2259,7 +2259,7 @@
         </w:tc>
         <w:tc>
           <w:tcPr>
-            <w:tcW w:w="2461" w:type="dxa"/>
+            <w:tcW w:w="5677" w:type="dxa"/>
             <w:tcBorders/>
             <w:vAlign w:val="center"/>
           </w:tcPr>
@@ -2280,7 +2280,7 @@
         </w:tc>
         <w:tc>
           <w:tcPr>
-            <w:tcW w:w="2490" w:type="dxa"/>
+            <w:tcW w:w="4118" w:type="dxa"/>
             <w:tcBorders/>
             <w:vAlign w:val="center"/>
           </w:tcPr>
@@ -2304,7 +2304,7 @@
         <w:trPr/>
         <w:tc>
           <w:tcPr>
-            <w:tcW w:w="1232" w:type="dxa"/>
+            <w:tcW w:w="1544" w:type="dxa"/>
             <w:tcBorders/>
             <w:vAlign w:val="center"/>
           </w:tcPr>
@@ -2327,7 +2327,7 @@
         </w:tc>
         <w:tc>
           <w:tcPr>
-            <w:tcW w:w="2461" w:type="dxa"/>
+            <w:tcW w:w="5677" w:type="dxa"/>
             <w:tcBorders/>
             <w:vAlign w:val="center"/>
           </w:tcPr>
@@ -2348,7 +2348,7 @@
         </w:tc>
         <w:tc>
           <w:tcPr>
-            <w:tcW w:w="2490" w:type="dxa"/>
+            <w:tcW w:w="4118" w:type="dxa"/>
             <w:tcBorders/>
             <w:vAlign w:val="center"/>
           </w:tcPr>
@@ -2372,7 +2372,7 @@
         <w:trPr/>
         <w:tc>
           <w:tcPr>
-            <w:tcW w:w="1232" w:type="dxa"/>
+            <w:tcW w:w="1544" w:type="dxa"/>
             <w:tcBorders/>
             <w:vAlign w:val="center"/>
           </w:tcPr>
@@ -2399,7 +2399,7 @@
         </w:tc>
         <w:tc>
           <w:tcPr>
-            <w:tcW w:w="2461" w:type="dxa"/>
+            <w:tcW w:w="5677" w:type="dxa"/>
             <w:tcBorders/>
             <w:vAlign w:val="center"/>
           </w:tcPr>
@@ -2426,7 +2426,7 @@
         </w:tc>
         <w:tc>
           <w:tcPr>
-            <w:tcW w:w="2490" w:type="dxa"/>
+            <w:tcW w:w="4118" w:type="dxa"/>
             <w:tcBorders/>
             <w:vAlign w:val="center"/>
           </w:tcPr>
@@ -3289,7 +3289,7 @@
       </w:r>
       <w:r>
         <w:rPr/>
-        <w:t xml:space="preserve"> at 1 or more (default 0, off), a final round with a BLOCK that has no review round left can be rejected by autopilot itself (</w:t>
+        <w:t xml:space="preserve"> at 1 or more (default 0, off), a final round with a BLOCK that has no review round left is the case autopilot could reject itself (</w:t>
       </w:r>
       <w:r>
         <w:rPr>
@@ -3309,7 +3309,7 @@
       </w:r>
       <w:r>
         <w:rPr/>
-        <w:t xml:space="preserve"> line and every BLOCK and FIX line): </w:t>
+        <w:t xml:space="preserve"> line and every BLOCK and FIX line), then </w:t>
       </w:r>
       <w:r>
         <w:rPr>
@@ -3319,7 +3319,7 @@
       </w:r>
       <w:r>
         <w:rPr/>
-        <w:t xml:space="preserve"> then writes a successor plan that quotes each of them, and the approve phase decides it under </w:t>
+        <w:t xml:space="preserve"> writes a successor plan that quotes each of them, and the approve phase decides it under </w:t>
       </w:r>
       <w:r>
         <w:rPr>
@@ -3329,7 +3329,17 @@
       </w:r>
       <w:r>
         <w:rPr/>
-        <w:t xml:space="preserve">. The BLOCK is never accepted; once </w:t>
+        <w:t xml:space="preserve">. Since L-0717 a successor plan does not reopen the ticket's three-round budget, so autopilot refuses that reject while no round would remain and never grants one: the owner's </w:t>
+      </w:r>
+      <w:r>
+        <w:rPr>
+          <w:rStyle w:val="SourceText"/>
+        </w:rPr>
+        <w:t>review_ledger.py --grant-round</w:t>
+      </w:r>
+      <w:r>
+        <w:rPr/>
+        <w:t xml:space="preserve"> is the only way to give the successor a round. The BLOCK is never accepted; once </w:t>
       </w:r>
       <w:r>
         <w:rPr>
@@ -3728,9 +3738,9 @@
     </w:p>
     <w:tbl>
       <w:tblPr>
-        <w:tblW w:w="6183" w:type="dxa"/>
-        <w:jc w:val="left"/>
-        <w:tblInd w:w="0" w:type="dxa"/>
+        <w:tblW w:w="11339" w:type="dxa"/>
+        <w:jc w:val="left"/>
+        <w:tblInd w:w="28" w:type="dxa"/>
         <w:tblLayout w:type="fixed"/>
         <w:tblCellMar>
           <w:top w:w="28" w:type="dxa"/>
@@ -3740,9 +3750,9 @@
         </w:tblCellMar>
       </w:tblPr>
       <w:tblGrid>
-        <w:gridCol w:w="1996"/>
-        <w:gridCol w:w="1231"/>
-        <w:gridCol w:w="2956"/>
+        <w:gridCol w:w="3794"/>
+        <w:gridCol w:w="2810"/>
+        <w:gridCol w:w="4735"/>
       </w:tblGrid>
       <w:tr>
         <w:trPr>
@@ -3750,7 +3760,7 @@
         </w:trPr>
         <w:tc>
           <w:tcPr>
-            <w:tcW w:w="1996" w:type="dxa"/>
+            <w:tcW w:w="3794" w:type="dxa"/>
             <w:tcBorders/>
             <w:vAlign w:val="center"/>
           </w:tcPr>
@@ -3772,7 +3782,7 @@
         </w:tc>
         <w:tc>
           <w:tcPr>
-            <w:tcW w:w="1231" w:type="dxa"/>
+            <w:tcW w:w="2810" w:type="dxa"/>
             <w:tcBorders/>
             <w:vAlign w:val="center"/>
           </w:tcPr>
@@ -3794,7 +3804,7 @@
         </w:tc>
         <w:tc>
           <w:tcPr>
-            <w:tcW w:w="2956" w:type="dxa"/>
+            <w:tcW w:w="4735" w:type="dxa"/>
             <w:tcBorders/>
             <w:vAlign w:val="center"/>
           </w:tcPr>
@@ -3819,7 +3829,7 @@
         <w:trPr/>
         <w:tc>
           <w:tcPr>
-            <w:tcW w:w="1996" w:type="dxa"/>
+            <w:tcW w:w="3794" w:type="dxa"/>
             <w:tcBorders/>
             <w:vAlign w:val="center"/>
           </w:tcPr>
@@ -3862,7 +3872,7 @@
         </w:tc>
         <w:tc>
           <w:tcPr>
-            <w:tcW w:w="1231" w:type="dxa"/>
+            <w:tcW w:w="2810" w:type="dxa"/>
             <w:tcBorders/>
             <w:vAlign w:val="center"/>
           </w:tcPr>
@@ -3883,7 +3893,7 @@
         </w:tc>
         <w:tc>
           <w:tcPr>
-            <w:tcW w:w="2956" w:type="dxa"/>
+            <w:tcW w:w="4735" w:type="dxa"/>
             <w:tcBorders/>
             <w:vAlign w:val="center"/>
           </w:tcPr>
@@ -3907,7 +3917,7 @@
         <w:trPr/>
         <w:tc>
           <w:tcPr>
-            <w:tcW w:w="1996" w:type="dxa"/>
+            <w:tcW w:w="3794" w:type="dxa"/>
             <w:tcBorders/>
             <w:vAlign w:val="center"/>
           </w:tcPr>
@@ -3930,7 +3940,7 @@
         </w:tc>
         <w:tc>
           <w:tcPr>
-            <w:tcW w:w="1231" w:type="dxa"/>
+            <w:tcW w:w="2810" w:type="dxa"/>
             <w:tcBorders/>
             <w:vAlign w:val="center"/>
           </w:tcPr>
@@ -3951,7 +3961,7 @@
         </w:tc>
         <w:tc>
           <w:tcPr>
-            <w:tcW w:w="2956" w:type="dxa"/>
+            <w:tcW w:w="4735" w:type="dxa"/>
             <w:tcBorders/>
             <w:vAlign w:val="center"/>
           </w:tcPr>
@@ -3975,7 +3985,7 @@
         <w:trPr/>
         <w:tc>
           <w:tcPr>
-            <w:tcW w:w="1996" w:type="dxa"/>
+            <w:tcW w:w="3794" w:type="dxa"/>
             <w:tcBorders/>
             <w:vAlign w:val="center"/>
           </w:tcPr>
@@ -4018,7 +4028,7 @@
         </w:tc>
         <w:tc>
           <w:tcPr>
-            <w:tcW w:w="1231" w:type="dxa"/>
+            <w:tcW w:w="2810" w:type="dxa"/>
             <w:tcBorders/>
             <w:vAlign w:val="center"/>
           </w:tcPr>
@@ -4039,7 +4049,7 @@
         </w:tc>
         <w:tc>
           <w:tcPr>
-            <w:tcW w:w="2956" w:type="dxa"/>
+            <w:tcW w:w="4735" w:type="dxa"/>
             <w:tcBorders/>
             <w:vAlign w:val="center"/>
           </w:tcPr>
@@ -4063,7 +4073,7 @@
         <w:trPr/>
         <w:tc>
           <w:tcPr>
-            <w:tcW w:w="1996" w:type="dxa"/>
+            <w:tcW w:w="3794" w:type="dxa"/>
             <w:tcBorders/>
             <w:vAlign w:val="center"/>
           </w:tcPr>
@@ -4096,7 +4106,7 @@
         </w:tc>
         <w:tc>
           <w:tcPr>
-            <w:tcW w:w="1231" w:type="dxa"/>
+            <w:tcW w:w="2810" w:type="dxa"/>
             <w:tcBorders/>
             <w:vAlign w:val="center"/>
           </w:tcPr>
@@ -4117,7 +4127,7 @@
         </w:tc>
         <w:tc>
           <w:tcPr>
-            <w:tcW w:w="2956" w:type="dxa"/>
+            <w:tcW w:w="4735" w:type="dxa"/>
             <w:tcBorders/>
             <w:vAlign w:val="center"/>
           </w:tcPr>
@@ -4151,7 +4161,7 @@
         <w:trPr/>
         <w:tc>
           <w:tcPr>
-            <w:tcW w:w="1996" w:type="dxa"/>
+            <w:tcW w:w="3794" w:type="dxa"/>
             <w:tcBorders/>
             <w:vAlign w:val="center"/>
           </w:tcPr>
@@ -4174,7 +4184,7 @@
         </w:tc>
         <w:tc>
           <w:tcPr>
-            <w:tcW w:w="1231" w:type="dxa"/>
+            <w:tcW w:w="2810" w:type="dxa"/>
             <w:tcBorders/>
             <w:vAlign w:val="center"/>
           </w:tcPr>
@@ -4195,7 +4205,7 @@
         </w:tc>
         <w:tc>
           <w:tcPr>
-            <w:tcW w:w="2956" w:type="dxa"/>
+            <w:tcW w:w="4735" w:type="dxa"/>
             <w:tcBorders/>
             <w:vAlign w:val="center"/>
           </w:tcPr>
@@ -4219,7 +4229,7 @@
         <w:trPr/>
         <w:tc>
           <w:tcPr>
-            <w:tcW w:w="1996" w:type="dxa"/>
+            <w:tcW w:w="3794" w:type="dxa"/>
             <w:tcBorders/>
             <w:vAlign w:val="center"/>
           </w:tcPr>
@@ -4242,7 +4252,7 @@
         </w:tc>
         <w:tc>
           <w:tcPr>
-            <w:tcW w:w="1231" w:type="dxa"/>
+            <w:tcW w:w="2810" w:type="dxa"/>
             <w:tcBorders/>
             <w:vAlign w:val="center"/>
           </w:tcPr>
@@ -4263,7 +4273,7 @@
         </w:tc>
         <w:tc>
           <w:tcPr>
-            <w:tcW w:w="2956" w:type="dxa"/>
+            <w:tcW w:w="4735" w:type="dxa"/>
             <w:tcBorders/>
             <w:vAlign w:val="center"/>
           </w:tcPr>
@@ -4287,7 +4297,7 @@
         <w:trPr/>
         <w:tc>
           <w:tcPr>
-            <w:tcW w:w="1996" w:type="dxa"/>
+            <w:tcW w:w="3794" w:type="dxa"/>
             <w:tcBorders/>
             <w:vAlign w:val="center"/>
           </w:tcPr>
@@ -4310,7 +4320,7 @@
         </w:tc>
         <w:tc>
           <w:tcPr>
-            <w:tcW w:w="1231" w:type="dxa"/>
+            <w:tcW w:w="2810" w:type="dxa"/>
             <w:tcBorders/>
             <w:vAlign w:val="center"/>
           </w:tcPr>
@@ -4331,7 +4341,7 @@
         </w:tc>
         <w:tc>
           <w:tcPr>
-            <w:tcW w:w="2956" w:type="dxa"/>
+            <w:tcW w:w="4735" w:type="dxa"/>
             <w:tcBorders/>
             <w:vAlign w:val="center"/>
           </w:tcPr>
@@ -4355,7 +4365,7 @@
         <w:trPr/>
         <w:tc>
           <w:tcPr>
-            <w:tcW w:w="1996" w:type="dxa"/>
+            <w:tcW w:w="3794" w:type="dxa"/>
             <w:tcBorders/>
             <w:vAlign w:val="center"/>
           </w:tcPr>
@@ -4378,7 +4388,7 @@
         </w:tc>
         <w:tc>
           <w:tcPr>
-            <w:tcW w:w="1231" w:type="dxa"/>
+            <w:tcW w:w="2810" w:type="dxa"/>
             <w:tcBorders/>
             <w:vAlign w:val="center"/>
           </w:tcPr>
@@ -4399,7 +4409,7 @@
         </w:tc>
         <w:tc>
           <w:tcPr>
-            <w:tcW w:w="2956" w:type="dxa"/>
+            <w:tcW w:w="4735" w:type="dxa"/>
             <w:tcBorders/>
             <w:vAlign w:val="center"/>
           </w:tcPr>
@@ -4423,7 +4433,7 @@
         <w:trPr/>
         <w:tc>
           <w:tcPr>
-            <w:tcW w:w="1996" w:type="dxa"/>
+            <w:tcW w:w="3794" w:type="dxa"/>
             <w:tcBorders/>
             <w:vAlign w:val="center"/>
           </w:tcPr>
@@ -4446,7 +4456,7 @@
         </w:tc>
         <w:tc>
           <w:tcPr>
-            <w:tcW w:w="1231" w:type="dxa"/>
+            <w:tcW w:w="2810" w:type="dxa"/>
             <w:tcBorders/>
             <w:vAlign w:val="center"/>
           </w:tcPr>
@@ -4467,7 +4477,7 @@
         </w:tc>
         <w:tc>
           <w:tcPr>
-            <w:tcW w:w="2956" w:type="dxa"/>
+            <w:tcW w:w="4735" w:type="dxa"/>
             <w:tcBorders/>
             <w:vAlign w:val="center"/>
           </w:tcPr>
@@ -4501,7 +4511,7 @@
         <w:trPr/>
         <w:tc>
           <w:tcPr>
-            <w:tcW w:w="1996" w:type="dxa"/>
+            <w:tcW w:w="3794" w:type="dxa"/>
             <w:tcBorders/>
             <w:vAlign w:val="center"/>
           </w:tcPr>
@@ -4524,7 +4534,7 @@
         </w:tc>
         <w:tc>
           <w:tcPr>
-            <w:tcW w:w="1231" w:type="dxa"/>
+            <w:tcW w:w="2810" w:type="dxa"/>
             <w:tcBorders/>
             <w:vAlign w:val="center"/>
           </w:tcPr>
@@ -4545,7 +4555,7 @@
         </w:tc>
         <w:tc>
           <w:tcPr>
-            <w:tcW w:w="2956" w:type="dxa"/>
+            <w:tcW w:w="4735" w:type="dxa"/>
             <w:tcBorders/>
             <w:vAlign w:val="center"/>
           </w:tcPr>
@@ -4569,7 +4579,7 @@
         <w:trPr/>
         <w:tc>
           <w:tcPr>
-            <w:tcW w:w="1996" w:type="dxa"/>
+            <w:tcW w:w="3794" w:type="dxa"/>
             <w:tcBorders/>
             <w:vAlign w:val="center"/>
           </w:tcPr>
@@ -4592,7 +4602,7 @@
         </w:tc>
         <w:tc>
           <w:tcPr>
-            <w:tcW w:w="1231" w:type="dxa"/>
+            <w:tcW w:w="2810" w:type="dxa"/>
             <w:tcBorders/>
             <w:vAlign w:val="center"/>
           </w:tcPr>
@@ -4613,7 +4623,7 @@
         </w:tc>
         <w:tc>
           <w:tcPr>
-            <w:tcW w:w="2956" w:type="dxa"/>
+            <w:tcW w:w="4735" w:type="dxa"/>
             <w:tcBorders/>
             <w:vAlign w:val="center"/>
           </w:tcPr>
@@ -4637,7 +4647,7 @@
         <w:trPr/>
         <w:tc>
           <w:tcPr>
-            <w:tcW w:w="1996" w:type="dxa"/>
+            <w:tcW w:w="3794" w:type="dxa"/>
             <w:tcBorders/>
             <w:vAlign w:val="center"/>
           </w:tcPr>
@@ -4660,7 +4670,7 @@
         </w:tc>
         <w:tc>
           <w:tcPr>
-            <w:tcW w:w="1231" w:type="dxa"/>
+            <w:tcW w:w="2810" w:type="dxa"/>
             <w:tcBorders/>
             <w:vAlign w:val="center"/>
           </w:tcPr>
@@ -4681,7 +4691,7 @@
         </w:tc>
         <w:tc>
           <w:tcPr>
-            <w:tcW w:w="2956" w:type="dxa"/>
+            <w:tcW w:w="4735" w:type="dxa"/>
             <w:tcBorders/>
             <w:vAlign w:val="center"/>
           </w:tcPr>
@@ -4711,7 +4721,7 @@
         <w:trPr/>
         <w:tc>
           <w:tcPr>
-            <w:tcW w:w="1996" w:type="dxa"/>
+            <w:tcW w:w="3794" w:type="dxa"/>
             <w:tcBorders/>
             <w:vAlign w:val="center"/>
           </w:tcPr>
@@ -4734,7 +4744,7 @@
         </w:tc>
         <w:tc>
           <w:tcPr>
-            <w:tcW w:w="1231" w:type="dxa"/>
+            <w:tcW w:w="2810" w:type="dxa"/>
             <w:tcBorders/>
             <w:vAlign w:val="center"/>
           </w:tcPr>
@@ -4755,7 +4765,7 @@
         </w:tc>
         <w:tc>
           <w:tcPr>
-            <w:tcW w:w="2956" w:type="dxa"/>
+            <w:tcW w:w="4735" w:type="dxa"/>
             <w:tcBorders/>
             <w:vAlign w:val="center"/>
           </w:tcPr>
@@ -4779,7 +4789,7 @@
         <w:trPr/>
         <w:tc>
           <w:tcPr>
-            <w:tcW w:w="1996" w:type="dxa"/>
+            <w:tcW w:w="3794" w:type="dxa"/>
             <w:tcBorders/>
             <w:vAlign w:val="center"/>
           </w:tcPr>
@@ -4802,7 +4812,7 @@
         </w:tc>
         <w:tc>
           <w:tcPr>
-            <w:tcW w:w="1231" w:type="dxa"/>
+            <w:tcW w:w="2810" w:type="dxa"/>
             <w:tcBorders/>
             <w:vAlign w:val="center"/>
           </w:tcPr>
@@ -4823,7 +4833,7 @@
         </w:tc>
         <w:tc>
           <w:tcPr>
-            <w:tcW w:w="2956" w:type="dxa"/>
+            <w:tcW w:w="4735" w:type="dxa"/>
             <w:tcBorders/>
             <w:vAlign w:val="center"/>
           </w:tcPr>
@@ -4847,7 +4857,7 @@
         <w:trPr/>
         <w:tc>
           <w:tcPr>
-            <w:tcW w:w="1996" w:type="dxa"/>
+            <w:tcW w:w="3794" w:type="dxa"/>
             <w:tcBorders/>
             <w:vAlign w:val="center"/>
           </w:tcPr>
@@ -4870,7 +4880,7 @@
         </w:tc>
         <w:tc>
           <w:tcPr>
-            <w:tcW w:w="1231" w:type="dxa"/>
+            <w:tcW w:w="2810" w:type="dxa"/>
             <w:tcBorders/>
             <w:vAlign w:val="center"/>
           </w:tcPr>
@@ -4891,7 +4901,7 @@
         </w:tc>
         <w:tc>
           <w:tcPr>
-            <w:tcW w:w="2956" w:type="dxa"/>
+            <w:tcW w:w="4735" w:type="dxa"/>
             <w:tcBorders/>
             <w:vAlign w:val="center"/>
           </w:tcPr>
@@ -4915,7 +4925,7 @@
         <w:trPr/>
         <w:tc>
           <w:tcPr>
-            <w:tcW w:w="1996" w:type="dxa"/>
+            <w:tcW w:w="3794" w:type="dxa"/>
             <w:tcBorders/>
             <w:vAlign w:val="center"/>
           </w:tcPr>
@@ -4938,7 +4948,7 @@
         </w:tc>
         <w:tc>
           <w:tcPr>
-            <w:tcW w:w="1231" w:type="dxa"/>
+            <w:tcW w:w="2810" w:type="dxa"/>
             <w:tcBorders/>
             <w:vAlign w:val="center"/>
           </w:tcPr>
@@ -4959,7 +4969,7 @@
         </w:tc>
         <w:tc>
           <w:tcPr>
-            <w:tcW w:w="2956" w:type="dxa"/>
+            <w:tcW w:w="4735" w:type="dxa"/>
             <w:tcBorders/>
             <w:vAlign w:val="center"/>
           </w:tcPr>
@@ -4989,7 +4999,7 @@
         <w:trPr/>
         <w:tc>
           <w:tcPr>
-            <w:tcW w:w="1996" w:type="dxa"/>
+            <w:tcW w:w="3794" w:type="dxa"/>
             <w:tcBorders/>
             <w:vAlign w:val="center"/>
           </w:tcPr>
@@ -5012,7 +5022,7 @@
         </w:tc>
         <w:tc>
           <w:tcPr>
-            <w:tcW w:w="1231" w:type="dxa"/>
+            <w:tcW w:w="2810" w:type="dxa"/>
             <w:tcBorders/>
             <w:vAlign w:val="center"/>
           </w:tcPr>
@@ -5033,7 +5043,7 @@
         </w:tc>
         <w:tc>
           <w:tcPr>
-            <w:tcW w:w="2956" w:type="dxa"/>
+            <w:tcW w:w="4735" w:type="dxa"/>
             <w:tcBorders/>
             <w:vAlign w:val="center"/>
           </w:tcPr>
@@ -5067,7 +5077,7 @@
         <w:trPr/>
         <w:tc>
           <w:tcPr>
-            <w:tcW w:w="1996" w:type="dxa"/>
+            <w:tcW w:w="3794" w:type="dxa"/>
             <w:tcBorders/>
             <w:vAlign w:val="center"/>
           </w:tcPr>
@@ -5110,7 +5120,7 @@
         </w:tc>
         <w:tc>
           <w:tcPr>
-            <w:tcW w:w="1231" w:type="dxa"/>
+            <w:tcW w:w="2810" w:type="dxa"/>
             <w:tcBorders/>
             <w:vAlign w:val="center"/>
           </w:tcPr>
@@ -5131,7 +5141,7 @@
         </w:tc>
         <w:tc>
           <w:tcPr>
-            <w:tcW w:w="2956" w:type="dxa"/>
+            <w:tcW w:w="4735" w:type="dxa"/>
             <w:tcBorders/>
             <w:vAlign w:val="center"/>
           </w:tcPr>
@@ -5181,9 +5191,9 @@
     </w:p>
     <w:tbl>
       <w:tblPr>
-        <w:tblW w:w="6183" w:type="dxa"/>
-        <w:jc w:val="left"/>
-        <w:tblInd w:w="0" w:type="dxa"/>
+        <w:tblW w:w="11059" w:type="dxa"/>
+        <w:jc w:val="left"/>
+        <w:tblInd w:w="28" w:type="dxa"/>
         <w:tblLayout w:type="fixed"/>
         <w:tblCellMar>
           <w:top w:w="28" w:type="dxa"/>
@@ -5193,8 +5203,8 @@
         </w:tblCellMar>
       </w:tblPr>
       <w:tblGrid>
-        <w:gridCol w:w="3141"/>
-        <w:gridCol w:w="1480"/>
+        <w:gridCol w:w="6902"/>
+        <w:gridCol w:w="2595"/>
         <w:gridCol w:w="1562"/>
       </w:tblGrid>
       <w:tr>
@@ -5203,7 +5213,7 @@
         </w:trPr>
         <w:tc>
           <w:tcPr>
-            <w:tcW w:w="3141" w:type="dxa"/>
+            <w:tcW w:w="6902" w:type="dxa"/>
             <w:tcBorders/>
             <w:vAlign w:val="center"/>
           </w:tcPr>
@@ -5225,7 +5235,7 @@
         </w:tc>
         <w:tc>
           <w:tcPr>
-            <w:tcW w:w="1480" w:type="dxa"/>
+            <w:tcW w:w="2595" w:type="dxa"/>
             <w:tcBorders/>
             <w:vAlign w:val="center"/>
           </w:tcPr>
@@ -5272,7 +5282,7 @@
         <w:trPr/>
         <w:tc>
           <w:tcPr>
-            <w:tcW w:w="3141" w:type="dxa"/>
+            <w:tcW w:w="6902" w:type="dxa"/>
             <w:tcBorders/>
             <w:vAlign w:val="center"/>
           </w:tcPr>
@@ -5299,7 +5309,7 @@
         </w:tc>
         <w:tc>
           <w:tcPr>
-            <w:tcW w:w="1480" w:type="dxa"/>
+            <w:tcW w:w="2595" w:type="dxa"/>
             <w:tcBorders/>
             <w:vAlign w:val="center"/>
           </w:tcPr>
@@ -5346,7 +5356,7 @@
         <w:trPr/>
         <w:tc>
           <w:tcPr>
-            <w:tcW w:w="3141" w:type="dxa"/>
+            <w:tcW w:w="6902" w:type="dxa"/>
             <w:tcBorders/>
             <w:vAlign w:val="center"/>
           </w:tcPr>
@@ -5373,7 +5383,7 @@
         </w:tc>
         <w:tc>
           <w:tcPr>
-            <w:tcW w:w="1480" w:type="dxa"/>
+            <w:tcW w:w="2595" w:type="dxa"/>
             <w:tcBorders/>
             <w:vAlign w:val="center"/>
           </w:tcPr>
@@ -5420,7 +5430,7 @@
         <w:trPr/>
         <w:tc>
           <w:tcPr>
-            <w:tcW w:w="3141" w:type="dxa"/>
+            <w:tcW w:w="6902" w:type="dxa"/>
             <w:tcBorders/>
             <w:vAlign w:val="center"/>
           </w:tcPr>
@@ -5441,7 +5451,7 @@
         </w:tc>
         <w:tc>
           <w:tcPr>
-            <w:tcW w:w="1480" w:type="dxa"/>
+            <w:tcW w:w="2595" w:type="dxa"/>
             <w:tcBorders/>
             <w:vAlign w:val="center"/>
           </w:tcPr>
@@ -5488,7 +5498,7 @@
         <w:trPr/>
         <w:tc>
           <w:tcPr>
-            <w:tcW w:w="3141" w:type="dxa"/>
+            <w:tcW w:w="6902" w:type="dxa"/>
             <w:tcBorders/>
             <w:vAlign w:val="center"/>
           </w:tcPr>
@@ -5509,7 +5519,7 @@
         </w:tc>
         <w:tc>
           <w:tcPr>
-            <w:tcW w:w="1480" w:type="dxa"/>
+            <w:tcW w:w="2595" w:type="dxa"/>
             <w:tcBorders/>
             <w:vAlign w:val="center"/>
           </w:tcPr>
@@ -5556,7 +5566,7 @@
         <w:trPr/>
         <w:tc>
           <w:tcPr>
-            <w:tcW w:w="3141" w:type="dxa"/>
+            <w:tcW w:w="6902" w:type="dxa"/>
             <w:tcBorders/>
             <w:vAlign w:val="center"/>
           </w:tcPr>
@@ -5577,7 +5587,7 @@
         </w:tc>
         <w:tc>
           <w:tcPr>
-            <w:tcW w:w="1480" w:type="dxa"/>
+            <w:tcW w:w="2595" w:type="dxa"/>
             <w:tcBorders/>
             <w:vAlign w:val="center"/>
           </w:tcPr>
@@ -5624,7 +5634,7 @@
         <w:trPr/>
         <w:tc>
           <w:tcPr>
-            <w:tcW w:w="3141" w:type="dxa"/>
+            <w:tcW w:w="6902" w:type="dxa"/>
             <w:tcBorders/>
             <w:vAlign w:val="center"/>
           </w:tcPr>
@@ -5655,7 +5665,7 @@
         </w:tc>
         <w:tc>
           <w:tcPr>
-            <w:tcW w:w="1480" w:type="dxa"/>
+            <w:tcW w:w="2595" w:type="dxa"/>
             <w:tcBorders/>
             <w:vAlign w:val="center"/>
           </w:tcPr>
@@ -5702,7 +5712,7 @@
         <w:trPr/>
         <w:tc>
           <w:tcPr>
-            <w:tcW w:w="3141" w:type="dxa"/>
+            <w:tcW w:w="6902" w:type="dxa"/>
             <w:tcBorders/>
             <w:vAlign w:val="center"/>
           </w:tcPr>
@@ -5723,7 +5733,7 @@
         </w:tc>
         <w:tc>
           <w:tcPr>
-            <w:tcW w:w="1480" w:type="dxa"/>
+            <w:tcW w:w="2595" w:type="dxa"/>
             <w:tcBorders/>
             <w:vAlign w:val="center"/>
           </w:tcPr>
@@ -6610,7 +6620,7 @@
       <w:start w:val="1"/>
       <w:numFmt w:val="none"/>
       <w:suff w:val="nothing"/>
-      <w:lvlText w:val="%1"/>
+      <w:lvlText w:val=""/>
       <w:lvlJc w:val="left"/>
       <w:pPr>
         <w:tabs>
@@ -6621,10 +6631,10 @@
     </w:lvl>
     <w:lvl w:ilvl="1">
       <w:start w:val="1"/>
+      <w:numFmt w:val="none"/>
       <w:pStyle w:val="Heading2"/>
-      <w:numFmt w:val="none"/>
       <w:suff w:val="nothing"/>
-      <w:lvlText w:val="%2"/>
+      <w:lvlText w:val=""/>
       <w:lvlJc w:val="left"/>
       <w:pPr>
         <w:tabs>
@@ -6635,10 +6645,10 @@
     </w:lvl>
     <w:lvl w:ilvl="2">
       <w:start w:val="1"/>
+      <w:numFmt w:val="none"/>
       <w:pStyle w:val="Heading3"/>
-      <w:numFmt w:val="none"/>
       <w:suff w:val="nothing"/>
-      <w:lvlText w:val="%3"/>
+      <w:lvlText w:val=""/>
       <w:lvlJc w:val="left"/>
       <w:pPr>
         <w:tabs>
@@ -6651,7 +6661,7 @@
       <w:start w:val="1"/>
       <w:numFmt w:val="none"/>
       <w:suff w:val="nothing"/>
-      <w:lvlText w:val="%4"/>
+      <w:lvlText w:val=""/>
       <w:lvlJc w:val="left"/>
       <w:pPr>
         <w:tabs>
@@ -6664,7 +6674,7 @@
       <w:start w:val="1"/>
       <w:numFmt w:val="none"/>
       <w:suff w:val="nothing"/>
-      <w:lvlText w:val="%5"/>
+      <w:lvlText w:val=""/>
       <w:lvlJc w:val="left"/>
       <w:pPr>
         <w:tabs>
@@ -6677,7 +6687,7 @@
       <w:start w:val="1"/>
       <w:numFmt w:val="none"/>
       <w:suff w:val="nothing"/>
-      <w:lvlText w:val="%6"/>
+      <w:lvlText w:val=""/>
       <w:lvlJc w:val="left"/>
       <w:pPr>
         <w:tabs>
@@ -6690,7 +6700,7 @@
       <w:start w:val="1"/>
       <w:numFmt w:val="none"/>
       <w:suff w:val="nothing"/>
-      <w:lvlText w:val="%7"/>
+      <w:lvlText w:val=""/>
       <w:lvlJc w:val="left"/>
       <w:pPr>
         <w:tabs>
@@ -6703,7 +6713,7 @@
       <w:start w:val="1"/>
       <w:numFmt w:val="none"/>
       <w:suff w:val="nothing"/>
-      <w:lvlText w:val="%8"/>
+      <w:lvlText w:val=""/>
       <w:lvlJc w:val="left"/>
       <w:pPr>
         <w:tabs>
@@ -6716,7 +6726,7 @@
       <w:start w:val="1"/>
       <w:numFmt w:val="none"/>
       <w:suff w:val="nothing"/>
-      <w:lvlText w:val="%9"/>
+      <w:lvlText w:val=""/>
       <w:lvlJc w:val="left"/>
       <w:pPr>
         <w:tabs>
@@ -6749,7 +6759,7 @@
   <w:docDefaults>
     <w:rPrDefault>
       <w:rPr>
-        <w:rFonts w:ascii="Liberation Serif" w:hAnsi="Liberation Serif" w:eastAsia="WenQuanYi Zen Hei" w:cs="FreeSans"/>
+        <w:rFonts w:ascii="Liberation Serif" w:hAnsi="Liberation Serif" w:eastAsia="Noto Serif CJK SC" w:cs="Noto Sans Devanagari"/>
         <w:sz w:val="24"/>
         <w:szCs w:val="24"/>
         <w:lang w:val="en-US" w:eastAsia="zh-CN" w:bidi="hi-IN"/>
@@ -6779,7 +6789,7 @@
     </w:rPr>
   </w:style>
   <w:style w:type="paragraph" w:styleId="Heading1">
-    <w:name w:val="Heading 1"/>
+    <w:name w:val="heading 1"/>
     <w:basedOn w:val="Heading"/>
     <w:next w:val="BodyText"/>
     <w:qFormat/>
@@ -6787,7 +6797,6 @@
       <w:spacing w:before="240" w:after="80"/>
     </w:pPr>
     <w:rPr>
-      <w:rFonts w:ascii="Noto Sans" w:hAnsi="Noto Sans"/>
       <w:b/>
       <w:bCs/>
       <w:color w:val="88C0D0"/>
@@ -6796,7 +6805,7 @@
     </w:rPr>
   </w:style>
   <w:style w:type="paragraph" w:styleId="Heading2">
-    <w:name w:val="Heading 2"/>
+    <w:name w:val="heading 2"/>
     <w:basedOn w:val="Heading"/>
     <w:next w:val="BodyText"/>
     <w:qFormat/>
@@ -6809,7 +6818,7 @@
       <w:outlineLvl w:val="1"/>
     </w:pPr>
     <w:rPr>
-      <w:rFonts w:ascii="Liberation Serif" w:hAnsi="Liberation Serif" w:eastAsia="WenQuanYi Zen Hei" w:cs="FreeSans"/>
+      <w:rFonts w:ascii="Liberation Serif" w:hAnsi="Liberation Serif" w:eastAsia="Noto Serif CJK SC" w:cs="Noto Sans Devanagari"/>
       <w:b/>
       <w:bCs/>
       <w:color w:val="88C0D0"/>
@@ -6818,7 +6827,7 @@
     </w:rPr>
   </w:style>
   <w:style w:type="paragraph" w:styleId="Heading3">
-    <w:name w:val="Heading 3"/>
+    <w:name w:val="heading 3"/>
     <w:basedOn w:val="Heading"/>
     <w:next w:val="BodyText"/>
     <w:qFormat/>
@@ -6828,12 +6837,24 @@
       <w:outlineLvl w:val="2"/>
     </w:pPr>
     <w:rPr>
-      <w:rFonts w:ascii="Liberation Serif" w:hAnsi="Liberation Serif" w:eastAsia="WenQuanYi Zen Hei" w:cs="FreeSans"/>
+      <w:rFonts w:ascii="Liberation Serif" w:hAnsi="Liberation Serif" w:eastAsia="Noto Serif CJK SC" w:cs="Noto Sans Devanagari"/>
       <w:b/>
       <w:bCs/>
       <w:color w:val="88C0D0"/>
       <w:sz w:val="26"/>
       <w:szCs w:val="26"/>
+    </w:rPr>
+  </w:style>
+  <w:style w:type="character" w:styleId="EndnoteReference">
+    <w:name w:val="endnote reference"/>
+    <w:rPr>
+      <w:vertAlign w:val="superscript"/>
+    </w:rPr>
+  </w:style>
+  <w:style w:type="character" w:styleId="FootnoteReference">
+    <w:name w:val="footnote reference"/>
+    <w:rPr>
+      <w:vertAlign w:val="superscript"/>
     </w:rPr>
   </w:style>
   <w:style w:type="character" w:styleId="EndnoteCharacters">
@@ -6900,7 +6921,7 @@
     </w:rPr>
   </w:style>
   <w:style w:type="paragraph" w:styleId="EnvelopeReturn">
-    <w:name w:val="Envelope Return"/>
+    <w:name w:val="envelope return"/>
     <w:basedOn w:val="Normal"/>
     <w:pPr/>
     <w:rPr>
@@ -6919,46 +6940,6 @@
       <w:color w:val="ECEFF4"/>
     </w:rPr>
   </w:style>
-  <w:style w:type="paragraph" w:styleId="Footer">
-    <w:name w:val="Footer"/>
-    <w:basedOn w:val="Normal"/>
-    <w:pPr>
-      <w:suppressLineNumbers/>
-      <w:tabs>
-        <w:tab w:val="clear" w:pos="1134"/>
-        <w:tab w:val="center" w:pos="5952" w:leader="none"/>
-        <w:tab w:val="right" w:pos="10771" w:leader="none"/>
-      </w:tabs>
-    </w:pPr>
-    <w:rPr/>
-  </w:style>
-  <w:style w:type="paragraph" w:styleId="Header">
-    <w:name w:val="Header"/>
-    <w:basedOn w:val="Normal"/>
-    <w:pPr>
-      <w:suppressLineNumbers/>
-      <w:tabs>
-        <w:tab w:val="clear" w:pos="1134"/>
-        <w:tab w:val="center" w:pos="5952" w:leader="none"/>
-        <w:tab w:val="right" w:pos="10771" w:leader="none"/>
-      </w:tabs>
-    </w:pPr>
-    <w:rPr/>
-  </w:style>
-  <w:style w:type="paragraph" w:styleId="HeaderandFooter">
-    <w:name w:val="Header and Footer"/>
-    <w:basedOn w:val="Normal"/>
-    <w:qFormat/>
-    <w:pPr>
-      <w:suppressLineNumbers/>
-      <w:tabs>
-        <w:tab w:val="clear" w:pos="1134"/>
-        <w:tab w:val="center" w:pos="5953" w:leader="none"/>
-        <w:tab w:val="right" w:pos="10772" w:leader="none"/>
-      </w:tabs>
-    </w:pPr>
-    <w:rPr/>
-  </w:style>
   <w:style w:type="paragraph" w:styleId="Index">
     <w:name w:val="Index"/>
     <w:basedOn w:val="Normal"/>
@@ -6967,11 +6948,11 @@
       <w:suppressLineNumbers/>
     </w:pPr>
     <w:rPr>
-      <w:rFonts w:cs="FreeSans"/>
+      <w:rFonts w:cs="Noto Sans Devanagari"/>
     </w:rPr>
   </w:style>
   <w:style w:type="paragraph" w:styleId="Caption">
-    <w:name w:val="Caption"/>
+    <w:name w:val="caption"/>
     <w:basedOn w:val="Normal"/>
     <w:qFormat/>
     <w:pPr>
@@ -6979,7 +6960,7 @@
       <w:spacing w:before="120" w:after="120"/>
     </w:pPr>
     <w:rPr>
-      <w:rFonts w:cs="FreeSans"/>
+      <w:rFonts w:cs="Noto Sans Devanagari"/>
       <w:i/>
       <w:iCs/>
       <w:sz w:val="24"/>
@@ -6991,7 +6972,7 @@
     <w:basedOn w:val="BodyText"/>
     <w:pPr/>
     <w:rPr>
-      <w:rFonts w:cs="FreeSans"/>
+      <w:rFonts w:cs="Noto Sans Devanagari"/>
     </w:rPr>
   </w:style>
   <w:style w:type="paragraph" w:styleId="BodyText">
@@ -7033,7 +7014,7 @@
       <w:ind w:left="160" w:right="160"/>
     </w:pPr>
     <w:rPr>
-      <w:rFonts w:ascii="Liberation Mono" w:hAnsi="Liberation Mono" w:eastAsia="Liberation Mono" w:cs="Liberation Mono"/>
+      <w:rFonts w:ascii="Liberation Mono" w:hAnsi="Liberation Mono" w:eastAsia="Noto Sans Mono CJK SC" w:cs="Liberation Mono"/>
       <w:sz w:val="20"/>
       <w:szCs w:val="20"/>
     </w:rPr>
@@ -7074,37 +7055,37 @@
         <a:srgbClr val="000000"/>
       </a:dk1>
       <a:lt1>
-        <a:srgbClr val="ffffff"/>
+        <a:srgbClr val="FFFFFF"/>
       </a:lt1>
       <a:dk2>
         <a:srgbClr val="000000"/>
       </a:dk2>
       <a:lt2>
-        <a:srgbClr val="ffffff"/>
+        <a:srgbClr val="FFFFFF"/>
       </a:lt2>
       <a:accent1>
-        <a:srgbClr val="18a303"/>
+        <a:srgbClr val="18A303"/>
       </a:accent1>
       <a:accent2>
-        <a:srgbClr val="0369a3"/>
+        <a:srgbClr val="0369A3"/>
       </a:accent2>
       <a:accent3>
-        <a:srgbClr val="a33e03"/>
+        <a:srgbClr val="A33E03"/>
       </a:accent3>
       <a:accent4>
-        <a:srgbClr val="8e03a3"/>
+        <a:srgbClr val="8E03A3"/>
       </a:accent4>
       <a:accent5>
-        <a:srgbClr val="c99c00"/>
+        <a:srgbClr val="C99C00"/>
       </a:accent5>
       <a:accent6>
-        <a:srgbClr val="c9211e"/>
+        <a:srgbClr val="C9211E"/>
       </a:accent6>
       <a:hlink>
-        <a:srgbClr val="0000ee"/>
+        <a:srgbClr val="0000EE"/>
       </a:hlink>
       <a:folHlink>
-        <a:srgbClr val="551a8b"/>
+        <a:srgbClr val="551A8B"/>
       </a:folHlink>
     </a:clrScheme>
     <a:fontScheme name="Office">

</xml_diff>